<commit_message>
diagramas UML modulo ingreso de equipos
</commit_message>
<xml_diff>
--- a/PROYECTO CASOS DE USO.docx
+++ b/PROYECTO CASOS DE USO.docx
@@ -1,6 +1,6 @@
 
 <file path=word/document.xml><?xml version="1.0" encoding="utf-8"?>
-<w:document xmlns:wpc="http://schemas.microsoft.com/office/word/2010/wordprocessingCanvas" xmlns:cx="http://schemas.microsoft.com/office/drawing/2014/chartex" xmlns:cx1="http://schemas.microsoft.com/office/drawing/2015/9/8/chartex" xmlns:cx2="http://schemas.microsoft.com/office/drawing/2015/10/21/chartex" xmlns:cx3="http://schemas.microsoft.com/office/drawing/2016/5/9/chartex" xmlns:cx4="http://schemas.microsoft.com/office/drawing/2016/5/10/chartex" xmlns:cx5="http://schemas.microsoft.com/office/drawing/2016/5/11/chartex" xmlns:cx6="http://schemas.microsoft.com/office/drawing/2016/5/12/chartex" xmlns:cx7="http://schemas.microsoft.com/office/drawing/2016/5/13/chartex" xmlns:cx8="http://schemas.microsoft.com/office/drawing/2016/5/14/chartex" xmlns:mc="http://schemas.openxmlformats.org/markup-compatibility/2006" xmlns:aink="http://schemas.microsoft.com/office/drawing/2016/ink" xmlns:am3d="http://schemas.microsoft.com/office/drawing/2017/model3d" xmlns:o="urn:schemas-microsoft-com:office:office" xmlns:oel="http://schemas.microsoft.com/office/2019/extlst" xmlns:r="http://schemas.openxmlformats.org/officeDocument/2006/relationships" xmlns:m="http://schemas.openxmlformats.org/officeDocument/2006/math" xmlns:v="urn:schemas-microsoft-com:vml" xmlns:wp14="http://schemas.microsoft.com/office/word/2010/wordprocessingDrawing" xmlns:wp="http://schemas.openxmlformats.org/drawingml/2006/wordprocessingDrawing" xmlns:w10="urn:schemas-microsoft-com:office:word" xmlns:w="http://schemas.openxmlformats.org/wordprocessingml/2006/main" xmlns:w14="http://schemas.microsoft.com/office/word/2010/wordml" xmlns:w15="http://schemas.microsoft.com/office/word/2012/wordml" xmlns:w16cex="http://schemas.microsoft.com/office/word/2018/wordml/cex" xmlns:w16cid="http://schemas.microsoft.com/office/word/2016/wordml/cid" xmlns:w16="http://schemas.microsoft.com/office/word/2018/wordml" xmlns:w16du="http://schemas.microsoft.com/office/word/2023/wordml/word16du" xmlns:w16sdtdh="http://schemas.microsoft.com/office/word/2020/wordml/sdtdatahash" xmlns:w16sdtfl="http://schemas.microsoft.com/office/word/2024/wordml/sdtformatlock" xmlns:w16se="http://schemas.microsoft.com/office/word/2015/wordml/symex" xmlns:wpg="http://schemas.microsoft.com/office/word/2010/wordprocessingGroup" xmlns:wpi="http://schemas.microsoft.com/office/word/2010/wordprocessingInk" xmlns:wne="http://schemas.microsoft.com/office/word/2006/wordml" xmlns:wps="http://schemas.microsoft.com/office/word/2010/wordprocessingShape" mc:Ignorable="w14 w15 w16se w16cid w16 w16cex w16sdtdh w16sdtfl w16du wp14">
+<w:document xmlns:wpc="http://schemas.microsoft.com/office/word/2010/wordprocessingCanvas" xmlns:cx="http://schemas.microsoft.com/office/drawing/2014/chartex" xmlns:cx1="http://schemas.microsoft.com/office/drawing/2015/9/8/chartex" xmlns:cx2="http://schemas.microsoft.com/office/drawing/2015/10/21/chartex" xmlns:cx3="http://schemas.microsoft.com/office/drawing/2016/5/9/chartex" xmlns:cx4="http://schemas.microsoft.com/office/drawing/2016/5/10/chartex" xmlns:cx5="http://schemas.microsoft.com/office/drawing/2016/5/11/chartex" xmlns:cx6="http://schemas.microsoft.com/office/drawing/2016/5/12/chartex" xmlns:cx7="http://schemas.microsoft.com/office/drawing/2016/5/13/chartex" xmlns:cx8="http://schemas.microsoft.com/office/drawing/2016/5/14/chartex" xmlns:mc="http://schemas.openxmlformats.org/markup-compatibility/2006" xmlns:aink="http://schemas.microsoft.com/office/drawing/2016/ink" xmlns:am3d="http://schemas.microsoft.com/office/drawing/2017/model3d" xmlns:o="urn:schemas-microsoft-com:office:office" xmlns:oel="http://schemas.microsoft.com/office/2019/extlst" xmlns:r="http://schemas.openxmlformats.org/officeDocument/2006/relationships" xmlns:m="http://schemas.openxmlformats.org/officeDocument/2006/math" xmlns:v="urn:schemas-microsoft-com:vml" xmlns:wp14="http://schemas.microsoft.com/office/word/2010/wordprocessingDrawing" xmlns:wp="http://schemas.openxmlformats.org/drawingml/2006/wordprocessingDrawing" xmlns:w10="urn:schemas-microsoft-com:office:word" xmlns:w="http://schemas.openxmlformats.org/wordprocessingml/2006/main" xmlns:w14="http://schemas.microsoft.com/office/word/2010/wordml" xmlns:w15="http://schemas.microsoft.com/office/word/2012/wordml" xmlns:w16cei="http://schemas.microsoft.com/office/word/2026/wordml/cei" xmlns:w16cex="http://schemas.microsoft.com/office/word/2018/wordml/cex" xmlns:w16cid="http://schemas.microsoft.com/office/word/2016/wordml/cid" xmlns:w16="http://schemas.microsoft.com/office/word/2018/wordml" xmlns:w16du="http://schemas.microsoft.com/office/word/2023/wordml/word16du" xmlns:w16sdtdh="http://schemas.microsoft.com/office/word/2020/wordml/sdtdatahash" xmlns:w16sdtfl="http://schemas.microsoft.com/office/word/2024/wordml/sdtformatlock" xmlns:w16se="http://schemas.microsoft.com/office/word/2015/wordml/symex" xmlns:wpg="http://schemas.microsoft.com/office/word/2010/wordprocessingGroup" xmlns:wpi="http://schemas.microsoft.com/office/word/2010/wordprocessingInk" xmlns:wne="http://schemas.microsoft.com/office/word/2006/wordml" xmlns:wps="http://schemas.microsoft.com/office/word/2010/wordprocessingShape" mc:Ignorable="w14 w15 w16se w16cid w16 w16cex w16sdtdh w16sdtfl w16du wp14">
   <w:body>
     <w:p>
       <w:pPr>
@@ -1754,7 +1754,21 @@
         <w:rPr>
           <w:rFonts w:ascii="Arial" w:hAnsi="Arial" w:cs="Arial"/>
         </w:rPr>
-        <w:t xml:space="preserve"> Delete)</w:t>
+        <w:t xml:space="preserve"> </w:t>
+      </w:r>
+      <w:proofErr w:type="spellStart"/>
+      <w:r>
+        <w:rPr>
+          <w:rFonts w:ascii="Arial" w:hAnsi="Arial" w:cs="Arial"/>
+        </w:rPr>
+        <w:t>Delete</w:t>
+      </w:r>
+      <w:proofErr w:type="spellEnd"/>
+      <w:r>
+        <w:rPr>
+          <w:rFonts w:ascii="Arial" w:hAnsi="Arial" w:cs="Arial"/>
+        </w:rPr>
+        <w:t>)</w:t>
       </w:r>
     </w:p>
     <w:p>
@@ -2509,7 +2523,7 @@
         <w:rPr>
           <w:rFonts w:ascii="Arial" w:hAnsi="Arial" w:cs="Arial"/>
         </w:rPr>
-        <w:t>El sistema crea el registro de ingreso y asigna un identificador único.ida.liu+1</w:t>
+        <w:t>El sistema crea el registro de ingreso y asigna un identificador único.</w:t>
       </w:r>
     </w:p>
     <w:p>
@@ -2618,6 +2632,55 @@
     </w:p>
     <w:p>
       <w:pPr>
+        <w:jc w:val="center"/>
+        <w:rPr>
+          <w:rFonts w:ascii="Arial" w:hAnsi="Arial" w:cs="Arial"/>
+        </w:rPr>
+      </w:pPr>
+      <w:r>
+        <w:rPr>
+          <w:rFonts w:ascii="Arial" w:hAnsi="Arial" w:cs="Arial"/>
+        </w:rPr>
+        <w:lastRenderedPageBreak/>
+        <w:drawing>
+          <wp:inline distT="0" distB="0" distL="0" distR="0" wp14:anchorId="367A4238" wp14:editId="29DB9FD1">
+            <wp:extent cx="4343400" cy="2504409"/>
+            <wp:effectExtent l="0" t="0" r="0" b="0"/>
+            <wp:docPr id="1390202558" name="Imagen 1"/>
+            <wp:cNvGraphicFramePr>
+              <a:graphicFrameLocks xmlns:a="http://schemas.openxmlformats.org/drawingml/2006/main" noChangeAspect="1"/>
+            </wp:cNvGraphicFramePr>
+            <a:graphic xmlns:a="http://schemas.openxmlformats.org/drawingml/2006/main">
+              <a:graphicData uri="http://schemas.openxmlformats.org/drawingml/2006/picture">
+                <pic:pic xmlns:pic="http://schemas.openxmlformats.org/drawingml/2006/picture">
+                  <pic:nvPicPr>
+                    <pic:cNvPr id="1390202558" name=""/>
+                    <pic:cNvPicPr/>
+                  </pic:nvPicPr>
+                  <pic:blipFill>
+                    <a:blip r:embed="rId5"/>
+                    <a:stretch>
+                      <a:fillRect/>
+                    </a:stretch>
+                  </pic:blipFill>
+                  <pic:spPr>
+                    <a:xfrm>
+                      <a:off x="0" y="0"/>
+                      <a:ext cx="4352872" cy="2509870"/>
+                    </a:xfrm>
+                    <a:prstGeom prst="rect">
+                      <a:avLst/>
+                    </a:prstGeom>
+                  </pic:spPr>
+                </pic:pic>
+              </a:graphicData>
+            </a:graphic>
+          </wp:inline>
+        </w:drawing>
+      </w:r>
+    </w:p>
+    <w:p>
+      <w:pPr>
         <w:rPr>
           <w:rFonts w:ascii="Arial" w:hAnsi="Arial" w:cs="Arial"/>
         </w:rPr>
@@ -2905,6 +2968,7 @@
         <w:rPr>
           <w:rFonts w:ascii="Arial" w:hAnsi="Arial" w:cs="Arial"/>
         </w:rPr>
+        <w:lastRenderedPageBreak/>
         <w:t>Si el usuario no tiene permisos, el sistema bloquea la acción.</w:t>
       </w:r>
     </w:p>
@@ -2959,37 +3023,51 @@
     </w:p>
     <w:p>
       <w:pPr>
-        <w:rPr>
-          <w:rFonts w:ascii="Arial" w:hAnsi="Arial" w:cs="Arial"/>
-        </w:rPr>
-      </w:pPr>
-      <w:r>
-        <w:rPr>
-          <w:rFonts w:ascii="Arial" w:hAnsi="Arial" w:cs="Arial"/>
-        </w:rPr>
-        <w:t xml:space="preserve"> </w:t>
-      </w:r>
-    </w:p>
-    <w:p>
-      <w:pPr>
-        <w:rPr>
-          <w:rFonts w:ascii="Arial" w:hAnsi="Arial" w:cs="Arial"/>
-        </w:rPr>
-      </w:pPr>
-    </w:p>
-    <w:p>
-      <w:pPr>
-        <w:rPr>
-          <w:rFonts w:ascii="Arial" w:hAnsi="Arial" w:cs="Arial"/>
-        </w:rPr>
-      </w:pPr>
-    </w:p>
-    <w:p>
-      <w:pPr>
-        <w:rPr>
-          <w:rFonts w:ascii="Arial" w:hAnsi="Arial" w:cs="Arial"/>
-        </w:rPr>
-      </w:pPr>
+        <w:jc w:val="center"/>
+        <w:rPr>
+          <w:rFonts w:ascii="Arial" w:hAnsi="Arial" w:cs="Arial"/>
+        </w:rPr>
+      </w:pPr>
+      <w:r>
+        <w:rPr>
+          <w:rFonts w:ascii="Arial" w:hAnsi="Arial" w:cs="Arial"/>
+        </w:rPr>
+        <w:drawing>
+          <wp:inline distT="0" distB="0" distL="0" distR="0" wp14:anchorId="6D83277E" wp14:editId="5A7097E5">
+            <wp:extent cx="5036820" cy="2689951"/>
+            <wp:effectExtent l="0" t="0" r="0" b="0"/>
+            <wp:docPr id="168355450" name="Imagen 1"/>
+            <wp:cNvGraphicFramePr>
+              <a:graphicFrameLocks xmlns:a="http://schemas.openxmlformats.org/drawingml/2006/main" noChangeAspect="1"/>
+            </wp:cNvGraphicFramePr>
+            <a:graphic xmlns:a="http://schemas.openxmlformats.org/drawingml/2006/main">
+              <a:graphicData uri="http://schemas.openxmlformats.org/drawingml/2006/picture">
+                <pic:pic xmlns:pic="http://schemas.openxmlformats.org/drawingml/2006/picture">
+                  <pic:nvPicPr>
+                    <pic:cNvPr id="168355450" name=""/>
+                    <pic:cNvPicPr/>
+                  </pic:nvPicPr>
+                  <pic:blipFill>
+                    <a:blip r:embed="rId6"/>
+                    <a:stretch>
+                      <a:fillRect/>
+                    </a:stretch>
+                  </pic:blipFill>
+                  <pic:spPr>
+                    <a:xfrm>
+                      <a:off x="0" y="0"/>
+                      <a:ext cx="5043177" cy="2693346"/>
+                    </a:xfrm>
+                    <a:prstGeom prst="rect">
+                      <a:avLst/>
+                    </a:prstGeom>
+                  </pic:spPr>
+                </pic:pic>
+              </a:graphicData>
+            </a:graphic>
+          </wp:inline>
+        </w:drawing>
+      </w:r>
     </w:p>
     <w:p>
       <w:pPr>
@@ -3017,7 +3095,6 @@
           <w:b/>
           <w:bCs/>
         </w:rPr>
-        <w:lastRenderedPageBreak/>
         <w:t>Validar documentación del equipo</w:t>
       </w:r>
     </w:p>
@@ -3191,6 +3268,7 @@
         <w:rPr>
           <w:rFonts w:ascii="Arial" w:hAnsi="Arial" w:cs="Arial"/>
         </w:rPr>
+        <w:lastRenderedPageBreak/>
         <w:t xml:space="preserve">El inspector valida coincidencia de datos clave, como marca, modelo, </w:t>
       </w:r>
       <w:proofErr w:type="spellStart"/>
@@ -3253,7 +3331,13 @@
         <w:rPr>
           <w:rFonts w:ascii="Arial" w:hAnsi="Arial" w:cs="Arial"/>
         </w:rPr>
-        <w:t>El sistema guarda el resultado de la validación documental.safetyculture+2</w:t>
+        <w:t>El sistema guarda el resultado de la validación documental</w:t>
+      </w:r>
+      <w:r>
+        <w:rPr>
+          <w:rFonts w:ascii="Arial" w:hAnsi="Arial" w:cs="Arial"/>
+        </w:rPr>
+        <w:t>.</w:t>
       </w:r>
     </w:p>
     <w:p>
@@ -3356,10 +3440,51 @@
     </w:p>
     <w:p>
       <w:pPr>
-        <w:rPr>
-          <w:rFonts w:ascii="Arial" w:hAnsi="Arial" w:cs="Arial"/>
-        </w:rPr>
-      </w:pPr>
+        <w:jc w:val="center"/>
+        <w:rPr>
+          <w:rFonts w:ascii="Arial" w:hAnsi="Arial" w:cs="Arial"/>
+        </w:rPr>
+      </w:pPr>
+      <w:r>
+        <w:rPr>
+          <w:rFonts w:ascii="Arial" w:hAnsi="Arial" w:cs="Arial"/>
+        </w:rPr>
+        <w:drawing>
+          <wp:inline distT="0" distB="0" distL="0" distR="0" wp14:anchorId="71817841" wp14:editId="00F37DAB">
+            <wp:extent cx="4759037" cy="2584139"/>
+            <wp:effectExtent l="0" t="0" r="3810" b="6985"/>
+            <wp:docPr id="1294408287" name="Imagen 1"/>
+            <wp:cNvGraphicFramePr>
+              <a:graphicFrameLocks xmlns:a="http://schemas.openxmlformats.org/drawingml/2006/main" noChangeAspect="1"/>
+            </wp:cNvGraphicFramePr>
+            <a:graphic xmlns:a="http://schemas.openxmlformats.org/drawingml/2006/main">
+              <a:graphicData uri="http://schemas.openxmlformats.org/drawingml/2006/picture">
+                <pic:pic xmlns:pic="http://schemas.openxmlformats.org/drawingml/2006/picture">
+                  <pic:nvPicPr>
+                    <pic:cNvPr id="1294408287" name=""/>
+                    <pic:cNvPicPr/>
+                  </pic:nvPicPr>
+                  <pic:blipFill>
+                    <a:blip r:embed="rId7"/>
+                    <a:stretch>
+                      <a:fillRect/>
+                    </a:stretch>
+                  </pic:blipFill>
+                  <pic:spPr>
+                    <a:xfrm>
+                      <a:off x="0" y="0"/>
+                      <a:ext cx="4781066" cy="2596100"/>
+                    </a:xfrm>
+                    <a:prstGeom prst="rect">
+                      <a:avLst/>
+                    </a:prstGeom>
+                  </pic:spPr>
+                </pic:pic>
+              </a:graphicData>
+            </a:graphic>
+          </wp:inline>
+        </w:drawing>
+      </w:r>
     </w:p>
     <w:p>
       <w:pPr>
@@ -3409,7 +3534,6 @@
           <w:b/>
           <w:bCs/>
         </w:rPr>
-        <w:lastRenderedPageBreak/>
         <w:t>Objetivo:</w:t>
       </w:r>
       <w:r>
@@ -3485,6 +3609,7 @@
         <w:rPr>
           <w:rFonts w:ascii="Arial" w:hAnsi="Arial" w:cs="Arial"/>
         </w:rPr>
+        <w:lastRenderedPageBreak/>
         <w:t>El equipo está disponible físicamente para revisión.</w:t>
       </w:r>
     </w:p>
@@ -3616,7 +3741,7 @@
         <w:rPr>
           <w:rFonts w:ascii="Arial" w:hAnsi="Arial" w:cs="Arial"/>
         </w:rPr>
-        <w:t>El inspector guarda la inspección física.hse+2</w:t>
+        <w:t>El inspector guarda la inspección física.</w:t>
       </w:r>
     </w:p>
     <w:p>
@@ -3723,6 +3848,53 @@
           <w:rFonts w:ascii="Arial" w:hAnsi="Arial" w:cs="Arial"/>
         </w:rPr>
       </w:pPr>
+      <w:r>
+        <w:rPr>
+          <w:rFonts w:ascii="Arial" w:hAnsi="Arial" w:cs="Arial"/>
+        </w:rPr>
+        <w:drawing>
+          <wp:inline distT="0" distB="0" distL="0" distR="0" wp14:anchorId="21AC8301" wp14:editId="132988C3">
+            <wp:extent cx="5330882" cy="2930237"/>
+            <wp:effectExtent l="0" t="0" r="3175" b="3810"/>
+            <wp:docPr id="895278066" name="Imagen 1"/>
+            <wp:cNvGraphicFramePr>
+              <a:graphicFrameLocks xmlns:a="http://schemas.openxmlformats.org/drawingml/2006/main" noChangeAspect="1"/>
+            </wp:cNvGraphicFramePr>
+            <a:graphic xmlns:a="http://schemas.openxmlformats.org/drawingml/2006/main">
+              <a:graphicData uri="http://schemas.openxmlformats.org/drawingml/2006/picture">
+                <pic:pic xmlns:pic="http://schemas.openxmlformats.org/drawingml/2006/picture">
+                  <pic:nvPicPr>
+                    <pic:cNvPr id="895278066" name=""/>
+                    <pic:cNvPicPr/>
+                  </pic:nvPicPr>
+                  <pic:blipFill>
+                    <a:blip r:embed="rId8"/>
+                    <a:stretch>
+                      <a:fillRect/>
+                    </a:stretch>
+                  </pic:blipFill>
+                  <pic:spPr>
+                    <a:xfrm>
+                      <a:off x="0" y="0"/>
+                      <a:ext cx="5381642" cy="2958138"/>
+                    </a:xfrm>
+                    <a:prstGeom prst="rect">
+                      <a:avLst/>
+                    </a:prstGeom>
+                  </pic:spPr>
+                </pic:pic>
+              </a:graphicData>
+            </a:graphic>
+          </wp:inline>
+        </w:drawing>
+      </w:r>
+    </w:p>
+    <w:p>
+      <w:pPr>
+        <w:rPr>
+          <w:rFonts w:ascii="Arial" w:hAnsi="Arial" w:cs="Arial"/>
+        </w:rPr>
+      </w:pPr>
     </w:p>
     <w:p>
       <w:pPr>
@@ -3840,7 +4012,6 @@
         <w:rPr>
           <w:rFonts w:ascii="Arial" w:hAnsi="Arial" w:cs="Arial"/>
         </w:rPr>
-        <w:lastRenderedPageBreak/>
         <w:t>El sistema tiene una plantilla de validación para el tipo de equipo.</w:t>
       </w:r>
     </w:p>
@@ -3989,7 +4160,7 @@
         <w:rPr>
           <w:rFonts w:ascii="Arial" w:hAnsi="Arial" w:cs="Arial"/>
         </w:rPr>
-        <w:t>El sistema actualiza el expediente con la información técnica verificada.inspectly360+1</w:t>
+        <w:t>El sistema actualiza el expediente con la información técnica verificada.</w:t>
       </w:r>
     </w:p>
     <w:p>
@@ -4092,6 +4263,55 @@
     </w:p>
     <w:p>
       <w:pPr>
+        <w:jc w:val="center"/>
+        <w:rPr>
+          <w:rFonts w:ascii="Arial" w:hAnsi="Arial" w:cs="Arial"/>
+        </w:rPr>
+      </w:pPr>
+      <w:r>
+        <w:rPr>
+          <w:rFonts w:ascii="Arial" w:hAnsi="Arial" w:cs="Arial"/>
+        </w:rPr>
+        <w:lastRenderedPageBreak/>
+        <w:drawing>
+          <wp:inline distT="0" distB="0" distL="0" distR="0" wp14:anchorId="40F254D1" wp14:editId="39D21889">
+            <wp:extent cx="4321418" cy="3145471"/>
+            <wp:effectExtent l="0" t="0" r="3175" b="0"/>
+            <wp:docPr id="1291609367" name="Imagen 1"/>
+            <wp:cNvGraphicFramePr>
+              <a:graphicFrameLocks xmlns:a="http://schemas.openxmlformats.org/drawingml/2006/main" noChangeAspect="1"/>
+            </wp:cNvGraphicFramePr>
+            <a:graphic xmlns:a="http://schemas.openxmlformats.org/drawingml/2006/main">
+              <a:graphicData uri="http://schemas.openxmlformats.org/drawingml/2006/picture">
+                <pic:pic xmlns:pic="http://schemas.openxmlformats.org/drawingml/2006/picture">
+                  <pic:nvPicPr>
+                    <pic:cNvPr id="1291609367" name=""/>
+                    <pic:cNvPicPr/>
+                  </pic:nvPicPr>
+                  <pic:blipFill>
+                    <a:blip r:embed="rId9"/>
+                    <a:stretch>
+                      <a:fillRect/>
+                    </a:stretch>
+                  </pic:blipFill>
+                  <pic:spPr>
+                    <a:xfrm>
+                      <a:off x="0" y="0"/>
+                      <a:ext cx="4333703" cy="3154413"/>
+                    </a:xfrm>
+                    <a:prstGeom prst="rect">
+                      <a:avLst/>
+                    </a:prstGeom>
+                  </pic:spPr>
+                </pic:pic>
+              </a:graphicData>
+            </a:graphic>
+          </wp:inline>
+        </w:drawing>
+      </w:r>
+    </w:p>
+    <w:p>
+      <w:pPr>
         <w:rPr>
           <w:rFonts w:ascii="Arial" w:hAnsi="Arial" w:cs="Arial"/>
         </w:rPr>
@@ -4238,7 +4458,6 @@
         <w:rPr>
           <w:rFonts w:ascii="Arial" w:hAnsi="Arial" w:cs="Arial"/>
         </w:rPr>
-        <w:lastRenderedPageBreak/>
         <w:t>El inspector selecciona la opción “Comparar”.</w:t>
       </w:r>
     </w:p>
@@ -4324,7 +4543,7 @@
         <w:rPr>
           <w:rFonts w:ascii="Arial" w:hAnsi="Arial" w:cs="Arial"/>
         </w:rPr>
-        <w:t>El sistema muestra un resumen de conformidad por atributo.operations1+2</w:t>
+        <w:t>El sistema muestra un resumen de conformidad por atributo.</w:t>
       </w:r>
     </w:p>
     <w:p>
@@ -4356,6 +4575,7 @@
         <w:rPr>
           <w:rFonts w:ascii="Arial" w:hAnsi="Arial" w:cs="Arial"/>
         </w:rPr>
+        <w:lastRenderedPageBreak/>
         <w:t>Si no existe referencia esperada, el sistema permite comparar solo contra la documentación.</w:t>
       </w:r>
     </w:p>
@@ -4427,6 +4647,54 @@
     </w:p>
     <w:p>
       <w:pPr>
+        <w:jc w:val="center"/>
+        <w:rPr>
+          <w:rFonts w:ascii="Arial" w:hAnsi="Arial" w:cs="Arial"/>
+        </w:rPr>
+      </w:pPr>
+      <w:r>
+        <w:rPr>
+          <w:rFonts w:ascii="Arial" w:hAnsi="Arial" w:cs="Arial"/>
+        </w:rPr>
+        <w:drawing>
+          <wp:inline distT="0" distB="0" distL="0" distR="0" wp14:anchorId="2737FC40" wp14:editId="1BC2D6EF">
+            <wp:extent cx="4939679" cy="3567546"/>
+            <wp:effectExtent l="0" t="0" r="0" b="0"/>
+            <wp:docPr id="245140652" name="Imagen 1"/>
+            <wp:cNvGraphicFramePr>
+              <a:graphicFrameLocks xmlns:a="http://schemas.openxmlformats.org/drawingml/2006/main" noChangeAspect="1"/>
+            </wp:cNvGraphicFramePr>
+            <a:graphic xmlns:a="http://schemas.openxmlformats.org/drawingml/2006/main">
+              <a:graphicData uri="http://schemas.openxmlformats.org/drawingml/2006/picture">
+                <pic:pic xmlns:pic="http://schemas.openxmlformats.org/drawingml/2006/picture">
+                  <pic:nvPicPr>
+                    <pic:cNvPr id="245140652" name=""/>
+                    <pic:cNvPicPr/>
+                  </pic:nvPicPr>
+                  <pic:blipFill>
+                    <a:blip r:embed="rId10"/>
+                    <a:stretch>
+                      <a:fillRect/>
+                    </a:stretch>
+                  </pic:blipFill>
+                  <pic:spPr>
+                    <a:xfrm>
+                      <a:off x="0" y="0"/>
+                      <a:ext cx="4945474" cy="3571731"/>
+                    </a:xfrm>
+                    <a:prstGeom prst="rect">
+                      <a:avLst/>
+                    </a:prstGeom>
+                  </pic:spPr>
+                </pic:pic>
+              </a:graphicData>
+            </a:graphic>
+          </wp:inline>
+        </w:drawing>
+      </w:r>
+    </w:p>
+    <w:p>
+      <w:pPr>
         <w:rPr>
           <w:rFonts w:ascii="Arial" w:hAnsi="Arial" w:cs="Arial"/>
         </w:rPr>
@@ -4573,6 +4841,7 @@
         <w:rPr>
           <w:rFonts w:ascii="Arial" w:hAnsi="Arial" w:cs="Arial"/>
         </w:rPr>
+        <w:lastRenderedPageBreak/>
         <w:t>El inspector accede a la sección de hallazgos.</w:t>
       </w:r>
     </w:p>
@@ -4655,7 +4924,6 @@
         <w:rPr>
           <w:rFonts w:ascii="Arial" w:hAnsi="Arial" w:cs="Arial"/>
         </w:rPr>
-        <w:lastRenderedPageBreak/>
         <w:t>El sistema vincula el hallazgo con el paso de inspección correspondiente.</w:t>
       </w:r>
     </w:p>
@@ -4673,7 +4941,7 @@
         <w:rPr>
           <w:rFonts w:ascii="Arial" w:hAnsi="Arial" w:cs="Arial"/>
         </w:rPr>
-        <w:t>El inspector guarda el hallazgo.jodoo+2</w:t>
+        <w:t>El inspector guarda el hallazgo.</w:t>
       </w:r>
     </w:p>
     <w:p>
@@ -4776,10 +5044,51 @@
     </w:p>
     <w:p>
       <w:pPr>
-        <w:rPr>
-          <w:rFonts w:ascii="Arial" w:hAnsi="Arial" w:cs="Arial"/>
-        </w:rPr>
-      </w:pPr>
+        <w:jc w:val="center"/>
+        <w:rPr>
+          <w:rFonts w:ascii="Arial" w:hAnsi="Arial" w:cs="Arial"/>
+        </w:rPr>
+      </w:pPr>
+      <w:r>
+        <w:rPr>
+          <w:rFonts w:ascii="Arial" w:hAnsi="Arial" w:cs="Arial"/>
+        </w:rPr>
+        <w:drawing>
+          <wp:inline distT="0" distB="0" distL="0" distR="0" wp14:anchorId="1D70C76A" wp14:editId="07DD6967">
+            <wp:extent cx="4336472" cy="3886535"/>
+            <wp:effectExtent l="0" t="0" r="6985" b="0"/>
+            <wp:docPr id="885026296" name="Imagen 1"/>
+            <wp:cNvGraphicFramePr>
+              <a:graphicFrameLocks xmlns:a="http://schemas.openxmlformats.org/drawingml/2006/main" noChangeAspect="1"/>
+            </wp:cNvGraphicFramePr>
+            <a:graphic xmlns:a="http://schemas.openxmlformats.org/drawingml/2006/main">
+              <a:graphicData uri="http://schemas.openxmlformats.org/drawingml/2006/picture">
+                <pic:pic xmlns:pic="http://schemas.openxmlformats.org/drawingml/2006/picture">
+                  <pic:nvPicPr>
+                    <pic:cNvPr id="885026296" name=""/>
+                    <pic:cNvPicPr/>
+                  </pic:nvPicPr>
+                  <pic:blipFill>
+                    <a:blip r:embed="rId11"/>
+                    <a:stretch>
+                      <a:fillRect/>
+                    </a:stretch>
+                  </pic:blipFill>
+                  <pic:spPr>
+                    <a:xfrm>
+                      <a:off x="0" y="0"/>
+                      <a:ext cx="4343899" cy="3893192"/>
+                    </a:xfrm>
+                    <a:prstGeom prst="rect">
+                      <a:avLst/>
+                    </a:prstGeom>
+                  </pic:spPr>
+                </pic:pic>
+              </a:graphicData>
+            </a:graphic>
+          </wp:inline>
+        </w:drawing>
+      </w:r>
     </w:p>
     <w:p>
       <w:pPr>
@@ -4800,6 +5109,7 @@
           <w:b/>
           <w:bCs/>
         </w:rPr>
+        <w:lastRenderedPageBreak/>
         <w:t>Adjuntar evidencia</w:t>
       </w:r>
     </w:p>
@@ -5007,7 +5317,7 @@
         <w:rPr>
           <w:rFonts w:ascii="Arial" w:hAnsi="Arial" w:cs="Arial"/>
         </w:rPr>
-        <w:t>El sistema almacena la evidencia y la vincula al expediente.linkedin+2</w:t>
+        <w:t>El sistema almacena la evidencia y la vincula al expediente.</w:t>
       </w:r>
     </w:p>
     <w:p>
@@ -5071,7 +5381,6 @@
           <w:b/>
           <w:bCs/>
         </w:rPr>
-        <w:lastRenderedPageBreak/>
         <w:t>Postcondiciones:</w:t>
       </w:r>
     </w:p>
@@ -5111,6 +5420,55 @@
     </w:p>
     <w:p>
       <w:pPr>
+        <w:jc w:val="center"/>
+        <w:rPr>
+          <w:rFonts w:ascii="Arial" w:hAnsi="Arial" w:cs="Arial"/>
+        </w:rPr>
+      </w:pPr>
+      <w:r>
+        <w:rPr>
+          <w:rFonts w:ascii="Arial" w:hAnsi="Arial" w:cs="Arial"/>
+        </w:rPr>
+        <w:lastRenderedPageBreak/>
+        <w:drawing>
+          <wp:inline distT="0" distB="0" distL="0" distR="0" wp14:anchorId="4B19048F" wp14:editId="26AA91D4">
+            <wp:extent cx="4551218" cy="4155214"/>
+            <wp:effectExtent l="0" t="0" r="1905" b="0"/>
+            <wp:docPr id="1499751579" name="Imagen 1"/>
+            <wp:cNvGraphicFramePr>
+              <a:graphicFrameLocks xmlns:a="http://schemas.openxmlformats.org/drawingml/2006/main" noChangeAspect="1"/>
+            </wp:cNvGraphicFramePr>
+            <a:graphic xmlns:a="http://schemas.openxmlformats.org/drawingml/2006/main">
+              <a:graphicData uri="http://schemas.openxmlformats.org/drawingml/2006/picture">
+                <pic:pic xmlns:pic="http://schemas.openxmlformats.org/drawingml/2006/picture">
+                  <pic:nvPicPr>
+                    <pic:cNvPr id="1499751579" name=""/>
+                    <pic:cNvPicPr/>
+                  </pic:nvPicPr>
+                  <pic:blipFill>
+                    <a:blip r:embed="rId12"/>
+                    <a:stretch>
+                      <a:fillRect/>
+                    </a:stretch>
+                  </pic:blipFill>
+                  <pic:spPr>
+                    <a:xfrm>
+                      <a:off x="0" y="0"/>
+                      <a:ext cx="4556646" cy="4160169"/>
+                    </a:xfrm>
+                    <a:prstGeom prst="rect">
+                      <a:avLst/>
+                    </a:prstGeom>
+                  </pic:spPr>
+                </pic:pic>
+              </a:graphicData>
+            </a:graphic>
+          </wp:inline>
+        </w:drawing>
+      </w:r>
+    </w:p>
+    <w:p>
+      <w:pPr>
         <w:rPr>
           <w:rFonts w:ascii="Arial" w:hAnsi="Arial" w:cs="Arial"/>
         </w:rPr>
@@ -5308,6 +5666,7 @@
         <w:rPr>
           <w:rFonts w:ascii="Arial" w:hAnsi="Arial" w:cs="Arial"/>
         </w:rPr>
+        <w:lastRenderedPageBreak/>
         <w:t>El usuario selecciona un resultado, por ejemplo “Conforme”, “Conforme con observaciones” o “No conforme”.</w:t>
       </w:r>
     </w:p>
@@ -5342,7 +5701,7 @@
         <w:rPr>
           <w:rFonts w:ascii="Arial" w:hAnsi="Arial" w:cs="Arial"/>
         </w:rPr>
-        <w:t>El sistema guarda el resultado y cierra la evaluación técnica.learning.sap+2</w:t>
+        <w:t>El sistema guarda el resultado y cierra la evaluación técnica.</w:t>
       </w:r>
     </w:p>
     <w:p>
@@ -5445,6 +5804,54 @@
     </w:p>
     <w:p>
       <w:pPr>
+        <w:jc w:val="center"/>
+        <w:rPr>
+          <w:rFonts w:ascii="Arial" w:hAnsi="Arial" w:cs="Arial"/>
+        </w:rPr>
+      </w:pPr>
+      <w:r>
+        <w:rPr>
+          <w:rFonts w:ascii="Arial" w:hAnsi="Arial" w:cs="Arial"/>
+        </w:rPr>
+        <w:drawing>
+          <wp:inline distT="0" distB="0" distL="0" distR="0" wp14:anchorId="1D80BF7C" wp14:editId="2614CB4D">
+            <wp:extent cx="4121727" cy="3656296"/>
+            <wp:effectExtent l="0" t="0" r="0" b="1905"/>
+            <wp:docPr id="1322134017" name="Imagen 1"/>
+            <wp:cNvGraphicFramePr>
+              <a:graphicFrameLocks xmlns:a="http://schemas.openxmlformats.org/drawingml/2006/main" noChangeAspect="1"/>
+            </wp:cNvGraphicFramePr>
+            <a:graphic xmlns:a="http://schemas.openxmlformats.org/drawingml/2006/main">
+              <a:graphicData uri="http://schemas.openxmlformats.org/drawingml/2006/picture">
+                <pic:pic xmlns:pic="http://schemas.openxmlformats.org/drawingml/2006/picture">
+                  <pic:nvPicPr>
+                    <pic:cNvPr id="1322134017" name=""/>
+                    <pic:cNvPicPr/>
+                  </pic:nvPicPr>
+                  <pic:blipFill>
+                    <a:blip r:embed="rId13"/>
+                    <a:stretch>
+                      <a:fillRect/>
+                    </a:stretch>
+                  </pic:blipFill>
+                  <pic:spPr>
+                    <a:xfrm>
+                      <a:off x="0" y="0"/>
+                      <a:ext cx="4131237" cy="3664732"/>
+                    </a:xfrm>
+                    <a:prstGeom prst="rect">
+                      <a:avLst/>
+                    </a:prstGeom>
+                  </pic:spPr>
+                </pic:pic>
+              </a:graphicData>
+            </a:graphic>
+          </wp:inline>
+        </w:drawing>
+      </w:r>
+    </w:p>
+    <w:p>
+      <w:pPr>
         <w:rPr>
           <w:rFonts w:ascii="Arial" w:hAnsi="Arial" w:cs="Arial"/>
         </w:rPr>
@@ -5484,7 +5891,6 @@
           <w:b/>
           <w:bCs/>
         </w:rPr>
-        <w:lastRenderedPageBreak/>
         <w:t>Objetivo:</w:t>
       </w:r>
       <w:r>
@@ -5543,6 +5949,7 @@
         <w:rPr>
           <w:rFonts w:ascii="Arial" w:hAnsi="Arial" w:cs="Arial"/>
         </w:rPr>
+        <w:lastRenderedPageBreak/>
         <w:t>Existe un resultado de inspección emitido.</w:t>
       </w:r>
     </w:p>
@@ -5677,7 +6084,7 @@
         <w:rPr>
           <w:rFonts w:ascii="Arial" w:hAnsi="Arial" w:cs="Arial"/>
         </w:rPr>
-        <w:t>El sistema actualiza el estado final del equipo y cierra el expediente.learning.sap+1</w:t>
+        <w:t>El sistema actualiza el estado final del equipo y cierra el expediente.</w:t>
       </w:r>
     </w:p>
     <w:p>
@@ -5797,6 +6204,55 @@
     </w:p>
     <w:p>
       <w:pPr>
+        <w:jc w:val="center"/>
+        <w:rPr>
+          <w:rFonts w:ascii="Arial" w:hAnsi="Arial" w:cs="Arial"/>
+        </w:rPr>
+      </w:pPr>
+      <w:r>
+        <w:rPr>
+          <w:rFonts w:ascii="Arial" w:hAnsi="Arial" w:cs="Arial"/>
+        </w:rPr>
+        <w:lastRenderedPageBreak/>
+        <w:drawing>
+          <wp:inline distT="0" distB="0" distL="0" distR="0" wp14:anchorId="61A468C7" wp14:editId="3084473A">
+            <wp:extent cx="4530436" cy="4536075"/>
+            <wp:effectExtent l="0" t="0" r="3810" b="0"/>
+            <wp:docPr id="2063541789" name="Imagen 1"/>
+            <wp:cNvGraphicFramePr>
+              <a:graphicFrameLocks xmlns:a="http://schemas.openxmlformats.org/drawingml/2006/main" noChangeAspect="1"/>
+            </wp:cNvGraphicFramePr>
+            <a:graphic xmlns:a="http://schemas.openxmlformats.org/drawingml/2006/main">
+              <a:graphicData uri="http://schemas.openxmlformats.org/drawingml/2006/picture">
+                <pic:pic xmlns:pic="http://schemas.openxmlformats.org/drawingml/2006/picture">
+                  <pic:nvPicPr>
+                    <pic:cNvPr id="2063541789" name=""/>
+                    <pic:cNvPicPr/>
+                  </pic:nvPicPr>
+                  <pic:blipFill>
+                    <a:blip r:embed="rId14"/>
+                    <a:stretch>
+                      <a:fillRect/>
+                    </a:stretch>
+                  </pic:blipFill>
+                  <pic:spPr>
+                    <a:xfrm>
+                      <a:off x="0" y="0"/>
+                      <a:ext cx="4537244" cy="4542891"/>
+                    </a:xfrm>
+                    <a:prstGeom prst="rect">
+                      <a:avLst/>
+                    </a:prstGeom>
+                  </pic:spPr>
+                </pic:pic>
+              </a:graphicData>
+            </a:graphic>
+          </wp:inline>
+        </w:drawing>
+      </w:r>
+    </w:p>
+    <w:p>
+      <w:pPr>
         <w:rPr>
           <w:rFonts w:ascii="Arial" w:hAnsi="Arial" w:cs="Arial"/>
         </w:rPr>
@@ -5897,7 +6353,6 @@
           <w:b/>
           <w:bCs/>
         </w:rPr>
-        <w:lastRenderedPageBreak/>
         <w:t>Administrador</w:t>
       </w:r>
     </w:p>
@@ -5925,7 +6380,7 @@
           <w:rFonts w:ascii="Arial" w:hAnsi="Arial" w:cs="Arial"/>
         </w:rPr>
         <w:pict w14:anchorId="66F3A7C9">
-          <v:rect id="_x0000_i1061" style="width:0;height:1.5pt" o:hralign="center" o:hrstd="t" o:hr="t" fillcolor="#a0a0a0" stroked="f"/>
+          <v:rect id="_x0000_i1025" style="width:0;height:1.5pt" o:hralign="center" o:hrstd="t" o:hr="t" fillcolor="#a0a0a0" stroked="f"/>
         </w:pict>
       </w:r>
     </w:p>
@@ -5996,6 +6451,7 @@
                 <w:b/>
                 <w:bCs/>
               </w:rPr>
+              <w:lastRenderedPageBreak/>
               <w:t>ID</w:t>
             </w:r>
           </w:p>
@@ -6542,7 +6998,7 @@
           <w:rFonts w:ascii="Arial" w:hAnsi="Arial" w:cs="Arial"/>
         </w:rPr>
         <w:pict w14:anchorId="2C78AD73">
-          <v:rect id="_x0000_i1062" style="width:0;height:1.5pt" o:hralign="center" o:hrstd="t" o:hr="t" fillcolor="#a0a0a0" stroked="f"/>
+          <v:rect id="_x0000_i1026" style="width:0;height:1.5pt" o:hralign="center" o:hrstd="t" o:hr="t" fillcolor="#a0a0a0" stroked="f"/>
         </w:pict>
       </w:r>
     </w:p>
@@ -6753,7 +7209,6 @@
         <w:rPr>
           <w:rFonts w:ascii="Arial" w:hAnsi="Arial" w:cs="Arial"/>
         </w:rPr>
-        <w:lastRenderedPageBreak/>
         <w:t>Fecha actual.</w:t>
       </w:r>
     </w:p>
@@ -6839,6 +7294,7 @@
           <w:b/>
           <w:bCs/>
         </w:rPr>
+        <w:lastRenderedPageBreak/>
         <w:t>Postcondiciones</w:t>
       </w:r>
     </w:p>
@@ -6870,7 +7326,7 @@
           <w:rFonts w:ascii="Arial" w:hAnsi="Arial" w:cs="Arial"/>
         </w:rPr>
         <w:pict w14:anchorId="2CA2F00B">
-          <v:rect id="_x0000_i1063" style="width:0;height:1.5pt" o:hralign="center" o:hrstd="t" o:hr="t" fillcolor="#a0a0a0" stroked="f"/>
+          <v:rect id="_x0000_i1027" style="width:0;height:1.5pt" o:hralign="center" o:hrstd="t" o:hr="t" fillcolor="#a0a0a0" stroked="f"/>
         </w:pict>
       </w:r>
     </w:p>
@@ -7217,7 +7673,6 @@
         <w:rPr>
           <w:rFonts w:ascii="Arial" w:hAnsi="Arial" w:cs="Arial"/>
         </w:rPr>
-        <w:lastRenderedPageBreak/>
         <w:t>Título.</w:t>
       </w:r>
     </w:p>
@@ -7303,6 +7758,7 @@
         <w:rPr>
           <w:rFonts w:ascii="Arial" w:hAnsi="Arial" w:cs="Arial"/>
         </w:rPr>
+        <w:lastRenderedPageBreak/>
         <w:t>El sistema detecta que no existe título.</w:t>
       </w:r>
     </w:p>
@@ -7436,7 +7892,7 @@
           <w:rFonts w:ascii="Arial" w:hAnsi="Arial" w:cs="Arial"/>
         </w:rPr>
         <w:pict w14:anchorId="01DF929E">
-          <v:rect id="_x0000_i1064" style="width:0;height:1.5pt" o:hralign="center" o:hrstd="t" o:hr="t" fillcolor="#a0a0a0" stroked="f"/>
+          <v:rect id="_x0000_i1028" style="width:0;height:1.5pt" o:hralign="center" o:hrstd="t" o:hr="t" fillcolor="#a0a0a0" stroked="f"/>
         </w:pict>
       </w:r>
     </w:p>
@@ -7671,7 +8127,6 @@
         <w:rPr>
           <w:rFonts w:ascii="Arial" w:hAnsi="Arial" w:cs="Arial"/>
         </w:rPr>
-        <w:lastRenderedPageBreak/>
         <w:t>Fecha.</w:t>
       </w:r>
     </w:p>
@@ -7757,6 +8212,7 @@
         <w:rPr>
           <w:rFonts w:ascii="Arial" w:hAnsi="Arial" w:cs="Arial"/>
         </w:rPr>
+        <w:lastRenderedPageBreak/>
         <w:t>El usuario puede navegar entre diferentes fechas.</w:t>
       </w:r>
     </w:p>
@@ -7886,7 +8342,7 @@
           <w:rFonts w:ascii="Arial" w:hAnsi="Arial" w:cs="Arial"/>
         </w:rPr>
         <w:pict w14:anchorId="790868D9">
-          <v:rect id="_x0000_i1065" style="width:0;height:1.5pt" o:hralign="center" o:hrstd="t" o:hr="t" fillcolor="#a0a0a0" stroked="f"/>
+          <v:rect id="_x0000_i1029" style="width:0;height:1.5pt" o:hralign="center" o:hrstd="t" o:hr="t" fillcolor="#a0a0a0" stroked="f"/>
         </w:pict>
       </w:r>
     </w:p>
@@ -8131,7 +8587,6 @@
         <w:rPr>
           <w:rFonts w:ascii="Arial" w:hAnsi="Arial" w:cs="Arial"/>
         </w:rPr>
-        <w:lastRenderedPageBreak/>
         <w:t xml:space="preserve">Presiona </w:t>
       </w:r>
       <w:r>
@@ -8231,6 +8686,7 @@
         <w:rPr>
           <w:rFonts w:ascii="Arial" w:hAnsi="Arial" w:cs="Arial"/>
         </w:rPr>
+        <w:lastRenderedPageBreak/>
         <w:t>Título de actividad.</w:t>
       </w:r>
     </w:p>
@@ -8361,7 +8817,7 @@
 </file>
 
 <file path=word/numbering.xml><?xml version="1.0" encoding="utf-8"?>
-<w:numbering xmlns:wpc="http://schemas.microsoft.com/office/word/2010/wordprocessingCanvas" xmlns:cx="http://schemas.microsoft.com/office/drawing/2014/chartex" xmlns:cx1="http://schemas.microsoft.com/office/drawing/2015/9/8/chartex" xmlns:cx2="http://schemas.microsoft.com/office/drawing/2015/10/21/chartex" xmlns:cx3="http://schemas.microsoft.com/office/drawing/2016/5/9/chartex" xmlns:cx4="http://schemas.microsoft.com/office/drawing/2016/5/10/chartex" xmlns:cx5="http://schemas.microsoft.com/office/drawing/2016/5/11/chartex" xmlns:cx6="http://schemas.microsoft.com/office/drawing/2016/5/12/chartex" xmlns:cx7="http://schemas.microsoft.com/office/drawing/2016/5/13/chartex" xmlns:cx8="http://schemas.microsoft.com/office/drawing/2016/5/14/chartex" xmlns:mc="http://schemas.openxmlformats.org/markup-compatibility/2006" xmlns:aink="http://schemas.microsoft.com/office/drawing/2016/ink" xmlns:am3d="http://schemas.microsoft.com/office/drawing/2017/model3d" xmlns:o="urn:schemas-microsoft-com:office:office" xmlns:oel="http://schemas.microsoft.com/office/2019/extlst" xmlns:r="http://schemas.openxmlformats.org/officeDocument/2006/relationships" xmlns:m="http://schemas.openxmlformats.org/officeDocument/2006/math" xmlns:v="urn:schemas-microsoft-com:vml" xmlns:wp14="http://schemas.microsoft.com/office/word/2010/wordprocessingDrawing" xmlns:wp="http://schemas.openxmlformats.org/drawingml/2006/wordprocessingDrawing" xmlns:w10="urn:schemas-microsoft-com:office:word" xmlns:w="http://schemas.openxmlformats.org/wordprocessingml/2006/main" xmlns:w14="http://schemas.microsoft.com/office/word/2010/wordml" xmlns:w15="http://schemas.microsoft.com/office/word/2012/wordml" xmlns:w16cex="http://schemas.microsoft.com/office/word/2018/wordml/cex" xmlns:w16cid="http://schemas.microsoft.com/office/word/2016/wordml/cid" xmlns:w16="http://schemas.microsoft.com/office/word/2018/wordml" xmlns:w16du="http://schemas.microsoft.com/office/word/2023/wordml/word16du" xmlns:w16sdtdh="http://schemas.microsoft.com/office/word/2020/wordml/sdtdatahash" xmlns:w16sdtfl="http://schemas.microsoft.com/office/word/2024/wordml/sdtformatlock" xmlns:w16se="http://schemas.microsoft.com/office/word/2015/wordml/symex" xmlns:wpg="http://schemas.microsoft.com/office/word/2010/wordprocessingGroup" xmlns:wpi="http://schemas.microsoft.com/office/word/2010/wordprocessingInk" xmlns:wne="http://schemas.microsoft.com/office/word/2006/wordml" xmlns:wps="http://schemas.microsoft.com/office/word/2010/wordprocessingShape" mc:Ignorable="w14 w15 w16se w16cid w16 w16cex w16sdtdh w16sdtfl w16du wp14">
+<w:numbering xmlns:wpc="http://schemas.microsoft.com/office/word/2010/wordprocessingCanvas" xmlns:cx="http://schemas.microsoft.com/office/drawing/2014/chartex" xmlns:cx1="http://schemas.microsoft.com/office/drawing/2015/9/8/chartex" xmlns:cx2="http://schemas.microsoft.com/office/drawing/2015/10/21/chartex" xmlns:cx3="http://schemas.microsoft.com/office/drawing/2016/5/9/chartex" xmlns:cx4="http://schemas.microsoft.com/office/drawing/2016/5/10/chartex" xmlns:cx5="http://schemas.microsoft.com/office/drawing/2016/5/11/chartex" xmlns:cx6="http://schemas.microsoft.com/office/drawing/2016/5/12/chartex" xmlns:cx7="http://schemas.microsoft.com/office/drawing/2016/5/13/chartex" xmlns:cx8="http://schemas.microsoft.com/office/drawing/2016/5/14/chartex" xmlns:mc="http://schemas.openxmlformats.org/markup-compatibility/2006" xmlns:aink="http://schemas.microsoft.com/office/drawing/2016/ink" xmlns:am3d="http://schemas.microsoft.com/office/drawing/2017/model3d" xmlns:o="urn:schemas-microsoft-com:office:office" xmlns:oel="http://schemas.microsoft.com/office/2019/extlst" xmlns:r="http://schemas.openxmlformats.org/officeDocument/2006/relationships" xmlns:m="http://schemas.openxmlformats.org/officeDocument/2006/math" xmlns:v="urn:schemas-microsoft-com:vml" xmlns:wp14="http://schemas.microsoft.com/office/word/2010/wordprocessingDrawing" xmlns:wp="http://schemas.openxmlformats.org/drawingml/2006/wordprocessingDrawing" xmlns:w10="urn:schemas-microsoft-com:office:word" xmlns:w="http://schemas.openxmlformats.org/wordprocessingml/2006/main" xmlns:w14="http://schemas.microsoft.com/office/word/2010/wordml" xmlns:w15="http://schemas.microsoft.com/office/word/2012/wordml" xmlns:w16cei="http://schemas.microsoft.com/office/word/2026/wordml/cei" xmlns:w16cex="http://schemas.microsoft.com/office/word/2018/wordml/cex" xmlns:w16cid="http://schemas.microsoft.com/office/word/2016/wordml/cid" xmlns:w16="http://schemas.microsoft.com/office/word/2018/wordml" xmlns:w16du="http://schemas.microsoft.com/office/word/2023/wordml/word16du" xmlns:w16sdtdh="http://schemas.microsoft.com/office/word/2020/wordml/sdtdatahash" xmlns:w16sdtfl="http://schemas.microsoft.com/office/word/2024/wordml/sdtformatlock" xmlns:w16se="http://schemas.microsoft.com/office/word/2015/wordml/symex" xmlns:wpg="http://schemas.microsoft.com/office/word/2010/wordprocessingGroup" xmlns:wpi="http://schemas.microsoft.com/office/word/2010/wordprocessingInk" xmlns:wne="http://schemas.microsoft.com/office/word/2006/wordml" xmlns:wps="http://schemas.microsoft.com/office/word/2010/wordprocessingShape" mc:Ignorable="w14 w15 w16se w16cid w16 w16cex w16sdtdh w16sdtfl w16du wp14">
   <w:abstractNum w:abstractNumId="0" w15:restartNumberingAfterBreak="0">
     <w:nsid w:val="002F35A3"/>
     <w:multiLevelType w:val="multilevel"/>

</xml_diff>

<commit_message>
documentacion modulo inventario finalizada
</commit_message>
<xml_diff>
--- a/PROYECTO CASOS DE USO.docx
+++ b/PROYECTO CASOS DE USO.docx
@@ -2472,7 +2472,27 @@
         <w:rPr>
           <w:rFonts w:ascii="Arial" w:hAnsi="Arial" w:cs="Arial"/>
         </w:rPr>
-        <w:t>El recepcionista captura datos básicos: fecha, origen, proveedor o remitente, tipo de equipo, cantidad y documento de referencia.</w:t>
+        <w:t>El recepcionista captura datos básicos: fecha, origen, proveedor o remitente, tipo de equipo, cantidad y</w:t>
+      </w:r>
+      <w:r>
+        <w:rPr>
+          <w:rFonts w:ascii="Arial" w:hAnsi="Arial" w:cs="Arial"/>
+        </w:rPr>
+        <w:t xml:space="preserve"> ubicación donde se </w:t>
+      </w:r>
+      <w:proofErr w:type="gramStart"/>
+      <w:r>
+        <w:rPr>
+          <w:rFonts w:ascii="Arial" w:hAnsi="Arial" w:cs="Arial"/>
+        </w:rPr>
+        <w:t>colocara</w:t>
+      </w:r>
+      <w:proofErr w:type="gramEnd"/>
+      <w:r>
+        <w:rPr>
+          <w:rFonts w:ascii="Arial" w:hAnsi="Arial" w:cs="Arial"/>
+        </w:rPr>
+        <w:t xml:space="preserve"> el equipo.</w:t>
       </w:r>
     </w:p>
     <w:p>
@@ -2566,23 +2586,6 @@
     </w:p>
     <w:p>
       <w:pPr>
-        <w:numPr>
-          <w:ilvl w:val="0"/>
-          <w:numId w:val="3"/>
-        </w:numPr>
-        <w:rPr>
-          <w:rFonts w:ascii="Arial" w:hAnsi="Arial" w:cs="Arial"/>
-        </w:rPr>
-      </w:pPr>
-      <w:r>
-        <w:rPr>
-          <w:rFonts w:ascii="Arial" w:hAnsi="Arial" w:cs="Arial"/>
-        </w:rPr>
-        <w:t>Si el equipo llega sin documento de referencia, el sistema permite continuar dejando el ingreso como “pendiente de validación documental”.</w:t>
-      </w:r>
-    </w:p>
-    <w:p>
-      <w:pPr>
         <w:rPr>
           <w:rFonts w:ascii="Arial" w:hAnsi="Arial" w:cs="Arial"/>
         </w:rPr>
@@ -2615,23 +2618,6 @@
     </w:p>
     <w:p>
       <w:pPr>
-        <w:numPr>
-          <w:ilvl w:val="0"/>
-          <w:numId w:val="4"/>
-        </w:numPr>
-        <w:rPr>
-          <w:rFonts w:ascii="Arial" w:hAnsi="Arial" w:cs="Arial"/>
-        </w:rPr>
-      </w:pPr>
-      <w:r>
-        <w:rPr>
-          <w:rFonts w:ascii="Arial" w:hAnsi="Arial" w:cs="Arial"/>
-        </w:rPr>
-        <w:t>El equipo queda disponible para apertura de inspección.</w:t>
-      </w:r>
-    </w:p>
-    <w:p>
-      <w:pPr>
         <w:jc w:val="center"/>
         <w:rPr>
           <w:rFonts w:ascii="Arial" w:hAnsi="Arial" w:cs="Arial"/>
@@ -2640,6 +2626,7 @@
       <w:r>
         <w:rPr>
           <w:rFonts w:ascii="Arial" w:hAnsi="Arial" w:cs="Arial"/>
+          <w:noProof/>
         </w:rPr>
         <w:lastRenderedPageBreak/>
         <w:drawing>
@@ -2733,7 +2720,19 @@
         <w:rPr>
           <w:rFonts w:ascii="Arial" w:hAnsi="Arial" w:cs="Arial"/>
         </w:rPr>
-        <w:t xml:space="preserve"> abrir formalmente el expediente de inspección del equipo ingresado.</w:t>
+        <w:t xml:space="preserve"> </w:t>
+      </w:r>
+      <w:r>
+        <w:rPr>
+          <w:rFonts w:ascii="Arial" w:hAnsi="Arial" w:cs="Arial"/>
+        </w:rPr>
+        <w:t xml:space="preserve">Asignar las especiaciones técnicas </w:t>
+      </w:r>
+      <w:r>
+        <w:rPr>
+          <w:rFonts w:ascii="Arial" w:hAnsi="Arial" w:cs="Arial"/>
+        </w:rPr>
+        <w:t>de un equipo</w:t>
       </w:r>
       <w:r>
         <w:rPr>
@@ -2785,24 +2784,7 @@
         <w:rPr>
           <w:rFonts w:ascii="Arial" w:hAnsi="Arial" w:cs="Arial"/>
         </w:rPr>
-        <w:t>Existe un ingreso de equipo registrado.</w:t>
-      </w:r>
-    </w:p>
-    <w:p>
-      <w:pPr>
-        <w:numPr>
-          <w:ilvl w:val="0"/>
-          <w:numId w:val="6"/>
-        </w:numPr>
-        <w:rPr>
-          <w:rFonts w:ascii="Arial" w:hAnsi="Arial" w:cs="Arial"/>
-        </w:rPr>
-      </w:pPr>
-      <w:r>
-        <w:rPr>
-          <w:rFonts w:ascii="Arial" w:hAnsi="Arial" w:cs="Arial"/>
-        </w:rPr>
-        <w:t>El equipo no tiene ya una inspección activa.</w:t>
+        <w:t>Se debió haber realizado el registro de ingreso</w:t>
       </w:r>
     </w:p>
     <w:p>
@@ -2851,7 +2833,13 @@
         <w:rPr>
           <w:rFonts w:ascii="Arial" w:hAnsi="Arial" w:cs="Arial"/>
         </w:rPr>
-        <w:t>El usuario selecciona “Crear inspección”.</w:t>
+        <w:t xml:space="preserve">El sistema genera un </w:t>
+      </w:r>
+      <w:r>
+        <w:rPr>
+          <w:rFonts w:ascii="Arial" w:hAnsi="Arial" w:cs="Arial"/>
+        </w:rPr>
+        <w:t>formulario para ingresar las especificaciones técnicas.</w:t>
       </w:r>
     </w:p>
     <w:p>
@@ -2868,7 +2856,7 @@
         <w:rPr>
           <w:rFonts w:ascii="Arial" w:hAnsi="Arial" w:cs="Arial"/>
         </w:rPr>
-        <w:t>El sistema genera un expediente o folio de inspección.</w:t>
+        <w:t>Se ingresan las especificaciones del equipo según el tipo asignado</w:t>
       </w:r>
     </w:p>
     <w:p>
@@ -2885,7 +2873,7 @@
         <w:rPr>
           <w:rFonts w:ascii="Arial" w:hAnsi="Arial" w:cs="Arial"/>
         </w:rPr>
-        <w:t>El sistema asocia el expediente con el ingreso del equipo.</w:t>
+        <w:t>Se validan las especificaciones</w:t>
       </w:r>
     </w:p>
     <w:p>
@@ -2902,24 +2890,13 @@
         <w:rPr>
           <w:rFonts w:ascii="Arial" w:hAnsi="Arial" w:cs="Arial"/>
         </w:rPr>
-        <w:t>El sistema asigna estado inicial, por ejemplo “Pendiente de revisión” o “En cuarentena técnica”.</w:t>
-      </w:r>
-    </w:p>
-    <w:p>
-      <w:pPr>
-        <w:numPr>
-          <w:ilvl w:val="0"/>
-          <w:numId w:val="7"/>
-        </w:numPr>
-        <w:rPr>
-          <w:rFonts w:ascii="Arial" w:hAnsi="Arial" w:cs="Arial"/>
-        </w:rPr>
-      </w:pPr>
-      <w:r>
-        <w:rPr>
-          <w:rFonts w:ascii="Arial" w:hAnsi="Arial" w:cs="Arial"/>
-        </w:rPr>
-        <w:t>El sistema guarda la inspección y la deja disponible para revisión documental y técnica.jodoo+1</w:t>
+        <w:t>El sistema guarda la</w:t>
+      </w:r>
+      <w:r>
+        <w:rPr>
+          <w:rFonts w:ascii="Arial" w:hAnsi="Arial" w:cs="Arial"/>
+        </w:rPr>
+        <w:t xml:space="preserve"> asignación de las especificaciones.</w:t>
       </w:r>
     </w:p>
     <w:p>
@@ -2951,25 +2928,21 @@
         <w:rPr>
           <w:rFonts w:ascii="Arial" w:hAnsi="Arial" w:cs="Arial"/>
         </w:rPr>
-        <w:t>Si ya existe una inspección activa para ese ingreso, el sistema impide duplicarla.</w:t>
-      </w:r>
-    </w:p>
-    <w:p>
-      <w:pPr>
-        <w:numPr>
-          <w:ilvl w:val="0"/>
-          <w:numId w:val="8"/>
-        </w:numPr>
-        <w:rPr>
-          <w:rFonts w:ascii="Arial" w:hAnsi="Arial" w:cs="Arial"/>
-        </w:rPr>
-      </w:pPr>
-      <w:r>
-        <w:rPr>
-          <w:rFonts w:ascii="Arial" w:hAnsi="Arial" w:cs="Arial"/>
-        </w:rPr>
-        <w:lastRenderedPageBreak/>
-        <w:t>Si el usuario no tiene permisos, el sistema bloquea la acción.</w:t>
+        <w:t xml:space="preserve">Si alguna especificación de un equipo no aplica, se </w:t>
+      </w:r>
+      <w:proofErr w:type="gramStart"/>
+      <w:r>
+        <w:rPr>
+          <w:rFonts w:ascii="Arial" w:hAnsi="Arial" w:cs="Arial"/>
+        </w:rPr>
+        <w:t>seleccionara</w:t>
+      </w:r>
+      <w:proofErr w:type="gramEnd"/>
+      <w:r>
+        <w:rPr>
+          <w:rFonts w:ascii="Arial" w:hAnsi="Arial" w:cs="Arial"/>
+        </w:rPr>
+        <w:t xml:space="preserve"> la opción de “no aplica”.</w:t>
       </w:r>
     </w:p>
     <w:p>
@@ -3001,42 +2974,31 @@
         <w:rPr>
           <w:rFonts w:ascii="Arial" w:hAnsi="Arial" w:cs="Arial"/>
         </w:rPr>
-        <w:t>El equipo queda con expediente de inspección activo.</w:t>
-      </w:r>
-    </w:p>
-    <w:p>
-      <w:pPr>
-        <w:numPr>
-          <w:ilvl w:val="0"/>
-          <w:numId w:val="9"/>
-        </w:numPr>
-        <w:rPr>
-          <w:rFonts w:ascii="Arial" w:hAnsi="Arial" w:cs="Arial"/>
-        </w:rPr>
-      </w:pPr>
-      <w:r>
-        <w:rPr>
-          <w:rFonts w:ascii="Arial" w:hAnsi="Arial" w:cs="Arial"/>
-        </w:rPr>
-        <w:t>El estado inicial queda definido en el sistema.</w:t>
-      </w:r>
-    </w:p>
-    <w:p>
-      <w:pPr>
-        <w:jc w:val="center"/>
-        <w:rPr>
-          <w:rFonts w:ascii="Arial" w:hAnsi="Arial" w:cs="Arial"/>
-        </w:rPr>
-      </w:pPr>
-      <w:r>
-        <w:rPr>
-          <w:rFonts w:ascii="Arial" w:hAnsi="Arial" w:cs="Arial"/>
-        </w:rPr>
+        <w:t xml:space="preserve">El </w:t>
+      </w:r>
+      <w:r>
+        <w:rPr>
+          <w:rFonts w:ascii="Arial" w:hAnsi="Arial" w:cs="Arial"/>
+        </w:rPr>
+        <w:t>equipo queda complemente registrado en el sistema.</w:t>
+      </w:r>
+    </w:p>
+    <w:p>
+      <w:pPr>
+        <w:rPr>
+          <w:rFonts w:ascii="Arial" w:hAnsi="Arial" w:cs="Arial"/>
+        </w:rPr>
+      </w:pPr>
+      <w:r>
+        <w:rPr>
+          <w:noProof/>
+        </w:rPr>
+        <w:lastRenderedPageBreak/>
         <w:drawing>
-          <wp:inline distT="0" distB="0" distL="0" distR="0" wp14:anchorId="6D83277E" wp14:editId="5A7097E5">
-            <wp:extent cx="5036820" cy="2689951"/>
-            <wp:effectExtent l="0" t="0" r="0" b="0"/>
-            <wp:docPr id="168355450" name="Imagen 1"/>
+          <wp:inline distT="0" distB="0" distL="0" distR="0" wp14:anchorId="680BD4FA" wp14:editId="0202ED85">
+            <wp:extent cx="5612130" cy="4345305"/>
+            <wp:effectExtent l="0" t="0" r="7620" b="0"/>
+            <wp:docPr id="1802011983" name="Imagen 1"/>
             <wp:cNvGraphicFramePr>
               <a:graphicFrameLocks xmlns:a="http://schemas.openxmlformats.org/drawingml/2006/main" noChangeAspect="1"/>
             </wp:cNvGraphicFramePr>
@@ -3044,23 +3006,36 @@
               <a:graphicData uri="http://schemas.openxmlformats.org/drawingml/2006/picture">
                 <pic:pic xmlns:pic="http://schemas.openxmlformats.org/drawingml/2006/picture">
                   <pic:nvPicPr>
-                    <pic:cNvPr id="168355450" name=""/>
-                    <pic:cNvPicPr/>
+                    <pic:cNvPr id="0" name="Picture 6"/>
+                    <pic:cNvPicPr>
+                      <a:picLocks noChangeAspect="1" noChangeArrowheads="1"/>
+                    </pic:cNvPicPr>
                   </pic:nvPicPr>
                   <pic:blipFill>
-                    <a:blip r:embed="rId6"/>
+                    <a:blip r:embed="rId6">
+                      <a:extLst>
+                        <a:ext uri="{28A0092B-C50C-407E-A947-70E740481C1C}">
+                          <a14:useLocalDpi xmlns:a14="http://schemas.microsoft.com/office/drawing/2010/main" val="0"/>
+                        </a:ext>
+                      </a:extLst>
+                    </a:blip>
+                    <a:srcRect/>
                     <a:stretch>
                       <a:fillRect/>
                     </a:stretch>
                   </pic:blipFill>
-                  <pic:spPr>
+                  <pic:spPr bwMode="auto">
                     <a:xfrm>
                       <a:off x="0" y="0"/>
-                      <a:ext cx="5043177" cy="2693346"/>
+                      <a:ext cx="5612130" cy="4345305"/>
                     </a:xfrm>
                     <a:prstGeom prst="rect">
                       <a:avLst/>
                     </a:prstGeom>
+                    <a:noFill/>
+                    <a:ln>
+                      <a:noFill/>
+                    </a:ln>
                   </pic:spPr>
                 </pic:pic>
               </a:graphicData>
@@ -3071,3185 +3046,11 @@
     </w:p>
     <w:p>
       <w:pPr>
-        <w:rPr>
-          <w:rFonts w:ascii="Arial" w:hAnsi="Arial" w:cs="Arial"/>
-        </w:rPr>
-      </w:pPr>
-    </w:p>
-    <w:p>
-      <w:pPr>
-        <w:pStyle w:val="Prrafodelista"/>
-        <w:numPr>
-          <w:ilvl w:val="0"/>
-          <w:numId w:val="5"/>
-        </w:numPr>
-        <w:rPr>
-          <w:rFonts w:ascii="Arial" w:hAnsi="Arial" w:cs="Arial"/>
-          <w:b/>
-          <w:bCs/>
-        </w:rPr>
-      </w:pPr>
-      <w:r>
-        <w:rPr>
-          <w:rFonts w:ascii="Arial" w:hAnsi="Arial" w:cs="Arial"/>
-          <w:b/>
-          <w:bCs/>
-        </w:rPr>
-        <w:t>Validar documentación del equipo</w:t>
-      </w:r>
-    </w:p>
-    <w:p>
-      <w:pPr>
-        <w:rPr>
-          <w:rFonts w:ascii="Arial" w:hAnsi="Arial" w:cs="Arial"/>
-        </w:rPr>
-      </w:pPr>
-      <w:r>
-        <w:rPr>
-          <w:rFonts w:ascii="Arial" w:hAnsi="Arial" w:cs="Arial"/>
-          <w:b/>
-          <w:bCs/>
-        </w:rPr>
-        <w:t>Objetivo:</w:t>
-      </w:r>
-      <w:r>
-        <w:rPr>
-          <w:rFonts w:ascii="Arial" w:hAnsi="Arial" w:cs="Arial"/>
-        </w:rPr>
-        <w:t xml:space="preserve"> verificar si la documentación del equipo está completa, corresponde al equipo recibido y puede usarse como referencia de inspección.</w:t>
-      </w:r>
-      <w:r>
-        <w:rPr>
-          <w:rFonts w:ascii="Arial" w:hAnsi="Arial" w:cs="Arial"/>
-        </w:rPr>
-        <w:br/>
-      </w:r>
-      <w:r>
-        <w:rPr>
-          <w:rFonts w:ascii="Arial" w:hAnsi="Arial" w:cs="Arial"/>
-          <w:b/>
-          <w:bCs/>
-        </w:rPr>
-        <w:t>Actor principal:</w:t>
-      </w:r>
-      <w:r>
-        <w:rPr>
-          <w:rFonts w:ascii="Arial" w:hAnsi="Arial" w:cs="Arial"/>
-        </w:rPr>
-        <w:t xml:space="preserve"> Inspector técnico.</w:t>
-      </w:r>
-    </w:p>
-    <w:p>
-      <w:pPr>
-        <w:rPr>
-          <w:rFonts w:ascii="Arial" w:hAnsi="Arial" w:cs="Arial"/>
-        </w:rPr>
-      </w:pPr>
-      <w:r>
-        <w:rPr>
-          <w:rFonts w:ascii="Arial" w:hAnsi="Arial" w:cs="Arial"/>
-          <w:b/>
-          <w:bCs/>
-        </w:rPr>
-        <w:t>Precondiciones:</w:t>
-      </w:r>
-    </w:p>
-    <w:p>
-      <w:pPr>
-        <w:numPr>
-          <w:ilvl w:val="0"/>
-          <w:numId w:val="10"/>
-        </w:numPr>
-        <w:rPr>
-          <w:rFonts w:ascii="Arial" w:hAnsi="Arial" w:cs="Arial"/>
-        </w:rPr>
-      </w:pPr>
-      <w:r>
-        <w:rPr>
-          <w:rFonts w:ascii="Arial" w:hAnsi="Arial" w:cs="Arial"/>
-        </w:rPr>
-        <w:t>Existe un expediente de inspección activo.</w:t>
-      </w:r>
-    </w:p>
-    <w:p>
-      <w:pPr>
-        <w:numPr>
-          <w:ilvl w:val="0"/>
-          <w:numId w:val="10"/>
-        </w:numPr>
-        <w:rPr>
-          <w:rFonts w:ascii="Arial" w:hAnsi="Arial" w:cs="Arial"/>
-        </w:rPr>
-      </w:pPr>
-      <w:r>
-        <w:rPr>
-          <w:rFonts w:ascii="Arial" w:hAnsi="Arial" w:cs="Arial"/>
-        </w:rPr>
-        <w:t>El sistema tiene cargados o disponibles los documentos asociados, o el usuario puede adjuntarlos.</w:t>
-      </w:r>
-    </w:p>
-    <w:p>
-      <w:pPr>
-        <w:rPr>
-          <w:rFonts w:ascii="Arial" w:hAnsi="Arial" w:cs="Arial"/>
-        </w:rPr>
-      </w:pPr>
-      <w:r>
-        <w:rPr>
-          <w:rFonts w:ascii="Arial" w:hAnsi="Arial" w:cs="Arial"/>
-          <w:b/>
-          <w:bCs/>
-        </w:rPr>
-        <w:t>Flujo principal:</w:t>
-      </w:r>
-    </w:p>
-    <w:p>
-      <w:pPr>
-        <w:numPr>
-          <w:ilvl w:val="0"/>
-          <w:numId w:val="11"/>
-        </w:numPr>
-        <w:rPr>
-          <w:rFonts w:ascii="Arial" w:hAnsi="Arial" w:cs="Arial"/>
-        </w:rPr>
-      </w:pPr>
-      <w:r>
-        <w:rPr>
-          <w:rFonts w:ascii="Arial" w:hAnsi="Arial" w:cs="Arial"/>
-        </w:rPr>
-        <w:t>El inspector abre el expediente de inspección.</w:t>
-      </w:r>
-    </w:p>
-    <w:p>
-      <w:pPr>
-        <w:numPr>
-          <w:ilvl w:val="0"/>
-          <w:numId w:val="11"/>
-        </w:numPr>
-        <w:rPr>
-          <w:rFonts w:ascii="Arial" w:hAnsi="Arial" w:cs="Arial"/>
-        </w:rPr>
-      </w:pPr>
-      <w:r>
-        <w:rPr>
-          <w:rFonts w:ascii="Arial" w:hAnsi="Arial" w:cs="Arial"/>
-        </w:rPr>
-        <w:t>El sistema muestra la sección de documentación.</w:t>
-      </w:r>
-    </w:p>
-    <w:p>
-      <w:pPr>
-        <w:numPr>
-          <w:ilvl w:val="0"/>
-          <w:numId w:val="11"/>
-        </w:numPr>
-        <w:rPr>
-          <w:rFonts w:ascii="Arial" w:hAnsi="Arial" w:cs="Arial"/>
-        </w:rPr>
-      </w:pPr>
-      <w:r>
-        <w:rPr>
-          <w:rFonts w:ascii="Arial" w:hAnsi="Arial" w:cs="Arial"/>
-        </w:rPr>
-        <w:t>El inspector revisa ficha técnica, manuales, certificados, etiquetas documentadas o documento de referencia.</w:t>
-      </w:r>
-    </w:p>
-    <w:p>
-      <w:pPr>
-        <w:numPr>
-          <w:ilvl w:val="0"/>
-          <w:numId w:val="11"/>
-        </w:numPr>
-        <w:rPr>
-          <w:rFonts w:ascii="Arial" w:hAnsi="Arial" w:cs="Arial"/>
-        </w:rPr>
-      </w:pPr>
-      <w:r>
-        <w:rPr>
-          <w:rFonts w:ascii="Arial" w:hAnsi="Arial" w:cs="Arial"/>
-        </w:rPr>
-        <w:lastRenderedPageBreak/>
-        <w:t xml:space="preserve">El inspector valida coincidencia de datos clave, como marca, modelo, </w:t>
-      </w:r>
-      <w:proofErr w:type="spellStart"/>
-      <w:r>
-        <w:rPr>
-          <w:rFonts w:ascii="Arial" w:hAnsi="Arial" w:cs="Arial"/>
-        </w:rPr>
-        <w:t>part</w:t>
-      </w:r>
-      <w:proofErr w:type="spellEnd"/>
-      <w:r>
-        <w:rPr>
-          <w:rFonts w:ascii="Arial" w:hAnsi="Arial" w:cs="Arial"/>
-        </w:rPr>
-        <w:t xml:space="preserve"> </w:t>
-      </w:r>
-      <w:proofErr w:type="spellStart"/>
-      <w:r>
-        <w:rPr>
-          <w:rFonts w:ascii="Arial" w:hAnsi="Arial" w:cs="Arial"/>
-        </w:rPr>
-        <w:t>number</w:t>
-      </w:r>
-      <w:proofErr w:type="spellEnd"/>
-      <w:r>
-        <w:rPr>
-          <w:rFonts w:ascii="Arial" w:hAnsi="Arial" w:cs="Arial"/>
-        </w:rPr>
-        <w:t xml:space="preserve"> y serial, si aplica.</w:t>
-      </w:r>
-    </w:p>
-    <w:p>
-      <w:pPr>
-        <w:numPr>
-          <w:ilvl w:val="0"/>
-          <w:numId w:val="11"/>
-        </w:numPr>
-        <w:rPr>
-          <w:rFonts w:ascii="Arial" w:hAnsi="Arial" w:cs="Arial"/>
-        </w:rPr>
-      </w:pPr>
-      <w:r>
-        <w:rPr>
-          <w:rFonts w:ascii="Arial" w:hAnsi="Arial" w:cs="Arial"/>
-        </w:rPr>
-        <w:t>El inspector registra el resultado documental como “completa”, “incompleta” o “con discrepancias”.</w:t>
-      </w:r>
-    </w:p>
-    <w:p>
-      <w:pPr>
-        <w:numPr>
-          <w:ilvl w:val="0"/>
-          <w:numId w:val="11"/>
-        </w:numPr>
-        <w:rPr>
-          <w:rFonts w:ascii="Arial" w:hAnsi="Arial" w:cs="Arial"/>
-        </w:rPr>
-      </w:pPr>
-      <w:r>
-        <w:rPr>
-          <w:rFonts w:ascii="Arial" w:hAnsi="Arial" w:cs="Arial"/>
-        </w:rPr>
-        <w:t>El sistema guarda el resultado de la validación documental</w:t>
-      </w:r>
-      <w:r>
-        <w:rPr>
-          <w:rFonts w:ascii="Arial" w:hAnsi="Arial" w:cs="Arial"/>
-        </w:rPr>
-        <w:t>.</w:t>
-      </w:r>
-    </w:p>
-    <w:p>
-      <w:pPr>
-        <w:rPr>
-          <w:rFonts w:ascii="Arial" w:hAnsi="Arial" w:cs="Arial"/>
-        </w:rPr>
-      </w:pPr>
-      <w:r>
-        <w:rPr>
-          <w:rFonts w:ascii="Arial" w:hAnsi="Arial" w:cs="Arial"/>
-          <w:b/>
-          <w:bCs/>
-        </w:rPr>
-        <w:t>Flujos alternos:</w:t>
-      </w:r>
-    </w:p>
-    <w:p>
-      <w:pPr>
-        <w:numPr>
-          <w:ilvl w:val="0"/>
-          <w:numId w:val="12"/>
-        </w:numPr>
-        <w:rPr>
-          <w:rFonts w:ascii="Arial" w:hAnsi="Arial" w:cs="Arial"/>
-        </w:rPr>
-      </w:pPr>
-      <w:r>
-        <w:rPr>
-          <w:rFonts w:ascii="Arial" w:hAnsi="Arial" w:cs="Arial"/>
-        </w:rPr>
-        <w:t>Si no existe ficha técnica, el inspector marca “documentación no proporcionada”.</w:t>
-      </w:r>
-    </w:p>
-    <w:p>
-      <w:pPr>
-        <w:numPr>
-          <w:ilvl w:val="0"/>
-          <w:numId w:val="12"/>
-        </w:numPr>
-        <w:rPr>
-          <w:rFonts w:ascii="Arial" w:hAnsi="Arial" w:cs="Arial"/>
-        </w:rPr>
-      </w:pPr>
-      <w:r>
-        <w:rPr>
-          <w:rFonts w:ascii="Arial" w:hAnsi="Arial" w:cs="Arial"/>
-        </w:rPr>
-        <w:t>Si los datos documentales no coinciden con lo recibido, el sistema permite registrar observaciones y continuar con el proceso bajo discrepancia.</w:t>
-      </w:r>
-    </w:p>
-    <w:p>
-      <w:pPr>
-        <w:rPr>
-          <w:rFonts w:ascii="Arial" w:hAnsi="Arial" w:cs="Arial"/>
-        </w:rPr>
-      </w:pPr>
-      <w:r>
-        <w:rPr>
-          <w:rFonts w:ascii="Arial" w:hAnsi="Arial" w:cs="Arial"/>
-          <w:b/>
-          <w:bCs/>
-        </w:rPr>
-        <w:t>Postcondiciones:</w:t>
-      </w:r>
-    </w:p>
-    <w:p>
-      <w:pPr>
-        <w:numPr>
-          <w:ilvl w:val="0"/>
-          <w:numId w:val="13"/>
-        </w:numPr>
-        <w:rPr>
-          <w:rFonts w:ascii="Arial" w:hAnsi="Arial" w:cs="Arial"/>
-        </w:rPr>
-      </w:pPr>
-      <w:r>
-        <w:rPr>
-          <w:rFonts w:ascii="Arial" w:hAnsi="Arial" w:cs="Arial"/>
-        </w:rPr>
-        <w:t>La validación documental queda registrada.</w:t>
-      </w:r>
-    </w:p>
-    <w:p>
-      <w:pPr>
-        <w:numPr>
-          <w:ilvl w:val="0"/>
-          <w:numId w:val="13"/>
-        </w:numPr>
-        <w:rPr>
-          <w:rFonts w:ascii="Arial" w:hAnsi="Arial" w:cs="Arial"/>
-        </w:rPr>
-      </w:pPr>
-      <w:r>
-        <w:rPr>
-          <w:rFonts w:ascii="Arial" w:hAnsi="Arial" w:cs="Arial"/>
-        </w:rPr>
-        <w:t>El expediente conserva trazabilidad del estado documental.</w:t>
-      </w:r>
-    </w:p>
-    <w:p>
-      <w:pPr>
         <w:jc w:val="center"/>
         <w:rPr>
           <w:rFonts w:ascii="Arial" w:hAnsi="Arial" w:cs="Arial"/>
         </w:rPr>
       </w:pPr>
-      <w:r>
-        <w:rPr>
-          <w:rFonts w:ascii="Arial" w:hAnsi="Arial" w:cs="Arial"/>
-        </w:rPr>
-        <w:drawing>
-          <wp:inline distT="0" distB="0" distL="0" distR="0" wp14:anchorId="71817841" wp14:editId="00F37DAB">
-            <wp:extent cx="4759037" cy="2584139"/>
-            <wp:effectExtent l="0" t="0" r="3810" b="6985"/>
-            <wp:docPr id="1294408287" name="Imagen 1"/>
-            <wp:cNvGraphicFramePr>
-              <a:graphicFrameLocks xmlns:a="http://schemas.openxmlformats.org/drawingml/2006/main" noChangeAspect="1"/>
-            </wp:cNvGraphicFramePr>
-            <a:graphic xmlns:a="http://schemas.openxmlformats.org/drawingml/2006/main">
-              <a:graphicData uri="http://schemas.openxmlformats.org/drawingml/2006/picture">
-                <pic:pic xmlns:pic="http://schemas.openxmlformats.org/drawingml/2006/picture">
-                  <pic:nvPicPr>
-                    <pic:cNvPr id="1294408287" name=""/>
-                    <pic:cNvPicPr/>
-                  </pic:nvPicPr>
-                  <pic:blipFill>
-                    <a:blip r:embed="rId7"/>
-                    <a:stretch>
-                      <a:fillRect/>
-                    </a:stretch>
-                  </pic:blipFill>
-                  <pic:spPr>
-                    <a:xfrm>
-                      <a:off x="0" y="0"/>
-                      <a:ext cx="4781066" cy="2596100"/>
-                    </a:xfrm>
-                    <a:prstGeom prst="rect">
-                      <a:avLst/>
-                    </a:prstGeom>
-                  </pic:spPr>
-                </pic:pic>
-              </a:graphicData>
-            </a:graphic>
-          </wp:inline>
-        </w:drawing>
-      </w:r>
-    </w:p>
-    <w:p>
-      <w:pPr>
-        <w:rPr>
-          <w:rFonts w:ascii="Arial" w:hAnsi="Arial" w:cs="Arial"/>
-        </w:rPr>
-      </w:pPr>
-    </w:p>
-    <w:p>
-      <w:pPr>
-        <w:rPr>
-          <w:rFonts w:ascii="Arial" w:hAnsi="Arial" w:cs="Arial"/>
-        </w:rPr>
-      </w:pPr>
-    </w:p>
-    <w:p>
-      <w:pPr>
-        <w:pStyle w:val="Prrafodelista"/>
-        <w:numPr>
-          <w:ilvl w:val="0"/>
-          <w:numId w:val="5"/>
-        </w:numPr>
-        <w:rPr>
-          <w:rFonts w:ascii="Arial" w:hAnsi="Arial" w:cs="Arial"/>
-          <w:b/>
-          <w:bCs/>
-        </w:rPr>
-      </w:pPr>
-      <w:r>
-        <w:rPr>
-          <w:rFonts w:ascii="Arial" w:hAnsi="Arial" w:cs="Arial"/>
-          <w:b/>
-          <w:bCs/>
-        </w:rPr>
-        <w:t>Ejecutar inspección física</w:t>
-      </w:r>
-    </w:p>
-    <w:p>
-      <w:pPr>
-        <w:rPr>
-          <w:rFonts w:ascii="Arial" w:hAnsi="Arial" w:cs="Arial"/>
-        </w:rPr>
-      </w:pPr>
-      <w:r>
-        <w:rPr>
-          <w:rFonts w:ascii="Arial" w:hAnsi="Arial" w:cs="Arial"/>
-          <w:b/>
-          <w:bCs/>
-        </w:rPr>
-        <w:t>Objetivo:</w:t>
-      </w:r>
-      <w:r>
-        <w:rPr>
-          <w:rFonts w:ascii="Arial" w:hAnsi="Arial" w:cs="Arial"/>
-        </w:rPr>
-        <w:t xml:space="preserve"> revisar el estado físico visible del equipo y sus elementos asociados.</w:t>
-      </w:r>
-      <w:r>
-        <w:rPr>
-          <w:rFonts w:ascii="Arial" w:hAnsi="Arial" w:cs="Arial"/>
-        </w:rPr>
-        <w:br/>
-      </w:r>
-      <w:r>
-        <w:rPr>
-          <w:rFonts w:ascii="Arial" w:hAnsi="Arial" w:cs="Arial"/>
-          <w:b/>
-          <w:bCs/>
-        </w:rPr>
-        <w:t>Actor principal:</w:t>
-      </w:r>
-      <w:r>
-        <w:rPr>
-          <w:rFonts w:ascii="Arial" w:hAnsi="Arial" w:cs="Arial"/>
-        </w:rPr>
-        <w:t xml:space="preserve"> Inspector técnico.</w:t>
-      </w:r>
-    </w:p>
-    <w:p>
-      <w:pPr>
-        <w:rPr>
-          <w:rFonts w:ascii="Arial" w:hAnsi="Arial" w:cs="Arial"/>
-        </w:rPr>
-      </w:pPr>
-      <w:r>
-        <w:rPr>
-          <w:rFonts w:ascii="Arial" w:hAnsi="Arial" w:cs="Arial"/>
-          <w:b/>
-          <w:bCs/>
-        </w:rPr>
-        <w:t>Precondiciones:</w:t>
-      </w:r>
-    </w:p>
-    <w:p>
-      <w:pPr>
-        <w:numPr>
-          <w:ilvl w:val="0"/>
-          <w:numId w:val="14"/>
-        </w:numPr>
-        <w:rPr>
-          <w:rFonts w:ascii="Arial" w:hAnsi="Arial" w:cs="Arial"/>
-        </w:rPr>
-      </w:pPr>
-      <w:r>
-        <w:rPr>
-          <w:rFonts w:ascii="Arial" w:hAnsi="Arial" w:cs="Arial"/>
-        </w:rPr>
-        <w:t>La inspección está activa.</w:t>
-      </w:r>
-    </w:p>
-    <w:p>
-      <w:pPr>
-        <w:numPr>
-          <w:ilvl w:val="0"/>
-          <w:numId w:val="14"/>
-        </w:numPr>
-        <w:rPr>
-          <w:rFonts w:ascii="Arial" w:hAnsi="Arial" w:cs="Arial"/>
-        </w:rPr>
-      </w:pPr>
-      <w:r>
-        <w:rPr>
-          <w:rFonts w:ascii="Arial" w:hAnsi="Arial" w:cs="Arial"/>
-        </w:rPr>
-        <w:lastRenderedPageBreak/>
-        <w:t>El equipo está disponible físicamente para revisión.</w:t>
-      </w:r>
-    </w:p>
-    <w:p>
-      <w:pPr>
-        <w:rPr>
-          <w:rFonts w:ascii="Arial" w:hAnsi="Arial" w:cs="Arial"/>
-        </w:rPr>
-      </w:pPr>
-      <w:r>
-        <w:rPr>
-          <w:rFonts w:ascii="Arial" w:hAnsi="Arial" w:cs="Arial"/>
-          <w:b/>
-          <w:bCs/>
-        </w:rPr>
-        <w:t>Flujo principal:</w:t>
-      </w:r>
-    </w:p>
-    <w:p>
-      <w:pPr>
-        <w:numPr>
-          <w:ilvl w:val="0"/>
-          <w:numId w:val="15"/>
-        </w:numPr>
-        <w:rPr>
-          <w:rFonts w:ascii="Arial" w:hAnsi="Arial" w:cs="Arial"/>
-        </w:rPr>
-      </w:pPr>
-      <w:r>
-        <w:rPr>
-          <w:rFonts w:ascii="Arial" w:hAnsi="Arial" w:cs="Arial"/>
-        </w:rPr>
-        <w:t>El inspector accede a la sección de inspección física.</w:t>
-      </w:r>
-    </w:p>
-    <w:p>
-      <w:pPr>
-        <w:numPr>
-          <w:ilvl w:val="0"/>
-          <w:numId w:val="15"/>
-        </w:numPr>
-        <w:rPr>
-          <w:rFonts w:ascii="Arial" w:hAnsi="Arial" w:cs="Arial"/>
-        </w:rPr>
-      </w:pPr>
-      <w:r>
-        <w:rPr>
-          <w:rFonts w:ascii="Arial" w:hAnsi="Arial" w:cs="Arial"/>
-        </w:rPr>
-        <w:t>El sistema muestra la lista de verificación física según el tipo de equipo.</w:t>
-      </w:r>
-    </w:p>
-    <w:p>
-      <w:pPr>
-        <w:numPr>
-          <w:ilvl w:val="0"/>
-          <w:numId w:val="15"/>
-        </w:numPr>
-        <w:rPr>
-          <w:rFonts w:ascii="Arial" w:hAnsi="Arial" w:cs="Arial"/>
-        </w:rPr>
-      </w:pPr>
-      <w:r>
-        <w:rPr>
-          <w:rFonts w:ascii="Arial" w:hAnsi="Arial" w:cs="Arial"/>
-        </w:rPr>
-        <w:t>El inspector revisa empaque, integridad física, accesorios, etiquetas, placa de identificación y seriales visibles.</w:t>
-      </w:r>
-    </w:p>
-    <w:p>
-      <w:pPr>
-        <w:numPr>
-          <w:ilvl w:val="0"/>
-          <w:numId w:val="15"/>
-        </w:numPr>
-        <w:rPr>
-          <w:rFonts w:ascii="Arial" w:hAnsi="Arial" w:cs="Arial"/>
-        </w:rPr>
-      </w:pPr>
-      <w:r>
-        <w:rPr>
-          <w:rFonts w:ascii="Arial" w:hAnsi="Arial" w:cs="Arial"/>
-        </w:rPr>
-        <w:t xml:space="preserve">El inspector registra condición general, por </w:t>
-      </w:r>
-      <w:proofErr w:type="gramStart"/>
-      <w:r>
-        <w:rPr>
-          <w:rFonts w:ascii="Arial" w:hAnsi="Arial" w:cs="Arial"/>
-        </w:rPr>
-        <w:t>ejemplo</w:t>
-      </w:r>
-      <w:proofErr w:type="gramEnd"/>
-      <w:r>
-        <w:rPr>
-          <w:rFonts w:ascii="Arial" w:hAnsi="Arial" w:cs="Arial"/>
-        </w:rPr>
-        <w:t xml:space="preserve"> sin daño, con observaciones o con daño.</w:t>
-      </w:r>
-    </w:p>
-    <w:p>
-      <w:pPr>
-        <w:numPr>
-          <w:ilvl w:val="0"/>
-          <w:numId w:val="15"/>
-        </w:numPr>
-        <w:rPr>
-          <w:rFonts w:ascii="Arial" w:hAnsi="Arial" w:cs="Arial"/>
-        </w:rPr>
-      </w:pPr>
-      <w:r>
-        <w:rPr>
-          <w:rFonts w:ascii="Arial" w:hAnsi="Arial" w:cs="Arial"/>
-        </w:rPr>
-        <w:t>El sistema permite anotar observaciones específicas.</w:t>
-      </w:r>
-    </w:p>
-    <w:p>
-      <w:pPr>
-        <w:numPr>
-          <w:ilvl w:val="0"/>
-          <w:numId w:val="15"/>
-        </w:numPr>
-        <w:rPr>
-          <w:rFonts w:ascii="Arial" w:hAnsi="Arial" w:cs="Arial"/>
-        </w:rPr>
-      </w:pPr>
-      <w:r>
-        <w:rPr>
-          <w:rFonts w:ascii="Arial" w:hAnsi="Arial" w:cs="Arial"/>
-        </w:rPr>
-        <w:t>El inspector guarda la inspección física.</w:t>
-      </w:r>
-    </w:p>
-    <w:p>
-      <w:pPr>
-        <w:rPr>
-          <w:rFonts w:ascii="Arial" w:hAnsi="Arial" w:cs="Arial"/>
-        </w:rPr>
-      </w:pPr>
-      <w:r>
-        <w:rPr>
-          <w:rFonts w:ascii="Arial" w:hAnsi="Arial" w:cs="Arial"/>
-          <w:b/>
-          <w:bCs/>
-        </w:rPr>
-        <w:t>Flujos alternos:</w:t>
-      </w:r>
-    </w:p>
-    <w:p>
-      <w:pPr>
-        <w:numPr>
-          <w:ilvl w:val="0"/>
-          <w:numId w:val="16"/>
-        </w:numPr>
-        <w:rPr>
-          <w:rFonts w:ascii="Arial" w:hAnsi="Arial" w:cs="Arial"/>
-        </w:rPr>
-      </w:pPr>
-      <w:r>
-        <w:rPr>
-          <w:rFonts w:ascii="Arial" w:hAnsi="Arial" w:cs="Arial"/>
-        </w:rPr>
-        <w:t>Si el equipo presenta daño visible, el sistema obliga a registrar observación y evidencia.</w:t>
-      </w:r>
-    </w:p>
-    <w:p>
-      <w:pPr>
-        <w:numPr>
-          <w:ilvl w:val="0"/>
-          <w:numId w:val="16"/>
-        </w:numPr>
-        <w:rPr>
-          <w:rFonts w:ascii="Arial" w:hAnsi="Arial" w:cs="Arial"/>
-        </w:rPr>
-      </w:pPr>
-      <w:r>
-        <w:rPr>
-          <w:rFonts w:ascii="Arial" w:hAnsi="Arial" w:cs="Arial"/>
-        </w:rPr>
-        <w:t>Si faltan accesorios, el sistema permite marcar faltantes y clasificarlos.</w:t>
-      </w:r>
-    </w:p>
-    <w:p>
-      <w:pPr>
-        <w:rPr>
-          <w:rFonts w:ascii="Arial" w:hAnsi="Arial" w:cs="Arial"/>
-        </w:rPr>
-      </w:pPr>
-      <w:r>
-        <w:rPr>
-          <w:rFonts w:ascii="Arial" w:hAnsi="Arial" w:cs="Arial"/>
-          <w:b/>
-          <w:bCs/>
-        </w:rPr>
-        <w:t>Postcondiciones:</w:t>
-      </w:r>
-    </w:p>
-    <w:p>
-      <w:pPr>
-        <w:numPr>
-          <w:ilvl w:val="0"/>
-          <w:numId w:val="17"/>
-        </w:numPr>
-        <w:rPr>
-          <w:rFonts w:ascii="Arial" w:hAnsi="Arial" w:cs="Arial"/>
-        </w:rPr>
-      </w:pPr>
-      <w:r>
-        <w:rPr>
-          <w:rFonts w:ascii="Arial" w:hAnsi="Arial" w:cs="Arial"/>
-        </w:rPr>
-        <w:t>El estado físico del equipo queda documentado.</w:t>
-      </w:r>
-    </w:p>
-    <w:p>
-      <w:pPr>
-        <w:numPr>
-          <w:ilvl w:val="0"/>
-          <w:numId w:val="17"/>
-        </w:numPr>
-        <w:rPr>
-          <w:rFonts w:ascii="Arial" w:hAnsi="Arial" w:cs="Arial"/>
-        </w:rPr>
-      </w:pPr>
-      <w:r>
-        <w:rPr>
-          <w:rFonts w:ascii="Arial" w:hAnsi="Arial" w:cs="Arial"/>
-        </w:rPr>
-        <w:t>Las observaciones físicas quedan asociadas al expediente.</w:t>
-      </w:r>
-    </w:p>
-    <w:p>
-      <w:pPr>
-        <w:rPr>
-          <w:rFonts w:ascii="Arial" w:hAnsi="Arial" w:cs="Arial"/>
-        </w:rPr>
-      </w:pPr>
-      <w:r>
-        <w:rPr>
-          <w:rFonts w:ascii="Arial" w:hAnsi="Arial" w:cs="Arial"/>
-        </w:rPr>
-        <w:drawing>
-          <wp:inline distT="0" distB="0" distL="0" distR="0" wp14:anchorId="21AC8301" wp14:editId="132988C3">
-            <wp:extent cx="5330882" cy="2930237"/>
-            <wp:effectExtent l="0" t="0" r="3175" b="3810"/>
-            <wp:docPr id="895278066" name="Imagen 1"/>
-            <wp:cNvGraphicFramePr>
-              <a:graphicFrameLocks xmlns:a="http://schemas.openxmlformats.org/drawingml/2006/main" noChangeAspect="1"/>
-            </wp:cNvGraphicFramePr>
-            <a:graphic xmlns:a="http://schemas.openxmlformats.org/drawingml/2006/main">
-              <a:graphicData uri="http://schemas.openxmlformats.org/drawingml/2006/picture">
-                <pic:pic xmlns:pic="http://schemas.openxmlformats.org/drawingml/2006/picture">
-                  <pic:nvPicPr>
-                    <pic:cNvPr id="895278066" name=""/>
-                    <pic:cNvPicPr/>
-                  </pic:nvPicPr>
-                  <pic:blipFill>
-                    <a:blip r:embed="rId8"/>
-                    <a:stretch>
-                      <a:fillRect/>
-                    </a:stretch>
-                  </pic:blipFill>
-                  <pic:spPr>
-                    <a:xfrm>
-                      <a:off x="0" y="0"/>
-                      <a:ext cx="5381642" cy="2958138"/>
-                    </a:xfrm>
-                    <a:prstGeom prst="rect">
-                      <a:avLst/>
-                    </a:prstGeom>
-                  </pic:spPr>
-                </pic:pic>
-              </a:graphicData>
-            </a:graphic>
-          </wp:inline>
-        </w:drawing>
-      </w:r>
-    </w:p>
-    <w:p>
-      <w:pPr>
-        <w:rPr>
-          <w:rFonts w:ascii="Arial" w:hAnsi="Arial" w:cs="Arial"/>
-        </w:rPr>
-      </w:pPr>
-    </w:p>
-    <w:p>
-      <w:pPr>
-        <w:rPr>
-          <w:rFonts w:ascii="Arial" w:hAnsi="Arial" w:cs="Arial"/>
-        </w:rPr>
-      </w:pPr>
-    </w:p>
-    <w:p>
-      <w:pPr>
-        <w:pStyle w:val="Prrafodelista"/>
-        <w:numPr>
-          <w:ilvl w:val="0"/>
-          <w:numId w:val="5"/>
-        </w:numPr>
-        <w:rPr>
-          <w:rFonts w:ascii="Arial" w:hAnsi="Arial" w:cs="Arial"/>
-          <w:b/>
-          <w:bCs/>
-        </w:rPr>
-      </w:pPr>
-      <w:r>
-        <w:rPr>
-          <w:rFonts w:ascii="Arial" w:hAnsi="Arial" w:cs="Arial"/>
-          <w:b/>
-          <w:bCs/>
-        </w:rPr>
-        <w:t>Verificar especificaciones técnicas</w:t>
-      </w:r>
-    </w:p>
-    <w:p>
-      <w:pPr>
-        <w:rPr>
-          <w:rFonts w:ascii="Arial" w:hAnsi="Arial" w:cs="Arial"/>
-        </w:rPr>
-      </w:pPr>
-      <w:r>
-        <w:rPr>
-          <w:rFonts w:ascii="Arial" w:hAnsi="Arial" w:cs="Arial"/>
-          <w:b/>
-          <w:bCs/>
-        </w:rPr>
-        <w:t>Objetivo:</w:t>
-      </w:r>
-      <w:r>
-        <w:rPr>
-          <w:rFonts w:ascii="Arial" w:hAnsi="Arial" w:cs="Arial"/>
-        </w:rPr>
-        <w:t xml:space="preserve"> comprobar que las características técnicas reales del equipo correspondan a lo requerido o esperado.</w:t>
-      </w:r>
-      <w:r>
-        <w:rPr>
-          <w:rFonts w:ascii="Arial" w:hAnsi="Arial" w:cs="Arial"/>
-        </w:rPr>
-        <w:br/>
-      </w:r>
-      <w:r>
-        <w:rPr>
-          <w:rFonts w:ascii="Arial" w:hAnsi="Arial" w:cs="Arial"/>
-          <w:b/>
-          <w:bCs/>
-        </w:rPr>
-        <w:t>Actor principal:</w:t>
-      </w:r>
-      <w:r>
-        <w:rPr>
-          <w:rFonts w:ascii="Arial" w:hAnsi="Arial" w:cs="Arial"/>
-        </w:rPr>
-        <w:t xml:space="preserve"> Inspector técnico.</w:t>
-      </w:r>
-    </w:p>
-    <w:p>
-      <w:pPr>
-        <w:rPr>
-          <w:rFonts w:ascii="Arial" w:hAnsi="Arial" w:cs="Arial"/>
-        </w:rPr>
-      </w:pPr>
-      <w:r>
-        <w:rPr>
-          <w:rFonts w:ascii="Arial" w:hAnsi="Arial" w:cs="Arial"/>
-          <w:b/>
-          <w:bCs/>
-        </w:rPr>
-        <w:t>Precondiciones:</w:t>
-      </w:r>
-    </w:p>
-    <w:p>
-      <w:pPr>
-        <w:numPr>
-          <w:ilvl w:val="0"/>
-          <w:numId w:val="18"/>
-        </w:numPr>
-        <w:rPr>
-          <w:rFonts w:ascii="Arial" w:hAnsi="Arial" w:cs="Arial"/>
-        </w:rPr>
-      </w:pPr>
-      <w:r>
-        <w:rPr>
-          <w:rFonts w:ascii="Arial" w:hAnsi="Arial" w:cs="Arial"/>
-        </w:rPr>
-        <w:t>Existe expediente activo.</w:t>
-      </w:r>
-    </w:p>
-    <w:p>
-      <w:pPr>
-        <w:numPr>
-          <w:ilvl w:val="0"/>
-          <w:numId w:val="18"/>
-        </w:numPr>
-        <w:rPr>
-          <w:rFonts w:ascii="Arial" w:hAnsi="Arial" w:cs="Arial"/>
-        </w:rPr>
-      </w:pPr>
-      <w:r>
-        <w:rPr>
-          <w:rFonts w:ascii="Arial" w:hAnsi="Arial" w:cs="Arial"/>
-        </w:rPr>
-        <w:t>El sistema tiene una plantilla de validación para el tipo de equipo.</w:t>
-      </w:r>
-    </w:p>
-    <w:p>
-      <w:pPr>
-        <w:numPr>
-          <w:ilvl w:val="0"/>
-          <w:numId w:val="18"/>
-        </w:numPr>
-        <w:rPr>
-          <w:rFonts w:ascii="Arial" w:hAnsi="Arial" w:cs="Arial"/>
-        </w:rPr>
-      </w:pPr>
-      <w:r>
-        <w:rPr>
-          <w:rFonts w:ascii="Arial" w:hAnsi="Arial" w:cs="Arial"/>
-        </w:rPr>
-        <w:t>El equipo puede ser revisado técnica o funcionalmente.</w:t>
-      </w:r>
-    </w:p>
-    <w:p>
-      <w:pPr>
-        <w:rPr>
-          <w:rFonts w:ascii="Arial" w:hAnsi="Arial" w:cs="Arial"/>
-        </w:rPr>
-      </w:pPr>
-      <w:r>
-        <w:rPr>
-          <w:rFonts w:ascii="Arial" w:hAnsi="Arial" w:cs="Arial"/>
-          <w:b/>
-          <w:bCs/>
-        </w:rPr>
-        <w:t>Flujo principal:</w:t>
-      </w:r>
-    </w:p>
-    <w:p>
-      <w:pPr>
-        <w:numPr>
-          <w:ilvl w:val="0"/>
-          <w:numId w:val="19"/>
-        </w:numPr>
-        <w:rPr>
-          <w:rFonts w:ascii="Arial" w:hAnsi="Arial" w:cs="Arial"/>
-        </w:rPr>
-      </w:pPr>
-      <w:r>
-        <w:rPr>
-          <w:rFonts w:ascii="Arial" w:hAnsi="Arial" w:cs="Arial"/>
-        </w:rPr>
-        <w:t>El inspector abre la sección de verificación técnica.</w:t>
-      </w:r>
-    </w:p>
-    <w:p>
-      <w:pPr>
-        <w:numPr>
-          <w:ilvl w:val="0"/>
-          <w:numId w:val="19"/>
-        </w:numPr>
-        <w:rPr>
-          <w:rFonts w:ascii="Arial" w:hAnsi="Arial" w:cs="Arial"/>
-        </w:rPr>
-      </w:pPr>
-      <w:r>
-        <w:rPr>
-          <w:rFonts w:ascii="Arial" w:hAnsi="Arial" w:cs="Arial"/>
-        </w:rPr>
-        <w:t>El sistema despliega los campos técnicos aplicables según el tipo de equipo.</w:t>
-      </w:r>
-    </w:p>
-    <w:p>
-      <w:pPr>
-        <w:numPr>
-          <w:ilvl w:val="0"/>
-          <w:numId w:val="19"/>
-        </w:numPr>
-        <w:rPr>
-          <w:rFonts w:ascii="Arial" w:hAnsi="Arial" w:cs="Arial"/>
-        </w:rPr>
-      </w:pPr>
-      <w:r>
-        <w:rPr>
-          <w:rFonts w:ascii="Arial" w:hAnsi="Arial" w:cs="Arial"/>
-        </w:rPr>
-        <w:t xml:space="preserve">El inspector captura o selecciona datos verificados del equipo, por </w:t>
-      </w:r>
-      <w:proofErr w:type="gramStart"/>
-      <w:r>
-        <w:rPr>
-          <w:rFonts w:ascii="Arial" w:hAnsi="Arial" w:cs="Arial"/>
-        </w:rPr>
-        <w:t>ejemplo</w:t>
-      </w:r>
-      <w:proofErr w:type="gramEnd"/>
-      <w:r>
-        <w:rPr>
-          <w:rFonts w:ascii="Arial" w:hAnsi="Arial" w:cs="Arial"/>
-        </w:rPr>
-        <w:t xml:space="preserve"> CPU, RAM, almacenamiento, pantalla, puertos o conectividad.</w:t>
-      </w:r>
-    </w:p>
-    <w:p>
-      <w:pPr>
-        <w:numPr>
-          <w:ilvl w:val="0"/>
-          <w:numId w:val="19"/>
-        </w:numPr>
-        <w:rPr>
-          <w:rFonts w:ascii="Arial" w:hAnsi="Arial" w:cs="Arial"/>
-        </w:rPr>
-      </w:pPr>
-      <w:r>
-        <w:rPr>
-          <w:rFonts w:ascii="Arial" w:hAnsi="Arial" w:cs="Arial"/>
-        </w:rPr>
-        <w:t>El sistema guarda cada valor registrado como especificación verificada.</w:t>
-      </w:r>
-    </w:p>
-    <w:p>
-      <w:pPr>
-        <w:numPr>
-          <w:ilvl w:val="0"/>
-          <w:numId w:val="19"/>
-        </w:numPr>
-        <w:rPr>
-          <w:rFonts w:ascii="Arial" w:hAnsi="Arial" w:cs="Arial"/>
-        </w:rPr>
-      </w:pPr>
-      <w:r>
-        <w:rPr>
-          <w:rFonts w:ascii="Arial" w:hAnsi="Arial" w:cs="Arial"/>
-        </w:rPr>
-        <w:t>El inspector confirma la revisión técnica.</w:t>
-      </w:r>
-    </w:p>
-    <w:p>
-      <w:pPr>
-        <w:numPr>
-          <w:ilvl w:val="0"/>
-          <w:numId w:val="19"/>
-        </w:numPr>
-        <w:rPr>
-          <w:rFonts w:ascii="Arial" w:hAnsi="Arial" w:cs="Arial"/>
-        </w:rPr>
-      </w:pPr>
-      <w:r>
-        <w:rPr>
-          <w:rFonts w:ascii="Arial" w:hAnsi="Arial" w:cs="Arial"/>
-        </w:rPr>
-        <w:t>El sistema actualiza el expediente con la información técnica verificada.</w:t>
-      </w:r>
-    </w:p>
-    <w:p>
-      <w:pPr>
-        <w:rPr>
-          <w:rFonts w:ascii="Arial" w:hAnsi="Arial" w:cs="Arial"/>
-        </w:rPr>
-      </w:pPr>
-      <w:r>
-        <w:rPr>
-          <w:rFonts w:ascii="Arial" w:hAnsi="Arial" w:cs="Arial"/>
-          <w:b/>
-          <w:bCs/>
-        </w:rPr>
-        <w:t>Flujos alternos:</w:t>
-      </w:r>
-    </w:p>
-    <w:p>
-      <w:pPr>
-        <w:numPr>
-          <w:ilvl w:val="0"/>
-          <w:numId w:val="20"/>
-        </w:numPr>
-        <w:rPr>
-          <w:rFonts w:ascii="Arial" w:hAnsi="Arial" w:cs="Arial"/>
-        </w:rPr>
-      </w:pPr>
-      <w:r>
-        <w:rPr>
-          <w:rFonts w:ascii="Arial" w:hAnsi="Arial" w:cs="Arial"/>
-        </w:rPr>
-        <w:t>Si un atributo no puede verificarse en ese momento, el sistema permite marcarlo como “pendiente”.</w:t>
-      </w:r>
-    </w:p>
-    <w:p>
-      <w:pPr>
-        <w:numPr>
-          <w:ilvl w:val="0"/>
-          <w:numId w:val="20"/>
-        </w:numPr>
-        <w:rPr>
-          <w:rFonts w:ascii="Arial" w:hAnsi="Arial" w:cs="Arial"/>
-        </w:rPr>
-      </w:pPr>
-      <w:r>
-        <w:rPr>
-          <w:rFonts w:ascii="Arial" w:hAnsi="Arial" w:cs="Arial"/>
-        </w:rPr>
-        <w:t>Si el tipo de equipo no tiene plantilla configurada, el sistema usa una plantilla genérica o impide continuar, según regla del negocio.</w:t>
-      </w:r>
-    </w:p>
-    <w:p>
-      <w:pPr>
-        <w:rPr>
-          <w:rFonts w:ascii="Arial" w:hAnsi="Arial" w:cs="Arial"/>
-        </w:rPr>
-      </w:pPr>
-      <w:r>
-        <w:rPr>
-          <w:rFonts w:ascii="Arial" w:hAnsi="Arial" w:cs="Arial"/>
-          <w:b/>
-          <w:bCs/>
-        </w:rPr>
-        <w:t>Postcondiciones:</w:t>
-      </w:r>
-    </w:p>
-    <w:p>
-      <w:pPr>
-        <w:numPr>
-          <w:ilvl w:val="0"/>
-          <w:numId w:val="21"/>
-        </w:numPr>
-        <w:rPr>
-          <w:rFonts w:ascii="Arial" w:hAnsi="Arial" w:cs="Arial"/>
-        </w:rPr>
-      </w:pPr>
-      <w:r>
-        <w:rPr>
-          <w:rFonts w:ascii="Arial" w:hAnsi="Arial" w:cs="Arial"/>
-        </w:rPr>
-        <w:t>Las especificaciones técnicas verificadas quedan registradas.</w:t>
-      </w:r>
-    </w:p>
-    <w:p>
-      <w:pPr>
-        <w:numPr>
-          <w:ilvl w:val="0"/>
-          <w:numId w:val="21"/>
-        </w:numPr>
-        <w:rPr>
-          <w:rFonts w:ascii="Arial" w:hAnsi="Arial" w:cs="Arial"/>
-        </w:rPr>
-      </w:pPr>
-      <w:r>
-        <w:rPr>
-          <w:rFonts w:ascii="Arial" w:hAnsi="Arial" w:cs="Arial"/>
-        </w:rPr>
-        <w:t>El expediente queda preparado para comparación.</w:t>
-      </w:r>
-    </w:p>
-    <w:p>
-      <w:pPr>
-        <w:jc w:val="center"/>
-        <w:rPr>
-          <w:rFonts w:ascii="Arial" w:hAnsi="Arial" w:cs="Arial"/>
-        </w:rPr>
-      </w:pPr>
-      <w:r>
-        <w:rPr>
-          <w:rFonts w:ascii="Arial" w:hAnsi="Arial" w:cs="Arial"/>
-        </w:rPr>
-        <w:lastRenderedPageBreak/>
-        <w:drawing>
-          <wp:inline distT="0" distB="0" distL="0" distR="0" wp14:anchorId="40F254D1" wp14:editId="39D21889">
-            <wp:extent cx="4321418" cy="3145471"/>
-            <wp:effectExtent l="0" t="0" r="3175" b="0"/>
-            <wp:docPr id="1291609367" name="Imagen 1"/>
-            <wp:cNvGraphicFramePr>
-              <a:graphicFrameLocks xmlns:a="http://schemas.openxmlformats.org/drawingml/2006/main" noChangeAspect="1"/>
-            </wp:cNvGraphicFramePr>
-            <a:graphic xmlns:a="http://schemas.openxmlformats.org/drawingml/2006/main">
-              <a:graphicData uri="http://schemas.openxmlformats.org/drawingml/2006/picture">
-                <pic:pic xmlns:pic="http://schemas.openxmlformats.org/drawingml/2006/picture">
-                  <pic:nvPicPr>
-                    <pic:cNvPr id="1291609367" name=""/>
-                    <pic:cNvPicPr/>
-                  </pic:nvPicPr>
-                  <pic:blipFill>
-                    <a:blip r:embed="rId9"/>
-                    <a:stretch>
-                      <a:fillRect/>
-                    </a:stretch>
-                  </pic:blipFill>
-                  <pic:spPr>
-                    <a:xfrm>
-                      <a:off x="0" y="0"/>
-                      <a:ext cx="4333703" cy="3154413"/>
-                    </a:xfrm>
-                    <a:prstGeom prst="rect">
-                      <a:avLst/>
-                    </a:prstGeom>
-                  </pic:spPr>
-                </pic:pic>
-              </a:graphicData>
-            </a:graphic>
-          </wp:inline>
-        </w:drawing>
-      </w:r>
-    </w:p>
-    <w:p>
-      <w:pPr>
-        <w:rPr>
-          <w:rFonts w:ascii="Arial" w:hAnsi="Arial" w:cs="Arial"/>
-        </w:rPr>
-      </w:pPr>
-    </w:p>
-    <w:p>
-      <w:pPr>
-        <w:pStyle w:val="Prrafodelista"/>
-        <w:numPr>
-          <w:ilvl w:val="0"/>
-          <w:numId w:val="5"/>
-        </w:numPr>
-        <w:rPr>
-          <w:rFonts w:ascii="Arial" w:hAnsi="Arial" w:cs="Arial"/>
-          <w:b/>
-          <w:bCs/>
-        </w:rPr>
-      </w:pPr>
-      <w:r>
-        <w:rPr>
-          <w:rFonts w:ascii="Arial" w:hAnsi="Arial" w:cs="Arial"/>
-          <w:b/>
-          <w:bCs/>
-        </w:rPr>
-        <w:t>Comparar contra referencia esperada</w:t>
-      </w:r>
-    </w:p>
-    <w:p>
-      <w:pPr>
-        <w:rPr>
-          <w:rFonts w:ascii="Arial" w:hAnsi="Arial" w:cs="Arial"/>
-        </w:rPr>
-      </w:pPr>
-      <w:r>
-        <w:rPr>
-          <w:rFonts w:ascii="Arial" w:hAnsi="Arial" w:cs="Arial"/>
-          <w:b/>
-          <w:bCs/>
-        </w:rPr>
-        <w:t>Objetivo:</w:t>
-      </w:r>
-      <w:r>
-        <w:rPr>
-          <w:rFonts w:ascii="Arial" w:hAnsi="Arial" w:cs="Arial"/>
-        </w:rPr>
-        <w:t xml:space="preserve"> detectar diferencias entre la especificación esperada, la documentación y la verificación real.</w:t>
-      </w:r>
-      <w:r>
-        <w:rPr>
-          <w:rFonts w:ascii="Arial" w:hAnsi="Arial" w:cs="Arial"/>
-        </w:rPr>
-        <w:br/>
-      </w:r>
-      <w:r>
-        <w:rPr>
-          <w:rFonts w:ascii="Arial" w:hAnsi="Arial" w:cs="Arial"/>
-          <w:b/>
-          <w:bCs/>
-        </w:rPr>
-        <w:t>Actor principal:</w:t>
-      </w:r>
-      <w:r>
-        <w:rPr>
-          <w:rFonts w:ascii="Arial" w:hAnsi="Arial" w:cs="Arial"/>
-        </w:rPr>
-        <w:t xml:space="preserve"> Inspector técnico.</w:t>
-      </w:r>
-    </w:p>
-    <w:p>
-      <w:pPr>
-        <w:rPr>
-          <w:rFonts w:ascii="Arial" w:hAnsi="Arial" w:cs="Arial"/>
-        </w:rPr>
-      </w:pPr>
-      <w:r>
-        <w:rPr>
-          <w:rFonts w:ascii="Arial" w:hAnsi="Arial" w:cs="Arial"/>
-          <w:b/>
-          <w:bCs/>
-        </w:rPr>
-        <w:t>Precondiciones:</w:t>
-      </w:r>
-    </w:p>
-    <w:p>
-      <w:pPr>
-        <w:numPr>
-          <w:ilvl w:val="0"/>
-          <w:numId w:val="22"/>
-        </w:numPr>
-        <w:rPr>
-          <w:rFonts w:ascii="Arial" w:hAnsi="Arial" w:cs="Arial"/>
-        </w:rPr>
-      </w:pPr>
-      <w:r>
-        <w:rPr>
-          <w:rFonts w:ascii="Arial" w:hAnsi="Arial" w:cs="Arial"/>
-        </w:rPr>
-        <w:t>Existe información esperada o de referencia.</w:t>
-      </w:r>
-    </w:p>
-    <w:p>
-      <w:pPr>
-        <w:numPr>
-          <w:ilvl w:val="0"/>
-          <w:numId w:val="22"/>
-        </w:numPr>
-        <w:rPr>
-          <w:rFonts w:ascii="Arial" w:hAnsi="Arial" w:cs="Arial"/>
-        </w:rPr>
-      </w:pPr>
-      <w:r>
-        <w:rPr>
-          <w:rFonts w:ascii="Arial" w:hAnsi="Arial" w:cs="Arial"/>
-        </w:rPr>
-        <w:t>La validación documental y la verificación técnica ya fueron registradas.</w:t>
-      </w:r>
-    </w:p>
-    <w:p>
-      <w:pPr>
-        <w:rPr>
-          <w:rFonts w:ascii="Arial" w:hAnsi="Arial" w:cs="Arial"/>
-        </w:rPr>
-      </w:pPr>
-      <w:r>
-        <w:rPr>
-          <w:rFonts w:ascii="Arial" w:hAnsi="Arial" w:cs="Arial"/>
-          <w:b/>
-          <w:bCs/>
-        </w:rPr>
-        <w:t>Flujo principal:</w:t>
-      </w:r>
-    </w:p>
-    <w:p>
-      <w:pPr>
-        <w:numPr>
-          <w:ilvl w:val="0"/>
-          <w:numId w:val="23"/>
-        </w:numPr>
-        <w:rPr>
-          <w:rFonts w:ascii="Arial" w:hAnsi="Arial" w:cs="Arial"/>
-        </w:rPr>
-      </w:pPr>
-      <w:r>
-        <w:rPr>
-          <w:rFonts w:ascii="Arial" w:hAnsi="Arial" w:cs="Arial"/>
-        </w:rPr>
-        <w:t>El inspector selecciona la opción “Comparar”.</w:t>
-      </w:r>
-    </w:p>
-    <w:p>
-      <w:pPr>
-        <w:numPr>
-          <w:ilvl w:val="0"/>
-          <w:numId w:val="23"/>
-        </w:numPr>
-        <w:rPr>
-          <w:rFonts w:ascii="Arial" w:hAnsi="Arial" w:cs="Arial"/>
-        </w:rPr>
-      </w:pPr>
-      <w:r>
-        <w:rPr>
-          <w:rFonts w:ascii="Arial" w:hAnsi="Arial" w:cs="Arial"/>
-        </w:rPr>
-        <w:t>El sistema toma como base la referencia esperada del equipo.</w:t>
-      </w:r>
-    </w:p>
-    <w:p>
-      <w:pPr>
-        <w:numPr>
-          <w:ilvl w:val="0"/>
-          <w:numId w:val="23"/>
-        </w:numPr>
-        <w:rPr>
-          <w:rFonts w:ascii="Arial" w:hAnsi="Arial" w:cs="Arial"/>
-        </w:rPr>
-      </w:pPr>
-      <w:r>
-        <w:rPr>
-          <w:rFonts w:ascii="Arial" w:hAnsi="Arial" w:cs="Arial"/>
-        </w:rPr>
-        <w:t>El sistema compara la referencia esperada con los datos documentales.</w:t>
-      </w:r>
-    </w:p>
-    <w:p>
-      <w:pPr>
-        <w:numPr>
-          <w:ilvl w:val="0"/>
-          <w:numId w:val="23"/>
-        </w:numPr>
-        <w:rPr>
-          <w:rFonts w:ascii="Arial" w:hAnsi="Arial" w:cs="Arial"/>
-        </w:rPr>
-      </w:pPr>
-      <w:r>
-        <w:rPr>
-          <w:rFonts w:ascii="Arial" w:hAnsi="Arial" w:cs="Arial"/>
-        </w:rPr>
-        <w:t>El sistema compara la referencia esperada con la verificación técnica real.</w:t>
-      </w:r>
-    </w:p>
-    <w:p>
-      <w:pPr>
-        <w:numPr>
-          <w:ilvl w:val="0"/>
-          <w:numId w:val="23"/>
-        </w:numPr>
-        <w:rPr>
-          <w:rFonts w:ascii="Arial" w:hAnsi="Arial" w:cs="Arial"/>
-        </w:rPr>
-      </w:pPr>
-      <w:r>
-        <w:rPr>
-          <w:rFonts w:ascii="Arial" w:hAnsi="Arial" w:cs="Arial"/>
-        </w:rPr>
-        <w:t>El sistema identifica coincidencias, diferencias y campos pendientes.</w:t>
-      </w:r>
-    </w:p>
-    <w:p>
-      <w:pPr>
-        <w:numPr>
-          <w:ilvl w:val="0"/>
-          <w:numId w:val="23"/>
-        </w:numPr>
-        <w:rPr>
-          <w:rFonts w:ascii="Arial" w:hAnsi="Arial" w:cs="Arial"/>
-        </w:rPr>
-      </w:pPr>
-      <w:r>
-        <w:rPr>
-          <w:rFonts w:ascii="Arial" w:hAnsi="Arial" w:cs="Arial"/>
-        </w:rPr>
-        <w:t>El sistema muestra un resumen de conformidad por atributo.</w:t>
-      </w:r>
-    </w:p>
-    <w:p>
-      <w:pPr>
-        <w:rPr>
-          <w:rFonts w:ascii="Arial" w:hAnsi="Arial" w:cs="Arial"/>
-        </w:rPr>
-      </w:pPr>
-      <w:r>
-        <w:rPr>
-          <w:rFonts w:ascii="Arial" w:hAnsi="Arial" w:cs="Arial"/>
-          <w:b/>
-          <w:bCs/>
-        </w:rPr>
-        <w:t>Flujos alternos:</w:t>
-      </w:r>
-    </w:p>
-    <w:p>
-      <w:pPr>
-        <w:numPr>
-          <w:ilvl w:val="0"/>
-          <w:numId w:val="24"/>
-        </w:numPr>
-        <w:rPr>
-          <w:rFonts w:ascii="Arial" w:hAnsi="Arial" w:cs="Arial"/>
-        </w:rPr>
-      </w:pPr>
-      <w:r>
-        <w:rPr>
-          <w:rFonts w:ascii="Arial" w:hAnsi="Arial" w:cs="Arial"/>
-        </w:rPr>
-        <w:lastRenderedPageBreak/>
-        <w:t>Si no existe referencia esperada, el sistema permite comparar solo contra la documentación.</w:t>
-      </w:r>
-    </w:p>
-    <w:p>
-      <w:pPr>
-        <w:numPr>
-          <w:ilvl w:val="0"/>
-          <w:numId w:val="24"/>
-        </w:numPr>
-        <w:rPr>
-          <w:rFonts w:ascii="Arial" w:hAnsi="Arial" w:cs="Arial"/>
-        </w:rPr>
-      </w:pPr>
-      <w:r>
-        <w:rPr>
-          <w:rFonts w:ascii="Arial" w:hAnsi="Arial" w:cs="Arial"/>
-        </w:rPr>
-        <w:t>Si hay campos pendientes de verificación, el sistema marca el resultado como incompleto.</w:t>
-      </w:r>
-    </w:p>
-    <w:p>
-      <w:pPr>
-        <w:rPr>
-          <w:rFonts w:ascii="Arial" w:hAnsi="Arial" w:cs="Arial"/>
-        </w:rPr>
-      </w:pPr>
-      <w:r>
-        <w:rPr>
-          <w:rFonts w:ascii="Arial" w:hAnsi="Arial" w:cs="Arial"/>
-          <w:b/>
-          <w:bCs/>
-        </w:rPr>
-        <w:t>Postcondiciones:</w:t>
-      </w:r>
-    </w:p>
-    <w:p>
-      <w:pPr>
-        <w:numPr>
-          <w:ilvl w:val="0"/>
-          <w:numId w:val="25"/>
-        </w:numPr>
-        <w:rPr>
-          <w:rFonts w:ascii="Arial" w:hAnsi="Arial" w:cs="Arial"/>
-        </w:rPr>
-      </w:pPr>
-      <w:r>
-        <w:rPr>
-          <w:rFonts w:ascii="Arial" w:hAnsi="Arial" w:cs="Arial"/>
-        </w:rPr>
-        <w:t>El sistema genera un resultado comparativo.</w:t>
-      </w:r>
-    </w:p>
-    <w:p>
-      <w:pPr>
-        <w:numPr>
-          <w:ilvl w:val="0"/>
-          <w:numId w:val="25"/>
-        </w:numPr>
-        <w:rPr>
-          <w:rFonts w:ascii="Arial" w:hAnsi="Arial" w:cs="Arial"/>
-        </w:rPr>
-      </w:pPr>
-      <w:r>
-        <w:rPr>
-          <w:rFonts w:ascii="Arial" w:hAnsi="Arial" w:cs="Arial"/>
-        </w:rPr>
-        <w:t>El expediente contiene discrepancias identificadas por campo o criterio.</w:t>
-      </w:r>
-    </w:p>
-    <w:p>
-      <w:pPr>
-        <w:jc w:val="center"/>
-        <w:rPr>
-          <w:rFonts w:ascii="Arial" w:hAnsi="Arial" w:cs="Arial"/>
-        </w:rPr>
-      </w:pPr>
-      <w:r>
-        <w:rPr>
-          <w:rFonts w:ascii="Arial" w:hAnsi="Arial" w:cs="Arial"/>
-        </w:rPr>
-        <w:drawing>
-          <wp:inline distT="0" distB="0" distL="0" distR="0" wp14:anchorId="2737FC40" wp14:editId="1BC2D6EF">
-            <wp:extent cx="4939679" cy="3567546"/>
-            <wp:effectExtent l="0" t="0" r="0" b="0"/>
-            <wp:docPr id="245140652" name="Imagen 1"/>
-            <wp:cNvGraphicFramePr>
-              <a:graphicFrameLocks xmlns:a="http://schemas.openxmlformats.org/drawingml/2006/main" noChangeAspect="1"/>
-            </wp:cNvGraphicFramePr>
-            <a:graphic xmlns:a="http://schemas.openxmlformats.org/drawingml/2006/main">
-              <a:graphicData uri="http://schemas.openxmlformats.org/drawingml/2006/picture">
-                <pic:pic xmlns:pic="http://schemas.openxmlformats.org/drawingml/2006/picture">
-                  <pic:nvPicPr>
-                    <pic:cNvPr id="245140652" name=""/>
-                    <pic:cNvPicPr/>
-                  </pic:nvPicPr>
-                  <pic:blipFill>
-                    <a:blip r:embed="rId10"/>
-                    <a:stretch>
-                      <a:fillRect/>
-                    </a:stretch>
-                  </pic:blipFill>
-                  <pic:spPr>
-                    <a:xfrm>
-                      <a:off x="0" y="0"/>
-                      <a:ext cx="4945474" cy="3571731"/>
-                    </a:xfrm>
-                    <a:prstGeom prst="rect">
-                      <a:avLst/>
-                    </a:prstGeom>
-                  </pic:spPr>
-                </pic:pic>
-              </a:graphicData>
-            </a:graphic>
-          </wp:inline>
-        </w:drawing>
-      </w:r>
-    </w:p>
-    <w:p>
-      <w:pPr>
-        <w:rPr>
-          <w:rFonts w:ascii="Arial" w:hAnsi="Arial" w:cs="Arial"/>
-        </w:rPr>
-      </w:pPr>
-    </w:p>
-    <w:p>
-      <w:pPr>
-        <w:pStyle w:val="Prrafodelista"/>
-        <w:numPr>
-          <w:ilvl w:val="0"/>
-          <w:numId w:val="23"/>
-        </w:numPr>
-        <w:rPr>
-          <w:rFonts w:ascii="Arial" w:hAnsi="Arial" w:cs="Arial"/>
-          <w:b/>
-          <w:bCs/>
-        </w:rPr>
-      </w:pPr>
-      <w:r>
-        <w:rPr>
-          <w:rFonts w:ascii="Arial" w:hAnsi="Arial" w:cs="Arial"/>
-          <w:b/>
-          <w:bCs/>
-        </w:rPr>
-        <w:t>Registrar hallazgos</w:t>
-      </w:r>
-    </w:p>
-    <w:p>
-      <w:pPr>
-        <w:rPr>
-          <w:rFonts w:ascii="Arial" w:hAnsi="Arial" w:cs="Arial"/>
-        </w:rPr>
-      </w:pPr>
-      <w:r>
-        <w:rPr>
-          <w:rFonts w:ascii="Arial" w:hAnsi="Arial" w:cs="Arial"/>
-          <w:b/>
-          <w:bCs/>
-        </w:rPr>
-        <w:t>Objetivo:</w:t>
-      </w:r>
-      <w:r>
-        <w:rPr>
-          <w:rFonts w:ascii="Arial" w:hAnsi="Arial" w:cs="Arial"/>
-        </w:rPr>
-        <w:t xml:space="preserve"> documentar observaciones, defectos o no conformidades detectadas durante la inspección.</w:t>
-      </w:r>
-      <w:r>
-        <w:rPr>
-          <w:rFonts w:ascii="Arial" w:hAnsi="Arial" w:cs="Arial"/>
-        </w:rPr>
-        <w:br/>
-      </w:r>
-      <w:r>
-        <w:rPr>
-          <w:rFonts w:ascii="Arial" w:hAnsi="Arial" w:cs="Arial"/>
-          <w:b/>
-          <w:bCs/>
-        </w:rPr>
-        <w:t>Actor principal:</w:t>
-      </w:r>
-      <w:r>
-        <w:rPr>
-          <w:rFonts w:ascii="Arial" w:hAnsi="Arial" w:cs="Arial"/>
-        </w:rPr>
-        <w:t xml:space="preserve"> Inspector técnico.</w:t>
-      </w:r>
-    </w:p>
-    <w:p>
-      <w:pPr>
-        <w:rPr>
-          <w:rFonts w:ascii="Arial" w:hAnsi="Arial" w:cs="Arial"/>
-        </w:rPr>
-      </w:pPr>
-      <w:r>
-        <w:rPr>
-          <w:rFonts w:ascii="Arial" w:hAnsi="Arial" w:cs="Arial"/>
-          <w:b/>
-          <w:bCs/>
-        </w:rPr>
-        <w:t>Precondiciones:</w:t>
-      </w:r>
-    </w:p>
-    <w:p>
-      <w:pPr>
-        <w:numPr>
-          <w:ilvl w:val="0"/>
-          <w:numId w:val="26"/>
-        </w:numPr>
-        <w:rPr>
-          <w:rFonts w:ascii="Arial" w:hAnsi="Arial" w:cs="Arial"/>
-        </w:rPr>
-      </w:pPr>
-      <w:r>
-        <w:rPr>
-          <w:rFonts w:ascii="Arial" w:hAnsi="Arial" w:cs="Arial"/>
-        </w:rPr>
-        <w:t>Existe expediente activo.</w:t>
-      </w:r>
-    </w:p>
-    <w:p>
-      <w:pPr>
-        <w:numPr>
-          <w:ilvl w:val="0"/>
-          <w:numId w:val="26"/>
-        </w:numPr>
-        <w:rPr>
-          <w:rFonts w:ascii="Arial" w:hAnsi="Arial" w:cs="Arial"/>
-        </w:rPr>
-      </w:pPr>
-      <w:r>
-        <w:rPr>
-          <w:rFonts w:ascii="Arial" w:hAnsi="Arial" w:cs="Arial"/>
-        </w:rPr>
-        <w:t>Ya se realizó al menos una revisión documental, física o técnica.</w:t>
-      </w:r>
-    </w:p>
-    <w:p>
-      <w:pPr>
-        <w:rPr>
-          <w:rFonts w:ascii="Arial" w:hAnsi="Arial" w:cs="Arial"/>
-        </w:rPr>
-      </w:pPr>
-      <w:r>
-        <w:rPr>
-          <w:rFonts w:ascii="Arial" w:hAnsi="Arial" w:cs="Arial"/>
-          <w:b/>
-          <w:bCs/>
-        </w:rPr>
-        <w:t>Flujo principal:</w:t>
-      </w:r>
-    </w:p>
-    <w:p>
-      <w:pPr>
-        <w:numPr>
-          <w:ilvl w:val="0"/>
-          <w:numId w:val="27"/>
-        </w:numPr>
-        <w:rPr>
-          <w:rFonts w:ascii="Arial" w:hAnsi="Arial" w:cs="Arial"/>
-        </w:rPr>
-      </w:pPr>
-      <w:r>
-        <w:rPr>
-          <w:rFonts w:ascii="Arial" w:hAnsi="Arial" w:cs="Arial"/>
-        </w:rPr>
-        <w:lastRenderedPageBreak/>
-        <w:t>El inspector accede a la sección de hallazgos.</w:t>
-      </w:r>
-    </w:p>
-    <w:p>
-      <w:pPr>
-        <w:numPr>
-          <w:ilvl w:val="0"/>
-          <w:numId w:val="27"/>
-        </w:numPr>
-        <w:rPr>
-          <w:rFonts w:ascii="Arial" w:hAnsi="Arial" w:cs="Arial"/>
-        </w:rPr>
-      </w:pPr>
-      <w:r>
-        <w:rPr>
-          <w:rFonts w:ascii="Arial" w:hAnsi="Arial" w:cs="Arial"/>
-        </w:rPr>
-        <w:t>El sistema muestra formulario para registrar tipo, descripción, severidad y origen del hallazgo.</w:t>
-      </w:r>
-    </w:p>
-    <w:p>
-      <w:pPr>
-        <w:numPr>
-          <w:ilvl w:val="0"/>
-          <w:numId w:val="27"/>
-        </w:numPr>
-        <w:rPr>
-          <w:rFonts w:ascii="Arial" w:hAnsi="Arial" w:cs="Arial"/>
-        </w:rPr>
-      </w:pPr>
-      <w:r>
-        <w:rPr>
-          <w:rFonts w:ascii="Arial" w:hAnsi="Arial" w:cs="Arial"/>
-        </w:rPr>
-        <w:t xml:space="preserve">El inspector clasifica el hallazgo, por </w:t>
-      </w:r>
-      <w:proofErr w:type="gramStart"/>
-      <w:r>
-        <w:rPr>
-          <w:rFonts w:ascii="Arial" w:hAnsi="Arial" w:cs="Arial"/>
-        </w:rPr>
-        <w:t>ejemplo</w:t>
-      </w:r>
-      <w:proofErr w:type="gramEnd"/>
-      <w:r>
-        <w:rPr>
-          <w:rFonts w:ascii="Arial" w:hAnsi="Arial" w:cs="Arial"/>
-        </w:rPr>
-        <w:t xml:space="preserve"> documental, físico, técnico o accesorio faltante.</w:t>
-      </w:r>
-    </w:p>
-    <w:p>
-      <w:pPr>
-        <w:numPr>
-          <w:ilvl w:val="0"/>
-          <w:numId w:val="27"/>
-        </w:numPr>
-        <w:rPr>
-          <w:rFonts w:ascii="Arial" w:hAnsi="Arial" w:cs="Arial"/>
-        </w:rPr>
-      </w:pPr>
-      <w:r>
-        <w:rPr>
-          <w:rFonts w:ascii="Arial" w:hAnsi="Arial" w:cs="Arial"/>
-        </w:rPr>
-        <w:t>El inspector redacta el detalle del hallazgo.</w:t>
-      </w:r>
-    </w:p>
-    <w:p>
-      <w:pPr>
-        <w:numPr>
-          <w:ilvl w:val="0"/>
-          <w:numId w:val="27"/>
-        </w:numPr>
-        <w:rPr>
-          <w:rFonts w:ascii="Arial" w:hAnsi="Arial" w:cs="Arial"/>
-        </w:rPr>
-      </w:pPr>
-      <w:r>
-        <w:rPr>
-          <w:rFonts w:ascii="Arial" w:hAnsi="Arial" w:cs="Arial"/>
-        </w:rPr>
-        <w:t>El sistema vincula el hallazgo con el paso de inspección correspondiente.</w:t>
-      </w:r>
-    </w:p>
-    <w:p>
-      <w:pPr>
-        <w:numPr>
-          <w:ilvl w:val="0"/>
-          <w:numId w:val="27"/>
-        </w:numPr>
-        <w:rPr>
-          <w:rFonts w:ascii="Arial" w:hAnsi="Arial" w:cs="Arial"/>
-        </w:rPr>
-      </w:pPr>
-      <w:r>
-        <w:rPr>
-          <w:rFonts w:ascii="Arial" w:hAnsi="Arial" w:cs="Arial"/>
-        </w:rPr>
-        <w:t>El inspector guarda el hallazgo.</w:t>
-      </w:r>
-    </w:p>
-    <w:p>
-      <w:pPr>
-        <w:rPr>
-          <w:rFonts w:ascii="Arial" w:hAnsi="Arial" w:cs="Arial"/>
-        </w:rPr>
-      </w:pPr>
-      <w:r>
-        <w:rPr>
-          <w:rFonts w:ascii="Arial" w:hAnsi="Arial" w:cs="Arial"/>
-          <w:b/>
-          <w:bCs/>
-        </w:rPr>
-        <w:t>Flujos alternos:</w:t>
-      </w:r>
-    </w:p>
-    <w:p>
-      <w:pPr>
-        <w:numPr>
-          <w:ilvl w:val="0"/>
-          <w:numId w:val="28"/>
-        </w:numPr>
-        <w:rPr>
-          <w:rFonts w:ascii="Arial" w:hAnsi="Arial" w:cs="Arial"/>
-        </w:rPr>
-      </w:pPr>
-      <w:r>
-        <w:rPr>
-          <w:rFonts w:ascii="Arial" w:hAnsi="Arial" w:cs="Arial"/>
-        </w:rPr>
-        <w:t>Si el hallazgo es crítico, el sistema puede marcar la inspección como candidata a retención o rechazo.</w:t>
-      </w:r>
-    </w:p>
-    <w:p>
-      <w:pPr>
-        <w:numPr>
-          <w:ilvl w:val="0"/>
-          <w:numId w:val="28"/>
-        </w:numPr>
-        <w:rPr>
-          <w:rFonts w:ascii="Arial" w:hAnsi="Arial" w:cs="Arial"/>
-        </w:rPr>
-      </w:pPr>
-      <w:r>
-        <w:rPr>
-          <w:rFonts w:ascii="Arial" w:hAnsi="Arial" w:cs="Arial"/>
-        </w:rPr>
-        <w:t>Si no hay hallazgos, el sistema permite continuar sin registros adicionales.</w:t>
-      </w:r>
-    </w:p>
-    <w:p>
-      <w:pPr>
-        <w:rPr>
-          <w:rFonts w:ascii="Arial" w:hAnsi="Arial" w:cs="Arial"/>
-        </w:rPr>
-      </w:pPr>
-      <w:r>
-        <w:rPr>
-          <w:rFonts w:ascii="Arial" w:hAnsi="Arial" w:cs="Arial"/>
-          <w:b/>
-          <w:bCs/>
-        </w:rPr>
-        <w:t>Postcondiciones:</w:t>
-      </w:r>
-    </w:p>
-    <w:p>
-      <w:pPr>
-        <w:numPr>
-          <w:ilvl w:val="0"/>
-          <w:numId w:val="29"/>
-        </w:numPr>
-        <w:rPr>
-          <w:rFonts w:ascii="Arial" w:hAnsi="Arial" w:cs="Arial"/>
-        </w:rPr>
-      </w:pPr>
-      <w:r>
-        <w:rPr>
-          <w:rFonts w:ascii="Arial" w:hAnsi="Arial" w:cs="Arial"/>
-        </w:rPr>
-        <w:t>Los hallazgos quedan registrados y trazables.</w:t>
-      </w:r>
-    </w:p>
-    <w:p>
-      <w:pPr>
-        <w:numPr>
-          <w:ilvl w:val="0"/>
-          <w:numId w:val="29"/>
-        </w:numPr>
-        <w:rPr>
-          <w:rFonts w:ascii="Arial" w:hAnsi="Arial" w:cs="Arial"/>
-        </w:rPr>
-      </w:pPr>
-      <w:r>
-        <w:rPr>
-          <w:rFonts w:ascii="Arial" w:hAnsi="Arial" w:cs="Arial"/>
-        </w:rPr>
-        <w:t>El expediente refleja incidencias detectadas.</w:t>
-      </w:r>
-    </w:p>
-    <w:p>
-      <w:pPr>
-        <w:jc w:val="center"/>
-        <w:rPr>
-          <w:rFonts w:ascii="Arial" w:hAnsi="Arial" w:cs="Arial"/>
-        </w:rPr>
-      </w:pPr>
-      <w:r>
-        <w:rPr>
-          <w:rFonts w:ascii="Arial" w:hAnsi="Arial" w:cs="Arial"/>
-        </w:rPr>
-        <w:drawing>
-          <wp:inline distT="0" distB="0" distL="0" distR="0" wp14:anchorId="1D70C76A" wp14:editId="07DD6967">
-            <wp:extent cx="4336472" cy="3886535"/>
-            <wp:effectExtent l="0" t="0" r="6985" b="0"/>
-            <wp:docPr id="885026296" name="Imagen 1"/>
-            <wp:cNvGraphicFramePr>
-              <a:graphicFrameLocks xmlns:a="http://schemas.openxmlformats.org/drawingml/2006/main" noChangeAspect="1"/>
-            </wp:cNvGraphicFramePr>
-            <a:graphic xmlns:a="http://schemas.openxmlformats.org/drawingml/2006/main">
-              <a:graphicData uri="http://schemas.openxmlformats.org/drawingml/2006/picture">
-                <pic:pic xmlns:pic="http://schemas.openxmlformats.org/drawingml/2006/picture">
-                  <pic:nvPicPr>
-                    <pic:cNvPr id="885026296" name=""/>
-                    <pic:cNvPicPr/>
-                  </pic:nvPicPr>
-                  <pic:blipFill>
-                    <a:blip r:embed="rId11"/>
-                    <a:stretch>
-                      <a:fillRect/>
-                    </a:stretch>
-                  </pic:blipFill>
-                  <pic:spPr>
-                    <a:xfrm>
-                      <a:off x="0" y="0"/>
-                      <a:ext cx="4343899" cy="3893192"/>
-                    </a:xfrm>
-                    <a:prstGeom prst="rect">
-                      <a:avLst/>
-                    </a:prstGeom>
-                  </pic:spPr>
-                </pic:pic>
-              </a:graphicData>
-            </a:graphic>
-          </wp:inline>
-        </w:drawing>
-      </w:r>
-    </w:p>
-    <w:p>
-      <w:pPr>
-        <w:pStyle w:val="Prrafodelista"/>
-        <w:numPr>
-          <w:ilvl w:val="0"/>
-          <w:numId w:val="23"/>
-        </w:numPr>
-        <w:rPr>
-          <w:rFonts w:ascii="Arial" w:hAnsi="Arial" w:cs="Arial"/>
-          <w:b/>
-          <w:bCs/>
-        </w:rPr>
-      </w:pPr>
-      <w:r>
-        <w:rPr>
-          <w:rFonts w:ascii="Arial" w:hAnsi="Arial" w:cs="Arial"/>
-          <w:b/>
-          <w:bCs/>
-        </w:rPr>
-        <w:lastRenderedPageBreak/>
-        <w:t>Adjuntar evidencia</w:t>
-      </w:r>
-    </w:p>
-    <w:p>
-      <w:pPr>
-        <w:rPr>
-          <w:rFonts w:ascii="Arial" w:hAnsi="Arial" w:cs="Arial"/>
-        </w:rPr>
-      </w:pPr>
-      <w:r>
-        <w:rPr>
-          <w:rFonts w:ascii="Arial" w:hAnsi="Arial" w:cs="Arial"/>
-          <w:b/>
-          <w:bCs/>
-        </w:rPr>
-        <w:t>Objetivo:</w:t>
-      </w:r>
-      <w:r>
-        <w:rPr>
-          <w:rFonts w:ascii="Arial" w:hAnsi="Arial" w:cs="Arial"/>
-        </w:rPr>
-        <w:t xml:space="preserve"> respaldar la inspección y los hallazgos con archivos de soporte.</w:t>
-      </w:r>
-      <w:r>
-        <w:rPr>
-          <w:rFonts w:ascii="Arial" w:hAnsi="Arial" w:cs="Arial"/>
-        </w:rPr>
-        <w:br/>
-      </w:r>
-      <w:r>
-        <w:rPr>
-          <w:rFonts w:ascii="Arial" w:hAnsi="Arial" w:cs="Arial"/>
-          <w:b/>
-          <w:bCs/>
-        </w:rPr>
-        <w:t>Actor principal:</w:t>
-      </w:r>
-      <w:r>
-        <w:rPr>
-          <w:rFonts w:ascii="Arial" w:hAnsi="Arial" w:cs="Arial"/>
-        </w:rPr>
-        <w:t xml:space="preserve"> Inspector técnico.</w:t>
-      </w:r>
-    </w:p>
-    <w:p>
-      <w:pPr>
-        <w:rPr>
-          <w:rFonts w:ascii="Arial" w:hAnsi="Arial" w:cs="Arial"/>
-        </w:rPr>
-      </w:pPr>
-      <w:r>
-        <w:rPr>
-          <w:rFonts w:ascii="Arial" w:hAnsi="Arial" w:cs="Arial"/>
-          <w:b/>
-          <w:bCs/>
-        </w:rPr>
-        <w:t>Precondiciones:</w:t>
-      </w:r>
-    </w:p>
-    <w:p>
-      <w:pPr>
-        <w:numPr>
-          <w:ilvl w:val="0"/>
-          <w:numId w:val="30"/>
-        </w:numPr>
-        <w:rPr>
-          <w:rFonts w:ascii="Arial" w:hAnsi="Arial" w:cs="Arial"/>
-        </w:rPr>
-      </w:pPr>
-      <w:r>
-        <w:rPr>
-          <w:rFonts w:ascii="Arial" w:hAnsi="Arial" w:cs="Arial"/>
-        </w:rPr>
-        <w:t>Existe expediente activo.</w:t>
-      </w:r>
-    </w:p>
-    <w:p>
-      <w:pPr>
-        <w:numPr>
-          <w:ilvl w:val="0"/>
-          <w:numId w:val="30"/>
-        </w:numPr>
-        <w:rPr>
-          <w:rFonts w:ascii="Arial" w:hAnsi="Arial" w:cs="Arial"/>
-        </w:rPr>
-      </w:pPr>
-      <w:r>
-        <w:rPr>
-          <w:rFonts w:ascii="Arial" w:hAnsi="Arial" w:cs="Arial"/>
-        </w:rPr>
-        <w:t>El usuario tiene permiso para cargar archivos.</w:t>
-      </w:r>
-    </w:p>
-    <w:p>
-      <w:pPr>
-        <w:rPr>
-          <w:rFonts w:ascii="Arial" w:hAnsi="Arial" w:cs="Arial"/>
-        </w:rPr>
-      </w:pPr>
-      <w:r>
-        <w:rPr>
-          <w:rFonts w:ascii="Arial" w:hAnsi="Arial" w:cs="Arial"/>
-          <w:b/>
-          <w:bCs/>
-        </w:rPr>
-        <w:t>Flujo principal:</w:t>
-      </w:r>
-    </w:p>
-    <w:p>
-      <w:pPr>
-        <w:numPr>
-          <w:ilvl w:val="0"/>
-          <w:numId w:val="31"/>
-        </w:numPr>
-        <w:rPr>
-          <w:rFonts w:ascii="Arial" w:hAnsi="Arial" w:cs="Arial"/>
-        </w:rPr>
-      </w:pPr>
-      <w:r>
-        <w:rPr>
-          <w:rFonts w:ascii="Arial" w:hAnsi="Arial" w:cs="Arial"/>
-        </w:rPr>
-        <w:t>El inspector abre la sección de evidencia.</w:t>
-      </w:r>
-    </w:p>
-    <w:p>
-      <w:pPr>
-        <w:numPr>
-          <w:ilvl w:val="0"/>
-          <w:numId w:val="31"/>
-        </w:numPr>
-        <w:rPr>
-          <w:rFonts w:ascii="Arial" w:hAnsi="Arial" w:cs="Arial"/>
-        </w:rPr>
-      </w:pPr>
-      <w:r>
-        <w:rPr>
-          <w:rFonts w:ascii="Arial" w:hAnsi="Arial" w:cs="Arial"/>
-        </w:rPr>
-        <w:t>El sistema permite cargar imágenes, PDF, capturas, hojas técnicas u otros archivos.</w:t>
-      </w:r>
-    </w:p>
-    <w:p>
-      <w:pPr>
-        <w:numPr>
-          <w:ilvl w:val="0"/>
-          <w:numId w:val="31"/>
-        </w:numPr>
-        <w:rPr>
-          <w:rFonts w:ascii="Arial" w:hAnsi="Arial" w:cs="Arial"/>
-        </w:rPr>
-      </w:pPr>
-      <w:r>
-        <w:rPr>
-          <w:rFonts w:ascii="Arial" w:hAnsi="Arial" w:cs="Arial"/>
-        </w:rPr>
-        <w:t>El inspector selecciona el archivo.</w:t>
-      </w:r>
-    </w:p>
-    <w:p>
-      <w:pPr>
-        <w:numPr>
-          <w:ilvl w:val="0"/>
-          <w:numId w:val="31"/>
-        </w:numPr>
-        <w:rPr>
-          <w:rFonts w:ascii="Arial" w:hAnsi="Arial" w:cs="Arial"/>
-        </w:rPr>
-      </w:pPr>
-      <w:r>
-        <w:rPr>
-          <w:rFonts w:ascii="Arial" w:hAnsi="Arial" w:cs="Arial"/>
-        </w:rPr>
-        <w:t>El sistema valida formato y tamaño permitido.</w:t>
-      </w:r>
-    </w:p>
-    <w:p>
-      <w:pPr>
-        <w:numPr>
-          <w:ilvl w:val="0"/>
-          <w:numId w:val="31"/>
-        </w:numPr>
-        <w:rPr>
-          <w:rFonts w:ascii="Arial" w:hAnsi="Arial" w:cs="Arial"/>
-        </w:rPr>
-      </w:pPr>
-      <w:r>
-        <w:rPr>
-          <w:rFonts w:ascii="Arial" w:hAnsi="Arial" w:cs="Arial"/>
-        </w:rPr>
-        <w:t>El inspector asocia la evidencia a un hallazgo o a una etapa de inspección.</w:t>
-      </w:r>
-    </w:p>
-    <w:p>
-      <w:pPr>
-        <w:numPr>
-          <w:ilvl w:val="0"/>
-          <w:numId w:val="31"/>
-        </w:numPr>
-        <w:rPr>
-          <w:rFonts w:ascii="Arial" w:hAnsi="Arial" w:cs="Arial"/>
-        </w:rPr>
-      </w:pPr>
-      <w:r>
-        <w:rPr>
-          <w:rFonts w:ascii="Arial" w:hAnsi="Arial" w:cs="Arial"/>
-        </w:rPr>
-        <w:t>El sistema almacena la evidencia y la vincula al expediente.</w:t>
-      </w:r>
-    </w:p>
-    <w:p>
-      <w:pPr>
-        <w:rPr>
-          <w:rFonts w:ascii="Arial" w:hAnsi="Arial" w:cs="Arial"/>
-        </w:rPr>
-      </w:pPr>
-      <w:r>
-        <w:rPr>
-          <w:rFonts w:ascii="Arial" w:hAnsi="Arial" w:cs="Arial"/>
-          <w:b/>
-          <w:bCs/>
-        </w:rPr>
-        <w:t>Flujos alternos:</w:t>
-      </w:r>
-    </w:p>
-    <w:p>
-      <w:pPr>
-        <w:numPr>
-          <w:ilvl w:val="0"/>
-          <w:numId w:val="32"/>
-        </w:numPr>
-        <w:rPr>
-          <w:rFonts w:ascii="Arial" w:hAnsi="Arial" w:cs="Arial"/>
-        </w:rPr>
-      </w:pPr>
-      <w:r>
-        <w:rPr>
-          <w:rFonts w:ascii="Arial" w:hAnsi="Arial" w:cs="Arial"/>
-        </w:rPr>
-        <w:t>Si el archivo excede el tamaño permitido, el sistema rechaza la carga.</w:t>
-      </w:r>
-    </w:p>
-    <w:p>
-      <w:pPr>
-        <w:numPr>
-          <w:ilvl w:val="0"/>
-          <w:numId w:val="32"/>
-        </w:numPr>
-        <w:rPr>
-          <w:rFonts w:ascii="Arial" w:hAnsi="Arial" w:cs="Arial"/>
-        </w:rPr>
-      </w:pPr>
-      <w:r>
-        <w:rPr>
-          <w:rFonts w:ascii="Arial" w:hAnsi="Arial" w:cs="Arial"/>
-        </w:rPr>
-        <w:t>Si la evidencia no está asociada a un hallazgo, puede quedar asociada al expediente general.</w:t>
-      </w:r>
-    </w:p>
-    <w:p>
-      <w:pPr>
-        <w:rPr>
-          <w:rFonts w:ascii="Arial" w:hAnsi="Arial" w:cs="Arial"/>
-        </w:rPr>
-      </w:pPr>
-      <w:r>
-        <w:rPr>
-          <w:rFonts w:ascii="Arial" w:hAnsi="Arial" w:cs="Arial"/>
-          <w:b/>
-          <w:bCs/>
-        </w:rPr>
-        <w:t>Postcondiciones:</w:t>
-      </w:r>
-    </w:p>
-    <w:p>
-      <w:pPr>
-        <w:numPr>
-          <w:ilvl w:val="0"/>
-          <w:numId w:val="33"/>
-        </w:numPr>
-        <w:rPr>
-          <w:rFonts w:ascii="Arial" w:hAnsi="Arial" w:cs="Arial"/>
-        </w:rPr>
-      </w:pPr>
-      <w:r>
-        <w:rPr>
-          <w:rFonts w:ascii="Arial" w:hAnsi="Arial" w:cs="Arial"/>
-        </w:rPr>
-        <w:t>La evidencia queda disponible para consulta.</w:t>
-      </w:r>
-    </w:p>
-    <w:p>
-      <w:pPr>
-        <w:numPr>
-          <w:ilvl w:val="0"/>
-          <w:numId w:val="33"/>
-        </w:numPr>
-        <w:rPr>
-          <w:rFonts w:ascii="Arial" w:hAnsi="Arial" w:cs="Arial"/>
-        </w:rPr>
-      </w:pPr>
-      <w:r>
-        <w:rPr>
-          <w:rFonts w:ascii="Arial" w:hAnsi="Arial" w:cs="Arial"/>
-        </w:rPr>
-        <w:t>El expediente mantiene soporte documental y visual.</w:t>
-      </w:r>
-    </w:p>
-    <w:p>
-      <w:pPr>
-        <w:jc w:val="center"/>
-        <w:rPr>
-          <w:rFonts w:ascii="Arial" w:hAnsi="Arial" w:cs="Arial"/>
-        </w:rPr>
-      </w:pPr>
-      <w:r>
-        <w:rPr>
-          <w:rFonts w:ascii="Arial" w:hAnsi="Arial" w:cs="Arial"/>
-        </w:rPr>
-        <w:lastRenderedPageBreak/>
-        <w:drawing>
-          <wp:inline distT="0" distB="0" distL="0" distR="0" wp14:anchorId="4B19048F" wp14:editId="26AA91D4">
-            <wp:extent cx="4551218" cy="4155214"/>
-            <wp:effectExtent l="0" t="0" r="1905" b="0"/>
-            <wp:docPr id="1499751579" name="Imagen 1"/>
-            <wp:cNvGraphicFramePr>
-              <a:graphicFrameLocks xmlns:a="http://schemas.openxmlformats.org/drawingml/2006/main" noChangeAspect="1"/>
-            </wp:cNvGraphicFramePr>
-            <a:graphic xmlns:a="http://schemas.openxmlformats.org/drawingml/2006/main">
-              <a:graphicData uri="http://schemas.openxmlformats.org/drawingml/2006/picture">
-                <pic:pic xmlns:pic="http://schemas.openxmlformats.org/drawingml/2006/picture">
-                  <pic:nvPicPr>
-                    <pic:cNvPr id="1499751579" name=""/>
-                    <pic:cNvPicPr/>
-                  </pic:nvPicPr>
-                  <pic:blipFill>
-                    <a:blip r:embed="rId12"/>
-                    <a:stretch>
-                      <a:fillRect/>
-                    </a:stretch>
-                  </pic:blipFill>
-                  <pic:spPr>
-                    <a:xfrm>
-                      <a:off x="0" y="0"/>
-                      <a:ext cx="4556646" cy="4160169"/>
-                    </a:xfrm>
-                    <a:prstGeom prst="rect">
-                      <a:avLst/>
-                    </a:prstGeom>
-                  </pic:spPr>
-                </pic:pic>
-              </a:graphicData>
-            </a:graphic>
-          </wp:inline>
-        </w:drawing>
-      </w:r>
-    </w:p>
-    <w:p>
-      <w:pPr>
-        <w:rPr>
-          <w:rFonts w:ascii="Arial" w:hAnsi="Arial" w:cs="Arial"/>
-        </w:rPr>
-      </w:pPr>
-    </w:p>
-    <w:p>
-      <w:pPr>
-        <w:pStyle w:val="Prrafodelista"/>
-        <w:numPr>
-          <w:ilvl w:val="0"/>
-          <w:numId w:val="23"/>
-        </w:numPr>
-        <w:rPr>
-          <w:rFonts w:ascii="Arial" w:hAnsi="Arial" w:cs="Arial"/>
-          <w:b/>
-          <w:bCs/>
-        </w:rPr>
-      </w:pPr>
-      <w:r>
-        <w:rPr>
-          <w:rFonts w:ascii="Arial" w:hAnsi="Arial" w:cs="Arial"/>
-          <w:b/>
-          <w:bCs/>
-        </w:rPr>
-        <w:t>Emitir resultado de inspección</w:t>
-      </w:r>
-    </w:p>
-    <w:p>
-      <w:pPr>
-        <w:rPr>
-          <w:rFonts w:ascii="Arial" w:hAnsi="Arial" w:cs="Arial"/>
-        </w:rPr>
-      </w:pPr>
-      <w:r>
-        <w:rPr>
-          <w:rFonts w:ascii="Arial" w:hAnsi="Arial" w:cs="Arial"/>
-          <w:b/>
-          <w:bCs/>
-        </w:rPr>
-        <w:t>Objetivo:</w:t>
-      </w:r>
-      <w:r>
-        <w:rPr>
-          <w:rFonts w:ascii="Arial" w:hAnsi="Arial" w:cs="Arial"/>
-        </w:rPr>
-        <w:t xml:space="preserve"> consolidar la evaluación del equipo y definir su estado de conformidad técnica.</w:t>
-      </w:r>
-      <w:r>
-        <w:rPr>
-          <w:rFonts w:ascii="Arial" w:hAnsi="Arial" w:cs="Arial"/>
-        </w:rPr>
-        <w:br/>
-      </w:r>
-      <w:r>
-        <w:rPr>
-          <w:rFonts w:ascii="Arial" w:hAnsi="Arial" w:cs="Arial"/>
-          <w:b/>
-          <w:bCs/>
-        </w:rPr>
-        <w:t>Actor principal:</w:t>
-      </w:r>
-      <w:r>
-        <w:rPr>
-          <w:rFonts w:ascii="Arial" w:hAnsi="Arial" w:cs="Arial"/>
-        </w:rPr>
-        <w:t xml:space="preserve"> Inspector técnico o Supervisor.</w:t>
-      </w:r>
-    </w:p>
-    <w:p>
-      <w:pPr>
-        <w:rPr>
-          <w:rFonts w:ascii="Arial" w:hAnsi="Arial" w:cs="Arial"/>
-        </w:rPr>
-      </w:pPr>
-      <w:r>
-        <w:rPr>
-          <w:rFonts w:ascii="Arial" w:hAnsi="Arial" w:cs="Arial"/>
-          <w:b/>
-          <w:bCs/>
-        </w:rPr>
-        <w:t>Precondiciones:</w:t>
-      </w:r>
-    </w:p>
-    <w:p>
-      <w:pPr>
-        <w:numPr>
-          <w:ilvl w:val="0"/>
-          <w:numId w:val="35"/>
-        </w:numPr>
-        <w:rPr>
-          <w:rFonts w:ascii="Arial" w:hAnsi="Arial" w:cs="Arial"/>
-        </w:rPr>
-      </w:pPr>
-      <w:r>
-        <w:rPr>
-          <w:rFonts w:ascii="Arial" w:hAnsi="Arial" w:cs="Arial"/>
-        </w:rPr>
-        <w:t>La inspección documental, física y técnica ya fue realizada o justificada.</w:t>
-      </w:r>
-    </w:p>
-    <w:p>
-      <w:pPr>
-        <w:numPr>
-          <w:ilvl w:val="0"/>
-          <w:numId w:val="35"/>
-        </w:numPr>
-        <w:rPr>
-          <w:rFonts w:ascii="Arial" w:hAnsi="Arial" w:cs="Arial"/>
-        </w:rPr>
-      </w:pPr>
-      <w:r>
-        <w:rPr>
-          <w:rFonts w:ascii="Arial" w:hAnsi="Arial" w:cs="Arial"/>
-        </w:rPr>
-        <w:t>Los hallazgos y evidencias, si existen, ya fueron registrados.</w:t>
-      </w:r>
-    </w:p>
-    <w:p>
-      <w:pPr>
-        <w:rPr>
-          <w:rFonts w:ascii="Arial" w:hAnsi="Arial" w:cs="Arial"/>
-        </w:rPr>
-      </w:pPr>
-      <w:r>
-        <w:rPr>
-          <w:rFonts w:ascii="Arial" w:hAnsi="Arial" w:cs="Arial"/>
-          <w:b/>
-          <w:bCs/>
-        </w:rPr>
-        <w:t>Flujo principal:</w:t>
-      </w:r>
-    </w:p>
-    <w:p>
-      <w:pPr>
-        <w:numPr>
-          <w:ilvl w:val="0"/>
-          <w:numId w:val="36"/>
-        </w:numPr>
-        <w:rPr>
-          <w:rFonts w:ascii="Arial" w:hAnsi="Arial" w:cs="Arial"/>
-        </w:rPr>
-      </w:pPr>
-      <w:r>
-        <w:rPr>
-          <w:rFonts w:ascii="Arial" w:hAnsi="Arial" w:cs="Arial"/>
-        </w:rPr>
-        <w:t>El usuario accede a la opción “Emitir resultado”.</w:t>
-      </w:r>
-    </w:p>
-    <w:p>
-      <w:pPr>
-        <w:numPr>
-          <w:ilvl w:val="0"/>
-          <w:numId w:val="36"/>
-        </w:numPr>
-        <w:rPr>
-          <w:rFonts w:ascii="Arial" w:hAnsi="Arial" w:cs="Arial"/>
-        </w:rPr>
-      </w:pPr>
-      <w:r>
-        <w:rPr>
-          <w:rFonts w:ascii="Arial" w:hAnsi="Arial" w:cs="Arial"/>
-        </w:rPr>
-        <w:t>El sistema resume validación documental, inspección física, verificación técnica, hallazgos y evidencia.</w:t>
-      </w:r>
-    </w:p>
-    <w:p>
-      <w:pPr>
-        <w:numPr>
-          <w:ilvl w:val="0"/>
-          <w:numId w:val="36"/>
-        </w:numPr>
-        <w:rPr>
-          <w:rFonts w:ascii="Arial" w:hAnsi="Arial" w:cs="Arial"/>
-        </w:rPr>
-      </w:pPr>
-      <w:r>
-        <w:rPr>
-          <w:rFonts w:ascii="Arial" w:hAnsi="Arial" w:cs="Arial"/>
-        </w:rPr>
-        <w:t>El usuario revisa el resumen de la inspección.</w:t>
-      </w:r>
-    </w:p>
-    <w:p>
-      <w:pPr>
-        <w:numPr>
-          <w:ilvl w:val="0"/>
-          <w:numId w:val="36"/>
-        </w:numPr>
-        <w:rPr>
-          <w:rFonts w:ascii="Arial" w:hAnsi="Arial" w:cs="Arial"/>
-        </w:rPr>
-      </w:pPr>
-      <w:r>
-        <w:rPr>
-          <w:rFonts w:ascii="Arial" w:hAnsi="Arial" w:cs="Arial"/>
-        </w:rPr>
-        <w:lastRenderedPageBreak/>
-        <w:t>El usuario selecciona un resultado, por ejemplo “Conforme”, “Conforme con observaciones” o “No conforme”.</w:t>
-      </w:r>
-    </w:p>
-    <w:p>
-      <w:pPr>
-        <w:numPr>
-          <w:ilvl w:val="0"/>
-          <w:numId w:val="36"/>
-        </w:numPr>
-        <w:rPr>
-          <w:rFonts w:ascii="Arial" w:hAnsi="Arial" w:cs="Arial"/>
-        </w:rPr>
-      </w:pPr>
-      <w:r>
-        <w:rPr>
-          <w:rFonts w:ascii="Arial" w:hAnsi="Arial" w:cs="Arial"/>
-        </w:rPr>
-        <w:t>El usuario agrega comentario final, si aplica.</w:t>
-      </w:r>
-    </w:p>
-    <w:p>
-      <w:pPr>
-        <w:numPr>
-          <w:ilvl w:val="0"/>
-          <w:numId w:val="36"/>
-        </w:numPr>
-        <w:rPr>
-          <w:rFonts w:ascii="Arial" w:hAnsi="Arial" w:cs="Arial"/>
-        </w:rPr>
-      </w:pPr>
-      <w:r>
-        <w:rPr>
-          <w:rFonts w:ascii="Arial" w:hAnsi="Arial" w:cs="Arial"/>
-        </w:rPr>
-        <w:t>El sistema guarda el resultado y cierra la evaluación técnica.</w:t>
-      </w:r>
-    </w:p>
-    <w:p>
-      <w:pPr>
-        <w:rPr>
-          <w:rFonts w:ascii="Arial" w:hAnsi="Arial" w:cs="Arial"/>
-        </w:rPr>
-      </w:pPr>
-      <w:r>
-        <w:rPr>
-          <w:rFonts w:ascii="Arial" w:hAnsi="Arial" w:cs="Arial"/>
-          <w:b/>
-          <w:bCs/>
-        </w:rPr>
-        <w:t>Flujos alternos:</w:t>
-      </w:r>
-    </w:p>
-    <w:p>
-      <w:pPr>
-        <w:numPr>
-          <w:ilvl w:val="0"/>
-          <w:numId w:val="37"/>
-        </w:numPr>
-        <w:rPr>
-          <w:rFonts w:ascii="Arial" w:hAnsi="Arial" w:cs="Arial"/>
-        </w:rPr>
-      </w:pPr>
-      <w:r>
-        <w:rPr>
-          <w:rFonts w:ascii="Arial" w:hAnsi="Arial" w:cs="Arial"/>
-        </w:rPr>
-        <w:t>Si faltan etapas obligatorias, el sistema no permite emitir resultado final.</w:t>
-      </w:r>
-    </w:p>
-    <w:p>
-      <w:pPr>
-        <w:numPr>
-          <w:ilvl w:val="0"/>
-          <w:numId w:val="37"/>
-        </w:numPr>
-        <w:rPr>
-          <w:rFonts w:ascii="Arial" w:hAnsi="Arial" w:cs="Arial"/>
-        </w:rPr>
-      </w:pPr>
-      <w:r>
-        <w:rPr>
-          <w:rFonts w:ascii="Arial" w:hAnsi="Arial" w:cs="Arial"/>
-        </w:rPr>
-        <w:t>Si existen hallazgos críticos, el sistema sugiere “No conforme” o “Retenido”.</w:t>
-      </w:r>
-    </w:p>
-    <w:p>
-      <w:pPr>
-        <w:rPr>
-          <w:rFonts w:ascii="Arial" w:hAnsi="Arial" w:cs="Arial"/>
-        </w:rPr>
-      </w:pPr>
-      <w:r>
-        <w:rPr>
-          <w:rFonts w:ascii="Arial" w:hAnsi="Arial" w:cs="Arial"/>
-          <w:b/>
-          <w:bCs/>
-        </w:rPr>
-        <w:t>Postcondiciones:</w:t>
-      </w:r>
-    </w:p>
-    <w:p>
-      <w:pPr>
-        <w:numPr>
-          <w:ilvl w:val="0"/>
-          <w:numId w:val="38"/>
-        </w:numPr>
-        <w:rPr>
-          <w:rFonts w:ascii="Arial" w:hAnsi="Arial" w:cs="Arial"/>
-        </w:rPr>
-      </w:pPr>
-      <w:r>
-        <w:rPr>
-          <w:rFonts w:ascii="Arial" w:hAnsi="Arial" w:cs="Arial"/>
-        </w:rPr>
-        <w:t>La inspección queda evaluada.</w:t>
-      </w:r>
-    </w:p>
-    <w:p>
-      <w:pPr>
-        <w:numPr>
-          <w:ilvl w:val="0"/>
-          <w:numId w:val="38"/>
-        </w:numPr>
-        <w:rPr>
-          <w:rFonts w:ascii="Arial" w:hAnsi="Arial" w:cs="Arial"/>
-        </w:rPr>
-      </w:pPr>
-      <w:r>
-        <w:rPr>
-          <w:rFonts w:ascii="Arial" w:hAnsi="Arial" w:cs="Arial"/>
-        </w:rPr>
-        <w:t>El expediente tiene un resultado formal.</w:t>
-      </w:r>
-    </w:p>
-    <w:p>
-      <w:pPr>
-        <w:jc w:val="center"/>
-        <w:rPr>
-          <w:rFonts w:ascii="Arial" w:hAnsi="Arial" w:cs="Arial"/>
-        </w:rPr>
-      </w:pPr>
-      <w:r>
-        <w:rPr>
-          <w:rFonts w:ascii="Arial" w:hAnsi="Arial" w:cs="Arial"/>
-        </w:rPr>
-        <w:drawing>
-          <wp:inline distT="0" distB="0" distL="0" distR="0" wp14:anchorId="1D80BF7C" wp14:editId="2614CB4D">
-            <wp:extent cx="4121727" cy="3656296"/>
-            <wp:effectExtent l="0" t="0" r="0" b="1905"/>
-            <wp:docPr id="1322134017" name="Imagen 1"/>
-            <wp:cNvGraphicFramePr>
-              <a:graphicFrameLocks xmlns:a="http://schemas.openxmlformats.org/drawingml/2006/main" noChangeAspect="1"/>
-            </wp:cNvGraphicFramePr>
-            <a:graphic xmlns:a="http://schemas.openxmlformats.org/drawingml/2006/main">
-              <a:graphicData uri="http://schemas.openxmlformats.org/drawingml/2006/picture">
-                <pic:pic xmlns:pic="http://schemas.openxmlformats.org/drawingml/2006/picture">
-                  <pic:nvPicPr>
-                    <pic:cNvPr id="1322134017" name=""/>
-                    <pic:cNvPicPr/>
-                  </pic:nvPicPr>
-                  <pic:blipFill>
-                    <a:blip r:embed="rId13"/>
-                    <a:stretch>
-                      <a:fillRect/>
-                    </a:stretch>
-                  </pic:blipFill>
-                  <pic:spPr>
-                    <a:xfrm>
-                      <a:off x="0" y="0"/>
-                      <a:ext cx="4131237" cy="3664732"/>
-                    </a:xfrm>
-                    <a:prstGeom prst="rect">
-                      <a:avLst/>
-                    </a:prstGeom>
-                  </pic:spPr>
-                </pic:pic>
-              </a:graphicData>
-            </a:graphic>
-          </wp:inline>
-        </w:drawing>
-      </w:r>
-    </w:p>
-    <w:p>
-      <w:pPr>
-        <w:rPr>
-          <w:rFonts w:ascii="Arial" w:hAnsi="Arial" w:cs="Arial"/>
-        </w:rPr>
-      </w:pPr>
-    </w:p>
-    <w:p>
-      <w:pPr>
-        <w:pStyle w:val="Prrafodelista"/>
-        <w:numPr>
-          <w:ilvl w:val="0"/>
-          <w:numId w:val="23"/>
-        </w:numPr>
-        <w:rPr>
-          <w:rFonts w:ascii="Arial" w:hAnsi="Arial" w:cs="Arial"/>
-          <w:b/>
-          <w:bCs/>
-        </w:rPr>
-      </w:pPr>
-      <w:r>
-        <w:rPr>
-          <w:rFonts w:ascii="Arial" w:hAnsi="Arial" w:cs="Arial"/>
-          <w:b/>
-          <w:bCs/>
-        </w:rPr>
-        <w:t>Gestionar disposición final</w:t>
-      </w:r>
-    </w:p>
-    <w:p>
-      <w:pPr>
-        <w:rPr>
-          <w:rFonts w:ascii="Arial" w:hAnsi="Arial" w:cs="Arial"/>
-        </w:rPr>
-      </w:pPr>
-      <w:r>
-        <w:rPr>
-          <w:rFonts w:ascii="Arial" w:hAnsi="Arial" w:cs="Arial"/>
-          <w:b/>
-          <w:bCs/>
-        </w:rPr>
-        <w:t>Objetivo:</w:t>
-      </w:r>
-      <w:r>
-        <w:rPr>
-          <w:rFonts w:ascii="Arial" w:hAnsi="Arial" w:cs="Arial"/>
-        </w:rPr>
-        <w:t xml:space="preserve"> definir el destino interno del equipo según el resultado de inspección.</w:t>
-      </w:r>
-      <w:r>
-        <w:rPr>
-          <w:rFonts w:ascii="Arial" w:hAnsi="Arial" w:cs="Arial"/>
-        </w:rPr>
-        <w:br/>
-      </w:r>
-      <w:r>
-        <w:rPr>
-          <w:rFonts w:ascii="Arial" w:hAnsi="Arial" w:cs="Arial"/>
-          <w:b/>
-          <w:bCs/>
-        </w:rPr>
-        <w:t>Actor principal:</w:t>
-      </w:r>
-      <w:r>
-        <w:rPr>
-          <w:rFonts w:ascii="Arial" w:hAnsi="Arial" w:cs="Arial"/>
-        </w:rPr>
-        <w:t xml:space="preserve"> Supervisor o responsable autorizado.</w:t>
-      </w:r>
-    </w:p>
-    <w:p>
-      <w:pPr>
-        <w:rPr>
-          <w:rFonts w:ascii="Arial" w:hAnsi="Arial" w:cs="Arial"/>
-        </w:rPr>
-      </w:pPr>
-      <w:r>
-        <w:rPr>
-          <w:rFonts w:ascii="Arial" w:hAnsi="Arial" w:cs="Arial"/>
-          <w:b/>
-          <w:bCs/>
-        </w:rPr>
-        <w:t>Precondiciones:</w:t>
-      </w:r>
-    </w:p>
-    <w:p>
-      <w:pPr>
-        <w:numPr>
-          <w:ilvl w:val="0"/>
-          <w:numId w:val="39"/>
-        </w:numPr>
-        <w:rPr>
-          <w:rFonts w:ascii="Arial" w:hAnsi="Arial" w:cs="Arial"/>
-        </w:rPr>
-      </w:pPr>
-      <w:r>
-        <w:rPr>
-          <w:rFonts w:ascii="Arial" w:hAnsi="Arial" w:cs="Arial"/>
-        </w:rPr>
-        <w:lastRenderedPageBreak/>
-        <w:t>Existe un resultado de inspección emitido.</w:t>
-      </w:r>
-    </w:p>
-    <w:p>
-      <w:pPr>
-        <w:numPr>
-          <w:ilvl w:val="0"/>
-          <w:numId w:val="39"/>
-        </w:numPr>
-        <w:rPr>
-          <w:rFonts w:ascii="Arial" w:hAnsi="Arial" w:cs="Arial"/>
-        </w:rPr>
-      </w:pPr>
-      <w:r>
-        <w:rPr>
-          <w:rFonts w:ascii="Arial" w:hAnsi="Arial" w:cs="Arial"/>
-        </w:rPr>
-        <w:t>El usuario tiene permisos de aprobación o disposición final.</w:t>
-      </w:r>
-    </w:p>
-    <w:p>
-      <w:pPr>
-        <w:rPr>
-          <w:rFonts w:ascii="Arial" w:hAnsi="Arial" w:cs="Arial"/>
-        </w:rPr>
-      </w:pPr>
-      <w:r>
-        <w:rPr>
-          <w:rFonts w:ascii="Arial" w:hAnsi="Arial" w:cs="Arial"/>
-          <w:b/>
-          <w:bCs/>
-        </w:rPr>
-        <w:t>Flujo principal:</w:t>
-      </w:r>
-    </w:p>
-    <w:p>
-      <w:pPr>
-        <w:numPr>
-          <w:ilvl w:val="0"/>
-          <w:numId w:val="40"/>
-        </w:numPr>
-        <w:rPr>
-          <w:rFonts w:ascii="Arial" w:hAnsi="Arial" w:cs="Arial"/>
-        </w:rPr>
-      </w:pPr>
-      <w:r>
-        <w:rPr>
-          <w:rFonts w:ascii="Arial" w:hAnsi="Arial" w:cs="Arial"/>
-        </w:rPr>
-        <w:t>El supervisor abre el expediente con resultado emitido.</w:t>
-      </w:r>
-    </w:p>
-    <w:p>
-      <w:pPr>
-        <w:numPr>
-          <w:ilvl w:val="0"/>
-          <w:numId w:val="40"/>
-        </w:numPr>
-        <w:rPr>
-          <w:rFonts w:ascii="Arial" w:hAnsi="Arial" w:cs="Arial"/>
-        </w:rPr>
-      </w:pPr>
-      <w:r>
-        <w:rPr>
-          <w:rFonts w:ascii="Arial" w:hAnsi="Arial" w:cs="Arial"/>
-        </w:rPr>
-        <w:t>El sistema muestra el resultado y los hallazgos asociados.</w:t>
-      </w:r>
-    </w:p>
-    <w:p>
-      <w:pPr>
-        <w:numPr>
-          <w:ilvl w:val="0"/>
-          <w:numId w:val="40"/>
-        </w:numPr>
-        <w:rPr>
-          <w:rFonts w:ascii="Arial" w:hAnsi="Arial" w:cs="Arial"/>
-        </w:rPr>
-      </w:pPr>
-      <w:r>
-        <w:rPr>
-          <w:rFonts w:ascii="Arial" w:hAnsi="Arial" w:cs="Arial"/>
-        </w:rPr>
-        <w:t>El supervisor analiza la conformidad del equipo.</w:t>
-      </w:r>
-    </w:p>
-    <w:p>
-      <w:pPr>
-        <w:numPr>
-          <w:ilvl w:val="0"/>
-          <w:numId w:val="40"/>
-        </w:numPr>
-        <w:rPr>
-          <w:rFonts w:ascii="Arial" w:hAnsi="Arial" w:cs="Arial"/>
-        </w:rPr>
-      </w:pPr>
-      <w:r>
-        <w:rPr>
-          <w:rFonts w:ascii="Arial" w:hAnsi="Arial" w:cs="Arial"/>
-        </w:rPr>
-        <w:t>El supervisor selecciona la disposición final: liberación interna, retención o rechazo.</w:t>
-      </w:r>
-    </w:p>
-    <w:p>
-      <w:pPr>
-        <w:numPr>
-          <w:ilvl w:val="0"/>
-          <w:numId w:val="40"/>
-        </w:numPr>
-        <w:rPr>
-          <w:rFonts w:ascii="Arial" w:hAnsi="Arial" w:cs="Arial"/>
-        </w:rPr>
-      </w:pPr>
-      <w:r>
-        <w:rPr>
-          <w:rFonts w:ascii="Arial" w:hAnsi="Arial" w:cs="Arial"/>
-        </w:rPr>
-        <w:t>El supervisor registra observación o justificación de la decisión.</w:t>
-      </w:r>
-    </w:p>
-    <w:p>
-      <w:pPr>
-        <w:numPr>
-          <w:ilvl w:val="0"/>
-          <w:numId w:val="40"/>
-        </w:numPr>
-        <w:rPr>
-          <w:rFonts w:ascii="Arial" w:hAnsi="Arial" w:cs="Arial"/>
-        </w:rPr>
-      </w:pPr>
-      <w:r>
-        <w:rPr>
-          <w:rFonts w:ascii="Arial" w:hAnsi="Arial" w:cs="Arial"/>
-        </w:rPr>
-        <w:t>El sistema actualiza el estado final del equipo y cierra el expediente.</w:t>
-      </w:r>
-    </w:p>
-    <w:p>
-      <w:pPr>
-        <w:rPr>
-          <w:rFonts w:ascii="Arial" w:hAnsi="Arial" w:cs="Arial"/>
-        </w:rPr>
-      </w:pPr>
-      <w:r>
-        <w:rPr>
-          <w:rFonts w:ascii="Arial" w:hAnsi="Arial" w:cs="Arial"/>
-          <w:b/>
-          <w:bCs/>
-        </w:rPr>
-        <w:t>Flujos alternos:</w:t>
-      </w:r>
-    </w:p>
-    <w:p>
-      <w:pPr>
-        <w:numPr>
-          <w:ilvl w:val="0"/>
-          <w:numId w:val="41"/>
-        </w:numPr>
-        <w:rPr>
-          <w:rFonts w:ascii="Arial" w:hAnsi="Arial" w:cs="Arial"/>
-        </w:rPr>
-      </w:pPr>
-      <w:r>
-        <w:rPr>
-          <w:rFonts w:ascii="Arial" w:hAnsi="Arial" w:cs="Arial"/>
-        </w:rPr>
-        <w:t>Si el resultado fue “Conforme”, el sistema puede sugerir liberación interna.</w:t>
-      </w:r>
-    </w:p>
-    <w:p>
-      <w:pPr>
-        <w:numPr>
-          <w:ilvl w:val="0"/>
-          <w:numId w:val="41"/>
-        </w:numPr>
-        <w:rPr>
-          <w:rFonts w:ascii="Arial" w:hAnsi="Arial" w:cs="Arial"/>
-        </w:rPr>
-      </w:pPr>
-      <w:r>
-        <w:rPr>
-          <w:rFonts w:ascii="Arial" w:hAnsi="Arial" w:cs="Arial"/>
-        </w:rPr>
-        <w:t>Si el resultado fue “No conforme”, el sistema puede sugerir retención o rechazo.</w:t>
-      </w:r>
-    </w:p>
-    <w:p>
-      <w:pPr>
-        <w:numPr>
-          <w:ilvl w:val="0"/>
-          <w:numId w:val="41"/>
-        </w:numPr>
-        <w:rPr>
-          <w:rFonts w:ascii="Arial" w:hAnsi="Arial" w:cs="Arial"/>
-        </w:rPr>
-      </w:pPr>
-      <w:r>
-        <w:rPr>
-          <w:rFonts w:ascii="Arial" w:hAnsi="Arial" w:cs="Arial"/>
-        </w:rPr>
-        <w:t>Si se requiere revisión adicional, el supervisor puede devolver el expediente a inspección.</w:t>
-      </w:r>
-    </w:p>
-    <w:p>
-      <w:pPr>
-        <w:rPr>
-          <w:rFonts w:ascii="Arial" w:hAnsi="Arial" w:cs="Arial"/>
-        </w:rPr>
-      </w:pPr>
-      <w:r>
-        <w:rPr>
-          <w:rFonts w:ascii="Arial" w:hAnsi="Arial" w:cs="Arial"/>
-          <w:b/>
-          <w:bCs/>
-        </w:rPr>
-        <w:t>Postcondiciones:</w:t>
-      </w:r>
-    </w:p>
-    <w:p>
-      <w:pPr>
-        <w:numPr>
-          <w:ilvl w:val="0"/>
-          <w:numId w:val="42"/>
-        </w:numPr>
-        <w:rPr>
-          <w:rFonts w:ascii="Arial" w:hAnsi="Arial" w:cs="Arial"/>
-        </w:rPr>
-      </w:pPr>
-      <w:r>
-        <w:rPr>
-          <w:rFonts w:ascii="Arial" w:hAnsi="Arial" w:cs="Arial"/>
-        </w:rPr>
-        <w:t>El equipo queda con estado final definido.</w:t>
-      </w:r>
-    </w:p>
-    <w:p>
-      <w:pPr>
-        <w:numPr>
-          <w:ilvl w:val="0"/>
-          <w:numId w:val="42"/>
-        </w:numPr>
-        <w:rPr>
-          <w:rFonts w:ascii="Arial" w:hAnsi="Arial" w:cs="Arial"/>
-        </w:rPr>
-      </w:pPr>
-      <w:r>
-        <w:rPr>
-          <w:rFonts w:ascii="Arial" w:hAnsi="Arial" w:cs="Arial"/>
-        </w:rPr>
-        <w:t>El expediente queda cerrado o retornado a revisión.</w:t>
-      </w:r>
-    </w:p>
-    <w:p>
-      <w:pPr>
-        <w:jc w:val="center"/>
-        <w:rPr>
-          <w:rFonts w:ascii="Arial" w:hAnsi="Arial" w:cs="Arial"/>
-        </w:rPr>
-      </w:pPr>
-      <w:r>
-        <w:rPr>
-          <w:rFonts w:ascii="Arial" w:hAnsi="Arial" w:cs="Arial"/>
-        </w:rPr>
-        <w:lastRenderedPageBreak/>
-        <w:drawing>
-          <wp:inline distT="0" distB="0" distL="0" distR="0" wp14:anchorId="61A468C7" wp14:editId="3084473A">
-            <wp:extent cx="4530436" cy="4536075"/>
-            <wp:effectExtent l="0" t="0" r="3810" b="0"/>
-            <wp:docPr id="2063541789" name="Imagen 1"/>
-            <wp:cNvGraphicFramePr>
-              <a:graphicFrameLocks xmlns:a="http://schemas.openxmlformats.org/drawingml/2006/main" noChangeAspect="1"/>
-            </wp:cNvGraphicFramePr>
-            <a:graphic xmlns:a="http://schemas.openxmlformats.org/drawingml/2006/main">
-              <a:graphicData uri="http://schemas.openxmlformats.org/drawingml/2006/picture">
-                <pic:pic xmlns:pic="http://schemas.openxmlformats.org/drawingml/2006/picture">
-                  <pic:nvPicPr>
-                    <pic:cNvPr id="2063541789" name=""/>
-                    <pic:cNvPicPr/>
-                  </pic:nvPicPr>
-                  <pic:blipFill>
-                    <a:blip r:embed="rId14"/>
-                    <a:stretch>
-                      <a:fillRect/>
-                    </a:stretch>
-                  </pic:blipFill>
-                  <pic:spPr>
-                    <a:xfrm>
-                      <a:off x="0" y="0"/>
-                      <a:ext cx="4537244" cy="4542891"/>
-                    </a:xfrm>
-                    <a:prstGeom prst="rect">
-                      <a:avLst/>
-                    </a:prstGeom>
-                  </pic:spPr>
-                </pic:pic>
-              </a:graphicData>
-            </a:graphic>
-          </wp:inline>
-        </w:drawing>
-      </w:r>
     </w:p>
     <w:p>
       <w:pPr>
@@ -18278,6 +15079,7 @@
   <w:style w:type="character" w:default="1" w:styleId="Fuentedeprrafopredeter">
     <w:name w:val="Default Paragraph Font"/>
     <w:uiPriority w:val="1"/>
+    <w:semiHidden/>
     <w:unhideWhenUsed/>
   </w:style>
   <w:style w:type="table" w:default="1" w:styleId="Tablanormal">

</xml_diff>

<commit_message>
agregue mi diagrama de flujo del modulo de actividades
</commit_message>
<xml_diff>
--- a/PROYECTO CASOS DE USO.docx
+++ b/PROYECTO CASOS DE USO.docx
@@ -1,6 +1,6 @@
 
 <file path=word/document.xml><?xml version="1.0" encoding="utf-8"?>
-<w:document xmlns:wpc="http://schemas.microsoft.com/office/word/2010/wordprocessingCanvas" xmlns:cx="http://schemas.microsoft.com/office/drawing/2014/chartex" xmlns:cx1="http://schemas.microsoft.com/office/drawing/2015/9/8/chartex" xmlns:cx2="http://schemas.microsoft.com/office/drawing/2015/10/21/chartex" xmlns:cx3="http://schemas.microsoft.com/office/drawing/2016/5/9/chartex" xmlns:cx4="http://schemas.microsoft.com/office/drawing/2016/5/10/chartex" xmlns:cx5="http://schemas.microsoft.com/office/drawing/2016/5/11/chartex" xmlns:cx6="http://schemas.microsoft.com/office/drawing/2016/5/12/chartex" xmlns:cx7="http://schemas.microsoft.com/office/drawing/2016/5/13/chartex" xmlns:cx8="http://schemas.microsoft.com/office/drawing/2016/5/14/chartex" xmlns:mc="http://schemas.openxmlformats.org/markup-compatibility/2006" xmlns:aink="http://schemas.microsoft.com/office/drawing/2016/ink" xmlns:am3d="http://schemas.microsoft.com/office/drawing/2017/model3d" xmlns:o="urn:schemas-microsoft-com:office:office" xmlns:oel="http://schemas.microsoft.com/office/2019/extlst" xmlns:r="http://schemas.openxmlformats.org/officeDocument/2006/relationships" xmlns:m="http://schemas.openxmlformats.org/officeDocument/2006/math" xmlns:v="urn:schemas-microsoft-com:vml" xmlns:wp14="http://schemas.microsoft.com/office/word/2010/wordprocessingDrawing" xmlns:wp="http://schemas.openxmlformats.org/drawingml/2006/wordprocessingDrawing" xmlns:w10="urn:schemas-microsoft-com:office:word" xmlns:w="http://schemas.openxmlformats.org/wordprocessingml/2006/main" xmlns:w14="http://schemas.microsoft.com/office/word/2010/wordml" xmlns:w15="http://schemas.microsoft.com/office/word/2012/wordml" xmlns:w16cei="http://schemas.microsoft.com/office/word/2026/wordml/cei" xmlns:w16cex="http://schemas.microsoft.com/office/word/2018/wordml/cex" xmlns:w16cid="http://schemas.microsoft.com/office/word/2016/wordml/cid" xmlns:w16="http://schemas.microsoft.com/office/word/2018/wordml" xmlns:w16du="http://schemas.microsoft.com/office/word/2023/wordml/word16du" xmlns:w16sdtdh="http://schemas.microsoft.com/office/word/2020/wordml/sdtdatahash" xmlns:w16sdtfl="http://schemas.microsoft.com/office/word/2024/wordml/sdtformatlock" xmlns:w16se="http://schemas.microsoft.com/office/word/2015/wordml/symex" xmlns:wpg="http://schemas.microsoft.com/office/word/2010/wordprocessingGroup" xmlns:wpi="http://schemas.microsoft.com/office/word/2010/wordprocessingInk" xmlns:wne="http://schemas.microsoft.com/office/word/2006/wordml" xmlns:wps="http://schemas.microsoft.com/office/word/2010/wordprocessingShape" mc:Ignorable="w14 w15 w16se w16cid w16 w16cex w16sdtdh w16sdtfl w16du wp14">
+<w:document xmlns:wpc="http://schemas.microsoft.com/office/word/2010/wordprocessingCanvas" xmlns:cx="http://schemas.microsoft.com/office/drawing/2014/chartex" xmlns:cx1="http://schemas.microsoft.com/office/drawing/2015/9/8/chartex" xmlns:cx2="http://schemas.microsoft.com/office/drawing/2015/10/21/chartex" xmlns:cx3="http://schemas.microsoft.com/office/drawing/2016/5/9/chartex" xmlns:cx4="http://schemas.microsoft.com/office/drawing/2016/5/10/chartex" xmlns:cx5="http://schemas.microsoft.com/office/drawing/2016/5/11/chartex" xmlns:cx6="http://schemas.microsoft.com/office/drawing/2016/5/12/chartex" xmlns:cx7="http://schemas.microsoft.com/office/drawing/2016/5/13/chartex" xmlns:cx8="http://schemas.microsoft.com/office/drawing/2016/5/14/chartex" xmlns:mc="http://schemas.openxmlformats.org/markup-compatibility/2006" xmlns:aink="http://schemas.microsoft.com/office/drawing/2016/ink" xmlns:am3d="http://schemas.microsoft.com/office/drawing/2017/model3d" xmlns:o="urn:schemas-microsoft-com:office:office" xmlns:oel="http://schemas.microsoft.com/office/2019/extlst" xmlns:r="http://schemas.openxmlformats.org/officeDocument/2006/relationships" xmlns:m="http://schemas.openxmlformats.org/officeDocument/2006/math" xmlns:v="urn:schemas-microsoft-com:vml" xmlns:wp14="http://schemas.microsoft.com/office/word/2010/wordprocessingDrawing" xmlns:wp="http://schemas.openxmlformats.org/drawingml/2006/wordprocessingDrawing" xmlns:w10="urn:schemas-microsoft-com:office:word" xmlns:w="http://schemas.openxmlformats.org/wordprocessingml/2006/main" xmlns:w14="http://schemas.microsoft.com/office/word/2010/wordml" xmlns:w15="http://schemas.microsoft.com/office/word/2012/wordml" xmlns:w16cex="http://schemas.microsoft.com/office/word/2018/wordml/cex" xmlns:w16cid="http://schemas.microsoft.com/office/word/2016/wordml/cid" xmlns:w16="http://schemas.microsoft.com/office/word/2018/wordml" xmlns:w16du="http://schemas.microsoft.com/office/word/2023/wordml/word16du" xmlns:w16sdtdh="http://schemas.microsoft.com/office/word/2020/wordml/sdtdatahash" xmlns:w16sdtfl="http://schemas.microsoft.com/office/word/2024/wordml/sdtformatlock" xmlns:w16se="http://schemas.microsoft.com/office/word/2015/wordml/symex" xmlns:wpg="http://schemas.microsoft.com/office/word/2010/wordprocessingGroup" xmlns:wpi="http://schemas.microsoft.com/office/word/2010/wordprocessingInk" xmlns:wne="http://schemas.microsoft.com/office/word/2006/wordml" xmlns:wps="http://schemas.microsoft.com/office/word/2010/wordprocessingShape" mc:Ignorable="w14 w15 w16se w16cid w16 w16cex w16sdtdh w16sdtfl w16du wp14">
   <w:body>
     <w:p>
       <w:pPr>
@@ -249,7 +249,37 @@
         <w:rPr>
           <w:rFonts w:ascii="Arial" w:hAnsi="Arial" w:cs="Arial"/>
         </w:rPr>
-        <w:t>JUAN JOSE PEREZ – 2349</w:t>
+        <w:t>JUAN JOSE</w:t>
+      </w:r>
+      <w:r>
+        <w:rPr>
+          <w:rFonts w:ascii="Arial" w:hAnsi="Arial" w:cs="Arial"/>
+        </w:rPr>
+        <w:t xml:space="preserve"> ANTONIO</w:t>
+      </w:r>
+      <w:r>
+        <w:rPr>
+          <w:rFonts w:ascii="Arial" w:hAnsi="Arial" w:cs="Arial"/>
+        </w:rPr>
+        <w:t xml:space="preserve"> PEREZ</w:t>
+      </w:r>
+      <w:r>
+        <w:rPr>
+          <w:rFonts w:ascii="Arial" w:hAnsi="Arial" w:cs="Arial"/>
+        </w:rPr>
+        <w:t xml:space="preserve"> GARCIA</w:t>
+      </w:r>
+      <w:r>
+        <w:rPr>
+          <w:rFonts w:ascii="Arial" w:hAnsi="Arial" w:cs="Arial"/>
+        </w:rPr>
+        <w:t xml:space="preserve"> – 2349</w:t>
+      </w:r>
+      <w:r>
+        <w:rPr>
+          <w:rFonts w:ascii="Arial" w:hAnsi="Arial" w:cs="Arial"/>
+        </w:rPr>
+        <w:t>044</w:t>
       </w:r>
     </w:p>
     <w:p>
@@ -1754,21 +1784,7 @@
         <w:rPr>
           <w:rFonts w:ascii="Arial" w:hAnsi="Arial" w:cs="Arial"/>
         </w:rPr>
-        <w:t xml:space="preserve"> </w:t>
-      </w:r>
-      <w:proofErr w:type="spellStart"/>
-      <w:r>
-        <w:rPr>
-          <w:rFonts w:ascii="Arial" w:hAnsi="Arial" w:cs="Arial"/>
-        </w:rPr>
-        <w:t>Delete</w:t>
-      </w:r>
-      <w:proofErr w:type="spellEnd"/>
-      <w:r>
-        <w:rPr>
-          <w:rFonts w:ascii="Arial" w:hAnsi="Arial" w:cs="Arial"/>
-        </w:rPr>
-        <w:t>)</w:t>
+        <w:t xml:space="preserve"> Delete)</w:t>
       </w:r>
     </w:p>
     <w:p>
@@ -5607,6 +5623,249 @@
         </w:rPr>
       </w:pPr>
     </w:p>
+    <w:p>
+      <w:pPr>
+        <w:rPr>
+          <w:rFonts w:ascii="Arial" w:hAnsi="Arial" w:cs="Arial"/>
+        </w:rPr>
+      </w:pPr>
+    </w:p>
+    <w:p>
+      <w:pPr>
+        <w:rPr>
+          <w:rFonts w:ascii="Arial" w:hAnsi="Arial" w:cs="Arial"/>
+        </w:rPr>
+      </w:pPr>
+    </w:p>
+    <w:p>
+      <w:pPr>
+        <w:rPr>
+          <w:rFonts w:ascii="Arial" w:hAnsi="Arial" w:cs="Arial"/>
+        </w:rPr>
+      </w:pPr>
+    </w:p>
+    <w:p>
+      <w:pPr>
+        <w:rPr>
+          <w:rFonts w:ascii="Arial" w:hAnsi="Arial" w:cs="Arial"/>
+        </w:rPr>
+      </w:pPr>
+    </w:p>
+    <w:p>
+      <w:pPr>
+        <w:rPr>
+          <w:rFonts w:ascii="Arial" w:hAnsi="Arial" w:cs="Arial"/>
+        </w:rPr>
+      </w:pPr>
+    </w:p>
+    <w:p>
+      <w:pPr>
+        <w:rPr>
+          <w:rFonts w:ascii="Arial" w:hAnsi="Arial" w:cs="Arial"/>
+        </w:rPr>
+      </w:pPr>
+    </w:p>
+    <w:p>
+      <w:pPr>
+        <w:rPr>
+          <w:rFonts w:ascii="Arial" w:hAnsi="Arial" w:cs="Arial"/>
+        </w:rPr>
+      </w:pPr>
+    </w:p>
+    <w:p>
+      <w:pPr>
+        <w:rPr>
+          <w:rFonts w:ascii="Arial" w:hAnsi="Arial" w:cs="Arial"/>
+        </w:rPr>
+      </w:pPr>
+    </w:p>
+    <w:p>
+      <w:pPr>
+        <w:rPr>
+          <w:rFonts w:ascii="Arial" w:hAnsi="Arial" w:cs="Arial"/>
+        </w:rPr>
+      </w:pPr>
+    </w:p>
+    <w:p>
+      <w:pPr>
+        <w:rPr>
+          <w:rFonts w:ascii="Arial" w:hAnsi="Arial" w:cs="Arial"/>
+        </w:rPr>
+      </w:pPr>
+    </w:p>
+    <w:p>
+      <w:pPr>
+        <w:rPr>
+          <w:rFonts w:ascii="Arial" w:hAnsi="Arial" w:cs="Arial"/>
+        </w:rPr>
+      </w:pPr>
+    </w:p>
+    <w:p>
+      <w:pPr>
+        <w:rPr>
+          <w:rFonts w:ascii="Arial" w:hAnsi="Arial" w:cs="Arial"/>
+        </w:rPr>
+      </w:pPr>
+    </w:p>
+    <w:p>
+      <w:pPr>
+        <w:rPr>
+          <w:rFonts w:ascii="Arial" w:hAnsi="Arial" w:cs="Arial"/>
+        </w:rPr>
+      </w:pPr>
+    </w:p>
+    <w:p>
+      <w:pPr>
+        <w:rPr>
+          <w:rFonts w:ascii="Arial" w:hAnsi="Arial" w:cs="Arial"/>
+        </w:rPr>
+      </w:pPr>
+    </w:p>
+    <w:p>
+      <w:pPr>
+        <w:rPr>
+          <w:rFonts w:ascii="Arial" w:hAnsi="Arial" w:cs="Arial"/>
+        </w:rPr>
+      </w:pPr>
+    </w:p>
+    <w:p>
+      <w:pPr>
+        <w:rPr>
+          <w:rFonts w:ascii="Arial" w:hAnsi="Arial" w:cs="Arial"/>
+        </w:rPr>
+      </w:pPr>
+    </w:p>
+    <w:p>
+      <w:pPr>
+        <w:rPr>
+          <w:rFonts w:ascii="Arial" w:hAnsi="Arial" w:cs="Arial"/>
+        </w:rPr>
+      </w:pPr>
+    </w:p>
+    <w:p>
+      <w:pPr>
+        <w:rPr>
+          <w:rFonts w:ascii="Arial" w:hAnsi="Arial" w:cs="Arial"/>
+        </w:rPr>
+      </w:pPr>
+    </w:p>
+    <w:p>
+      <w:pPr>
+        <w:pStyle w:val="Ttulo1"/>
+        <w:jc w:val="center"/>
+        <w:rPr>
+          <w:rFonts w:ascii="Times New Roman" w:hAnsi="Times New Roman" w:cs="Times New Roman"/>
+          <w:sz w:val="32"/>
+          <w:szCs w:val="32"/>
+        </w:rPr>
+      </w:pPr>
+      <w:r>
+        <w:rPr>
+          <w:rFonts w:ascii="Times New Roman" w:hAnsi="Times New Roman" w:cs="Times New Roman"/>
+          <w:sz w:val="32"/>
+          <w:szCs w:val="32"/>
+        </w:rPr>
+        <w:lastRenderedPageBreak/>
+        <w:t>Módulo de Bitácora de Actividades</w:t>
+      </w:r>
+    </w:p>
+    <w:p>
+      <w:pPr>
+        <w:spacing w:after="80"/>
+      </w:pPr>
+    </w:p>
+    <w:p>
+      <w:r>
+        <w:rPr>
+          <w:rFonts w:ascii="Arial" w:hAnsi="Arial"/>
+          <w:b/>
+          <w:color w:val="1E3A8A"/>
+        </w:rPr>
+        <w:t>1. Diagrama de Flujo</w:t>
+      </w:r>
+    </w:p>
+    <w:p>
+      <w:pPr>
+        <w:jc w:val="center"/>
+      </w:pPr>
+    </w:p>
+    <w:p/>
+    <w:p>
+      <w:pPr>
+        <w:rPr>
+          <w:rFonts w:ascii="Arial" w:hAnsi="Arial" w:cs="Arial"/>
+        </w:rPr>
+      </w:pPr>
+      <w:r>
+        <w:rPr>
+          <w:noProof/>
+        </w:rPr>
+        <w:drawing>
+          <wp:anchor distT="0" distB="0" distL="114300" distR="114300" simplePos="0" relativeHeight="251658240" behindDoc="0" locked="0" layoutInCell="1" allowOverlap="1" wp14:anchorId="77ECE91B" wp14:editId="54A426E0">
+            <wp:simplePos x="0" y="0"/>
+            <wp:positionH relativeFrom="column">
+              <wp:posOffset>-1170620</wp:posOffset>
+            </wp:positionH>
+            <wp:positionV relativeFrom="paragraph">
+              <wp:posOffset>434020</wp:posOffset>
+            </wp:positionV>
+            <wp:extent cx="7973048" cy="5847721"/>
+            <wp:effectExtent l="0" t="4445" r="5080" b="5080"/>
+            <wp:wrapNone/>
+            <wp:docPr id="1" name="Picture 1"/>
+            <wp:cNvGraphicFramePr>
+              <a:graphicFrameLocks xmlns:a="http://schemas.openxmlformats.org/drawingml/2006/main" noChangeAspect="1"/>
+            </wp:cNvGraphicFramePr>
+            <a:graphic xmlns:a="http://schemas.openxmlformats.org/drawingml/2006/main">
+              <a:graphicData uri="http://schemas.openxmlformats.org/drawingml/2006/picture">
+                <pic:pic xmlns:pic="http://schemas.openxmlformats.org/drawingml/2006/picture">
+                  <pic:nvPicPr>
+                    <pic:cNvPr id="0" name="diagrama_flujo_horizontal.png"/>
+                    <pic:cNvPicPr/>
+                  </pic:nvPicPr>
+                  <pic:blipFill rotWithShape="1">
+                    <a:blip r:embed="rId7" cstate="print">
+                      <a:extLst>
+                        <a:ext uri="{28A0092B-C50C-407E-A947-70E740481C1C}">
+                          <a14:useLocalDpi xmlns:a14="http://schemas.microsoft.com/office/drawing/2010/main" val="0"/>
+                        </a:ext>
+                      </a:extLst>
+                    </a:blip>
+                    <a:srcRect t="11152"/>
+                    <a:stretch>
+                      <a:fillRect/>
+                    </a:stretch>
+                  </pic:blipFill>
+                  <pic:spPr bwMode="auto">
+                    <a:xfrm rot="5400000">
+                      <a:off x="0" y="0"/>
+                      <a:ext cx="8012734" cy="5876828"/>
+                    </a:xfrm>
+                    <a:prstGeom prst="rect">
+                      <a:avLst/>
+                    </a:prstGeom>
+                    <a:ln>
+                      <a:noFill/>
+                    </a:ln>
+                    <a:extLst>
+                      <a:ext uri="{53640926-AAD7-44D8-BBD7-CCE9431645EC}">
+                        <a14:shadowObscured xmlns:a14="http://schemas.microsoft.com/office/drawing/2010/main"/>
+                      </a:ext>
+                    </a:extLst>
+                  </pic:spPr>
+                </pic:pic>
+              </a:graphicData>
+            </a:graphic>
+            <wp14:sizeRelH relativeFrom="page">
+              <wp14:pctWidth>0</wp14:pctWidth>
+            </wp14:sizeRelH>
+            <wp14:sizeRelV relativeFrom="page">
+              <wp14:pctHeight>0</wp14:pctHeight>
+            </wp14:sizeRelV>
+          </wp:anchor>
+        </w:drawing>
+      </w:r>
+    </w:p>
     <w:sectPr>
       <w:pgSz w:w="12240" w:h="15840"/>
       <w:pgMar w:top="1417" w:right="1701" w:bottom="1417" w:left="1701" w:header="708" w:footer="708" w:gutter="0"/>
@@ -5618,7 +5877,7 @@
 </file>
 
 <file path=word/numbering.xml><?xml version="1.0" encoding="utf-8"?>
-<w:numbering xmlns:wpc="http://schemas.microsoft.com/office/word/2010/wordprocessingCanvas" xmlns:cx="http://schemas.microsoft.com/office/drawing/2014/chartex" xmlns:cx1="http://schemas.microsoft.com/office/drawing/2015/9/8/chartex" xmlns:cx2="http://schemas.microsoft.com/office/drawing/2015/10/21/chartex" xmlns:cx3="http://schemas.microsoft.com/office/drawing/2016/5/9/chartex" xmlns:cx4="http://schemas.microsoft.com/office/drawing/2016/5/10/chartex" xmlns:cx5="http://schemas.microsoft.com/office/drawing/2016/5/11/chartex" xmlns:cx6="http://schemas.microsoft.com/office/drawing/2016/5/12/chartex" xmlns:cx7="http://schemas.microsoft.com/office/drawing/2016/5/13/chartex" xmlns:cx8="http://schemas.microsoft.com/office/drawing/2016/5/14/chartex" xmlns:mc="http://schemas.openxmlformats.org/markup-compatibility/2006" xmlns:aink="http://schemas.microsoft.com/office/drawing/2016/ink" xmlns:am3d="http://schemas.microsoft.com/office/drawing/2017/model3d" xmlns:o="urn:schemas-microsoft-com:office:office" xmlns:oel="http://schemas.microsoft.com/office/2019/extlst" xmlns:r="http://schemas.openxmlformats.org/officeDocument/2006/relationships" xmlns:m="http://schemas.openxmlformats.org/officeDocument/2006/math" xmlns:v="urn:schemas-microsoft-com:vml" xmlns:wp14="http://schemas.microsoft.com/office/word/2010/wordprocessingDrawing" xmlns:wp="http://schemas.openxmlformats.org/drawingml/2006/wordprocessingDrawing" xmlns:w10="urn:schemas-microsoft-com:office:word" xmlns:w="http://schemas.openxmlformats.org/wordprocessingml/2006/main" xmlns:w14="http://schemas.microsoft.com/office/word/2010/wordml" xmlns:w15="http://schemas.microsoft.com/office/word/2012/wordml" xmlns:w16cei="http://schemas.microsoft.com/office/word/2026/wordml/cei" xmlns:w16cex="http://schemas.microsoft.com/office/word/2018/wordml/cex" xmlns:w16cid="http://schemas.microsoft.com/office/word/2016/wordml/cid" xmlns:w16="http://schemas.microsoft.com/office/word/2018/wordml" xmlns:w16du="http://schemas.microsoft.com/office/word/2023/wordml/word16du" xmlns:w16sdtdh="http://schemas.microsoft.com/office/word/2020/wordml/sdtdatahash" xmlns:w16sdtfl="http://schemas.microsoft.com/office/word/2024/wordml/sdtformatlock" xmlns:w16se="http://schemas.microsoft.com/office/word/2015/wordml/symex" xmlns:wpg="http://schemas.microsoft.com/office/word/2010/wordprocessingGroup" xmlns:wpi="http://schemas.microsoft.com/office/word/2010/wordprocessingInk" xmlns:wne="http://schemas.microsoft.com/office/word/2006/wordml" xmlns:wps="http://schemas.microsoft.com/office/word/2010/wordprocessingShape" mc:Ignorable="w14 w15 w16se w16cid w16 w16cex w16sdtdh w16sdtfl w16du wp14">
+<w:numbering xmlns:wpc="http://schemas.microsoft.com/office/word/2010/wordprocessingCanvas" xmlns:cx="http://schemas.microsoft.com/office/drawing/2014/chartex" xmlns:cx1="http://schemas.microsoft.com/office/drawing/2015/9/8/chartex" xmlns:cx2="http://schemas.microsoft.com/office/drawing/2015/10/21/chartex" xmlns:cx3="http://schemas.microsoft.com/office/drawing/2016/5/9/chartex" xmlns:cx4="http://schemas.microsoft.com/office/drawing/2016/5/10/chartex" xmlns:cx5="http://schemas.microsoft.com/office/drawing/2016/5/11/chartex" xmlns:cx6="http://schemas.microsoft.com/office/drawing/2016/5/12/chartex" xmlns:cx7="http://schemas.microsoft.com/office/drawing/2016/5/13/chartex" xmlns:cx8="http://schemas.microsoft.com/office/drawing/2016/5/14/chartex" xmlns:mc="http://schemas.openxmlformats.org/markup-compatibility/2006" xmlns:aink="http://schemas.microsoft.com/office/drawing/2016/ink" xmlns:am3d="http://schemas.microsoft.com/office/drawing/2017/model3d" xmlns:o="urn:schemas-microsoft-com:office:office" xmlns:oel="http://schemas.microsoft.com/office/2019/extlst" xmlns:r="http://schemas.openxmlformats.org/officeDocument/2006/relationships" xmlns:m="http://schemas.openxmlformats.org/officeDocument/2006/math" xmlns:v="urn:schemas-microsoft-com:vml" xmlns:wp14="http://schemas.microsoft.com/office/word/2010/wordprocessingDrawing" xmlns:wp="http://schemas.openxmlformats.org/drawingml/2006/wordprocessingDrawing" xmlns:w10="urn:schemas-microsoft-com:office:word" xmlns:w="http://schemas.openxmlformats.org/wordprocessingml/2006/main" xmlns:w14="http://schemas.microsoft.com/office/word/2010/wordml" xmlns:w15="http://schemas.microsoft.com/office/word/2012/wordml" xmlns:w16cex="http://schemas.microsoft.com/office/word/2018/wordml/cex" xmlns:w16cid="http://schemas.microsoft.com/office/word/2016/wordml/cid" xmlns:w16="http://schemas.microsoft.com/office/word/2018/wordml" xmlns:w16du="http://schemas.microsoft.com/office/word/2023/wordml/word16du" xmlns:w16sdtdh="http://schemas.microsoft.com/office/word/2020/wordml/sdtdatahash" xmlns:w16sdtfl="http://schemas.microsoft.com/office/word/2024/wordml/sdtformatlock" xmlns:w16se="http://schemas.microsoft.com/office/word/2015/wordml/symex" xmlns:wpg="http://schemas.microsoft.com/office/word/2010/wordprocessingGroup" xmlns:wpi="http://schemas.microsoft.com/office/word/2010/wordprocessingInk" xmlns:wne="http://schemas.microsoft.com/office/word/2006/wordml" xmlns:wps="http://schemas.microsoft.com/office/word/2010/wordprocessingShape" mc:Ignorable="w14 w15 w16se w16cid w16 w16cex w16sdtdh w16sdtfl w16du wp14">
   <w:abstractNum w:abstractNumId="0" w15:restartNumberingAfterBreak="0">
     <w:nsid w:val="002F35A3"/>
     <w:multiLevelType w:val="multilevel"/>

</xml_diff>